<commit_message>
Make script fully cross-platform (Linux, macOS, Windows)
- Add fmt_day/fmt_date/fmt_mon helpers to avoid %-d (Linux-only)
  and %#d (Windows-only) strftime codes
- Strip leading zero from time string portably
- Confirmed clean run on Linux; safe for macOS and Windows

Co-Authored-By: Claude Sonnet 4.6 <noreply@anthropic.com>
Claude-Session: https://claude.ai/code/session_013r2bkB7djMAD1MNGbK3EL3
</commit_message>
<xml_diff>
--- a/Blackstone_Scrum_20260618.docx
+++ b/Blackstone_Scrum_20260618.docx
@@ -31,7 +31,7 @@
           <w:color w:val="757575"/>
           <w:sz w:val="18"/>
         </w:rPr>
-        <w:t>Thursday, June 18, 2026   ·   Report generated 12:45 PM IST</w:t>
+        <w:t>Thursday, June 18, 2026   ·   Report generated 12:46 PM IST</w:t>
       </w:r>
     </w:p>
     <w:p>
@@ -2770,7 +2770,7 @@
           <w:color w:val="757575"/>
           <w:sz w:val="18"/>
         </w:rPr>
-        <w:t>Thursday, June 18, 2026   ·   Report generated 12:45 PM IST</w:t>
+        <w:t>Thursday, June 18, 2026   ·   Report generated 12:46 PM IST</w:t>
       </w:r>
     </w:p>
     <w:p>

</xml_diff>

<commit_message>
Add startup credential check with clear fake vs live data warning
Co-Authored-By: Claude Sonnet 4.6 <noreply@anthropic.com>
Claude-Session: https://claude.ai/code/session_013r2bkB7djMAD1MNGbK3EL3
</commit_message>
<xml_diff>
--- a/Blackstone_Scrum_20260618.docx
+++ b/Blackstone_Scrum_20260618.docx
@@ -31,7 +31,7 @@
           <w:color w:val="757575"/>
           <w:sz w:val="18"/>
         </w:rPr>
-        <w:t>Thursday, June 18, 2026   ·   Report generated 12:46 PM IST</w:t>
+        <w:t>Thursday, June 18, 2026   ·   Report generated 12:50 PM IST</w:t>
       </w:r>
     </w:p>
     <w:p>
@@ -2770,7 +2770,7 @@
           <w:color w:val="757575"/>
           <w:sz w:val="18"/>
         </w:rPr>
-        <w:t>Thursday, June 18, 2026   ·   Report generated 12:46 PM IST</w:t>
+        <w:t>Thursday, June 18, 2026   ·   Report generated 12:50 PM IST</w:t>
       </w:r>
     </w:p>
     <w:p>

</xml_diff>

<commit_message>
Update generated Blackstone scrum report docx
</commit_message>
<xml_diff>
--- a/Blackstone_Scrum_20260618.docx
+++ b/Blackstone_Scrum_20260618.docx
@@ -31,7 +31,7 @@
           <w:color w:val="757575"/>
           <w:sz w:val="18"/>
         </w:rPr>
-        <w:t>Thursday, June 18, 2026   ·   Report generated 12:50 PM IST</w:t>
+        <w:t>Thursday, June 18, 2026   ·   Report generated 1:31 PM IST</w:t>
       </w:r>
     </w:p>
     <w:p>
@@ -218,7 +218,7 @@
               </w:rPr>
               <w:t>3</w:t>
               <w:br/>
-              <w:t>#134003, #131077, #131076</w:t>
+              <w:t>#131077, #131910, #134003</w:t>
             </w:r>
           </w:p>
         </w:tc>
@@ -1679,7 +1679,7 @@
             <w:r>
               <w:drawing>
                 <wp:inline xmlns:a="http://schemas.openxmlformats.org/drawingml/2006/main" xmlns:pic="http://schemas.openxmlformats.org/drawingml/2006/picture">
-                  <wp:extent cx="3017520" cy="1563624"/>
+                  <wp:extent cx="3017520" cy="1225441"/>
                   <wp:docPr id="2" name="Picture 2"/>
                   <wp:cNvGraphicFramePr>
                     <a:graphicFrameLocks noChangeAspect="1"/>
@@ -1700,7 +1700,7 @@
                         <pic:spPr>
                           <a:xfrm>
                             <a:off x="0" y="0"/>
-                            <a:ext cx="3017520" cy="1563624"/>
+                            <a:ext cx="3017520" cy="1225441"/>
                           </a:xfrm>
                           <a:prstGeom prst="rect"/>
                         </pic:spPr>
@@ -1780,272 +1780,6 @@
                 <w:sz w:val="18"/>
               </w:rPr>
               <w:t>Views</w:t>
-            </w:r>
-          </w:p>
-        </w:tc>
-      </w:tr>
-      <w:tr>
-        <w:tc>
-          <w:tcPr>
-            <w:tcW w:type="dxa" w:w="6480"/>
-            <w:shd w:val="clear" w:color="auto" w:fill="F2F2F2"/>
-          </w:tcPr>
-          <w:p>
-            <w:r/>
-            <w:r>
-              <w:rPr>
-                <w:rFonts w:ascii="Calibri" w:hAnsi="Calibri"/>
-                <w:b w:val="0"/>
-                <w:i w:val="0"/>
-                <w:sz w:val="18"/>
-              </w:rPr>
-              <w:t>Cloud Account Governance</w:t>
-            </w:r>
-          </w:p>
-        </w:tc>
-        <w:tc>
-          <w:tcPr>
-            <w:tcW w:type="dxa" w:w="1152"/>
-            <w:shd w:val="clear" w:color="auto" w:fill="F2F2F2"/>
-          </w:tcPr>
-          <w:p>
-            <w:r/>
-            <w:r>
-              <w:rPr>
-                <w:rFonts w:ascii="Calibri" w:hAnsi="Calibri"/>
-                <w:b w:val="0"/>
-                <w:i w:val="0"/>
-                <w:sz w:val="18"/>
-              </w:rPr>
-              <w:t>52</w:t>
-            </w:r>
-          </w:p>
-        </w:tc>
-      </w:tr>
-      <w:tr>
-        <w:tc>
-          <w:tcPr>
-            <w:tcW w:type="dxa" w:w="6480"/>
-            <w:shd w:val="clear" w:color="auto" w:fill="FFFFFF"/>
-          </w:tcPr>
-          <w:p>
-            <w:r/>
-            <w:r>
-              <w:rPr>
-                <w:rFonts w:ascii="Calibri" w:hAnsi="Calibri"/>
-                <w:b w:val="0"/>
-                <w:i w:val="0"/>
-                <w:sz w:val="18"/>
-              </w:rPr>
-              <w:t>Unified Governance</w:t>
-            </w:r>
-          </w:p>
-        </w:tc>
-        <w:tc>
-          <w:tcPr>
-            <w:tcW w:type="dxa" w:w="1152"/>
-            <w:shd w:val="clear" w:color="auto" w:fill="FFFFFF"/>
-          </w:tcPr>
-          <w:p>
-            <w:r/>
-            <w:r>
-              <w:rPr>
-                <w:rFonts w:ascii="Calibri" w:hAnsi="Calibri"/>
-                <w:b w:val="0"/>
-                <w:i w:val="0"/>
-                <w:sz w:val="18"/>
-              </w:rPr>
-              <w:t>9</w:t>
-            </w:r>
-          </w:p>
-        </w:tc>
-      </w:tr>
-      <w:tr>
-        <w:tc>
-          <w:tcPr>
-            <w:tcW w:type="dxa" w:w="6480"/>
-            <w:shd w:val="clear" w:color="auto" w:fill="F2F2F2"/>
-          </w:tcPr>
-          <w:p>
-            <w:r/>
-            <w:r>
-              <w:rPr>
-                <w:rFonts w:ascii="Calibri" w:hAnsi="Calibri"/>
-                <w:b w:val="0"/>
-                <w:i w:val="0"/>
-                <w:sz w:val="18"/>
-              </w:rPr>
-              <w:t>Inventory</w:t>
-            </w:r>
-          </w:p>
-        </w:tc>
-        <w:tc>
-          <w:tcPr>
-            <w:tcW w:type="dxa" w:w="1152"/>
-            <w:shd w:val="clear" w:color="auto" w:fill="F2F2F2"/>
-          </w:tcPr>
-          <w:p>
-            <w:r/>
-            <w:r>
-              <w:rPr>
-                <w:rFonts w:ascii="Calibri" w:hAnsi="Calibri"/>
-                <w:b w:val="0"/>
-                <w:i w:val="0"/>
-                <w:sz w:val="18"/>
-              </w:rPr>
-              <w:t>4</w:t>
-            </w:r>
-          </w:p>
-        </w:tc>
-      </w:tr>
-      <w:tr>
-        <w:tc>
-          <w:tcPr>
-            <w:tcW w:type="dxa" w:w="6480"/>
-            <w:shd w:val="clear" w:color="auto" w:fill="FFFFFF"/>
-          </w:tcPr>
-          <w:p>
-            <w:r/>
-            <w:r>
-              <w:rPr>
-                <w:rFonts w:ascii="Calibri" w:hAnsi="Calibri"/>
-                <w:b w:val="0"/>
-                <w:i w:val="0"/>
-                <w:sz w:val="18"/>
-              </w:rPr>
-              <w:t>Tenants</w:t>
-            </w:r>
-          </w:p>
-        </w:tc>
-        <w:tc>
-          <w:tcPr>
-            <w:tcW w:type="dxa" w:w="1152"/>
-            <w:shd w:val="clear" w:color="auto" w:fill="FFFFFF"/>
-          </w:tcPr>
-          <w:p>
-            <w:r/>
-            <w:r>
-              <w:rPr>
-                <w:rFonts w:ascii="Calibri" w:hAnsi="Calibri"/>
-                <w:b w:val="0"/>
-                <w:i w:val="0"/>
-                <w:sz w:val="18"/>
-              </w:rPr>
-              <w:t>2</w:t>
-            </w:r>
-          </w:p>
-        </w:tc>
-      </w:tr>
-      <w:tr>
-        <w:tc>
-          <w:tcPr>
-            <w:tcW w:type="dxa" w:w="6480"/>
-            <w:shd w:val="clear" w:color="auto" w:fill="F2F2F2"/>
-          </w:tcPr>
-          <w:p>
-            <w:r/>
-            <w:r>
-              <w:rPr>
-                <w:rFonts w:ascii="Calibri" w:hAnsi="Calibri"/>
-                <w:b w:val="0"/>
-                <w:i w:val="0"/>
-                <w:sz w:val="18"/>
-              </w:rPr>
-              <w:t>Optimize Rate</w:t>
-            </w:r>
-          </w:p>
-        </w:tc>
-        <w:tc>
-          <w:tcPr>
-            <w:tcW w:type="dxa" w:w="1152"/>
-            <w:shd w:val="clear" w:color="auto" w:fill="F2F2F2"/>
-          </w:tcPr>
-          <w:p>
-            <w:r/>
-            <w:r>
-              <w:rPr>
-                <w:rFonts w:ascii="Calibri" w:hAnsi="Calibri"/>
-                <w:b w:val="0"/>
-                <w:i w:val="0"/>
-                <w:sz w:val="18"/>
-              </w:rPr>
-              <w:t>2</w:t>
-            </w:r>
-          </w:p>
-        </w:tc>
-      </w:tr>
-      <w:tr>
-        <w:tc>
-          <w:tcPr>
-            <w:tcW w:type="dxa" w:w="6480"/>
-            <w:shd w:val="clear" w:color="auto" w:fill="FFFFFF"/>
-          </w:tcPr>
-          <w:p>
-            <w:r/>
-            <w:r>
-              <w:rPr>
-                <w:rFonts w:ascii="Calibri" w:hAnsi="Calibri"/>
-                <w:b w:val="0"/>
-                <w:i w:val="0"/>
-                <w:sz w:val="18"/>
-              </w:rPr>
-              <w:t>Policies</w:t>
-            </w:r>
-          </w:p>
-        </w:tc>
-        <w:tc>
-          <w:tcPr>
-            <w:tcW w:type="dxa" w:w="1152"/>
-            <w:shd w:val="clear" w:color="auto" w:fill="FFFFFF"/>
-          </w:tcPr>
-          <w:p>
-            <w:r/>
-            <w:r>
-              <w:rPr>
-                <w:rFonts w:ascii="Calibri" w:hAnsi="Calibri"/>
-                <w:b w:val="0"/>
-                <w:i w:val="0"/>
-                <w:sz w:val="18"/>
-              </w:rPr>
-              <w:t>1</w:t>
-            </w:r>
-          </w:p>
-        </w:tc>
-      </w:tr>
-      <w:tr>
-        <w:tc>
-          <w:tcPr>
-            <w:tcW w:type="dxa" w:w="6480"/>
-            <w:shd w:val="clear" w:color="auto" w:fill="F2F2F2"/>
-          </w:tcPr>
-          <w:p>
-            <w:r/>
-            <w:r>
-              <w:rPr>
-                <w:rFonts w:ascii="Calibri" w:hAnsi="Calibri"/>
-                <w:b w:val="0"/>
-                <w:i w:val="0"/>
-                <w:sz w:val="18"/>
-              </w:rPr>
-              <w:t>FinOps NexGen Reports</w:t>
-            </w:r>
-          </w:p>
-        </w:tc>
-        <w:tc>
-          <w:tcPr>
-            <w:tcW w:type="dxa" w:w="1152"/>
-            <w:shd w:val="clear" w:color="auto" w:fill="F2F2F2"/>
-          </w:tcPr>
-          <w:p>
-            <w:r/>
-            <w:r>
-              <w:rPr>
-                <w:rFonts w:ascii="Calibri" w:hAnsi="Calibri"/>
-                <w:b w:val="0"/>
-                <w:i w:val="0"/>
-                <w:sz w:val="18"/>
-              </w:rPr>
-              <w:t>1</w:t>
             </w:r>
           </w:p>
         </w:tc>
@@ -2267,6 +2001,262 @@
                 <w:i w:val="0"/>
                 <w:sz w:val="18"/>
               </w:rPr>
+              <w:t>131077</w:t>
+            </w:r>
+          </w:p>
+        </w:tc>
+        <w:tc>
+          <w:tcPr>
+            <w:tcW w:type="dxa" w:w="4032"/>
+            <w:shd w:val="clear" w:color="auto" w:fill="F2F2F2"/>
+          </w:tcPr>
+          <w:p>
+            <w:r/>
+            <w:r>
+              <w:rPr>
+                <w:rFonts w:ascii="Calibri" w:hAnsi="Calibri"/>
+                <w:b w:val="0"/>
+                <w:i w:val="0"/>
+                <w:sz w:val="18"/>
+              </w:rPr>
+              <w:t>Blackstone -Rover - Forecast</w:t>
+            </w:r>
+          </w:p>
+        </w:tc>
+        <w:tc>
+          <w:tcPr>
+            <w:tcW w:type="dxa" w:w="2016"/>
+            <w:shd w:val="clear" w:color="auto" w:fill="F2F2F2"/>
+          </w:tcPr>
+          <w:p>
+            <w:r/>
+            <w:r>
+              <w:rPr>
+                <w:rFonts w:ascii="Calibri" w:hAnsi="Calibri"/>
+                <w:b w:val="0"/>
+                <w:i w:val="0"/>
+                <w:sz w:val="18"/>
+              </w:rPr>
+              <w:t>Chitra J</w:t>
+            </w:r>
+          </w:p>
+        </w:tc>
+        <w:tc>
+          <w:tcPr>
+            <w:tcW w:type="dxa" w:w="1296"/>
+            <w:shd w:val="clear" w:color="auto" w:fill="F2F2F2"/>
+          </w:tcPr>
+          <w:p>
+            <w:r/>
+            <w:r>
+              <w:rPr>
+                <w:rFonts w:ascii="Calibri" w:hAnsi="Calibri"/>
+                <w:b w:val="0"/>
+                <w:i w:val="0"/>
+                <w:sz w:val="18"/>
+              </w:rPr>
+              <w:t>AI</w:t>
+            </w:r>
+          </w:p>
+        </w:tc>
+        <w:tc>
+          <w:tcPr>
+            <w:tcW w:type="dxa" w:w="576"/>
+            <w:shd w:val="clear" w:color="auto" w:fill="F2F2F2"/>
+          </w:tcPr>
+          <w:p>
+            <w:r/>
+            <w:r>
+              <w:rPr>
+                <w:rFonts w:ascii="Calibri" w:hAnsi="Calibri"/>
+                <w:b w:val="0"/>
+                <w:i w:val="0"/>
+                <w:sz w:val="18"/>
+              </w:rPr>
+              <w:t>P3</w:t>
+            </w:r>
+          </w:p>
+        </w:tc>
+        <w:tc>
+          <w:tcPr>
+            <w:tcW w:type="dxa" w:w="1440"/>
+            <w:shd w:val="clear" w:color="auto" w:fill="F2F2F2"/>
+          </w:tcPr>
+          <w:p>
+            <w:r/>
+            <w:r>
+              <w:rPr>
+                <w:rFonts w:ascii="Calibri" w:hAnsi="Calibri"/>
+                <w:b w:val="0"/>
+                <w:i w:val="0"/>
+                <w:sz w:val="18"/>
+              </w:rPr>
+              <w:t>Awaiting Deployment</w:t>
+            </w:r>
+          </w:p>
+        </w:tc>
+        <w:tc>
+          <w:tcPr>
+            <w:tcW w:type="dxa" w:w="1008"/>
+            <w:shd w:val="clear" w:color="auto" w:fill="F2F2F2"/>
+          </w:tcPr>
+          <w:p>
+            <w:r/>
+            <w:r>
+              <w:rPr>
+                <w:rFonts w:ascii="Calibri" w:hAnsi="Calibri"/>
+                <w:b w:val="0"/>
+                <w:i w:val="0"/>
+                <w:sz w:val="18"/>
+              </w:rPr>
+              <w:t>Incident</w:t>
+            </w:r>
+          </w:p>
+        </w:tc>
+      </w:tr>
+      <w:tr>
+        <w:tc>
+          <w:tcPr>
+            <w:tcW w:type="dxa" w:w="864"/>
+            <w:shd w:val="clear" w:color="auto" w:fill="FFFFFF"/>
+          </w:tcPr>
+          <w:p>
+            <w:r/>
+            <w:r>
+              <w:rPr>
+                <w:rFonts w:ascii="Calibri" w:hAnsi="Calibri"/>
+                <w:b w:val="0"/>
+                <w:i w:val="0"/>
+                <w:sz w:val="18"/>
+              </w:rPr>
+              <w:t>131910</w:t>
+            </w:r>
+          </w:p>
+        </w:tc>
+        <w:tc>
+          <w:tcPr>
+            <w:tcW w:type="dxa" w:w="4032"/>
+            <w:shd w:val="clear" w:color="auto" w:fill="FFFFFF"/>
+          </w:tcPr>
+          <w:p>
+            <w:r/>
+            <w:r>
+              <w:rPr>
+                <w:rFonts w:ascii="Calibri" w:hAnsi="Calibri"/>
+                <w:b w:val="0"/>
+                <w:i w:val="0"/>
+                <w:sz w:val="18"/>
+              </w:rPr>
+              <w:t>Duplicate Recommendations Visible in Custom Optimize Dashboard</w:t>
+            </w:r>
+          </w:p>
+        </w:tc>
+        <w:tc>
+          <w:tcPr>
+            <w:tcW w:type="dxa" w:w="2016"/>
+            <w:shd w:val="clear" w:color="auto" w:fill="FFFFFF"/>
+          </w:tcPr>
+          <w:p>
+            <w:r/>
+            <w:r>
+              <w:rPr>
+                <w:rFonts w:ascii="Calibri" w:hAnsi="Calibri"/>
+                <w:b w:val="0"/>
+                <w:i w:val="0"/>
+                <w:sz w:val="18"/>
+              </w:rPr>
+              <w:t>Naveen Kumar K</w:t>
+            </w:r>
+          </w:p>
+        </w:tc>
+        <w:tc>
+          <w:tcPr>
+            <w:tcW w:type="dxa" w:w="1296"/>
+            <w:shd w:val="clear" w:color="auto" w:fill="FFFFFF"/>
+          </w:tcPr>
+          <w:p>
+            <w:r/>
+            <w:r>
+              <w:rPr>
+                <w:rFonts w:ascii="Calibri" w:hAnsi="Calibri"/>
+                <w:b w:val="0"/>
+                <w:i w:val="0"/>
+                <w:sz w:val="18"/>
+              </w:rPr>
+              <w:t>Professional Services</w:t>
+            </w:r>
+          </w:p>
+        </w:tc>
+        <w:tc>
+          <w:tcPr>
+            <w:tcW w:type="dxa" w:w="576"/>
+            <w:shd w:val="clear" w:color="auto" w:fill="FFFFFF"/>
+          </w:tcPr>
+          <w:p>
+            <w:r/>
+            <w:r>
+              <w:rPr>
+                <w:rFonts w:ascii="Calibri" w:hAnsi="Calibri"/>
+                <w:b w:val="0"/>
+                <w:i w:val="0"/>
+                <w:sz w:val="18"/>
+              </w:rPr>
+              <w:t>P2</w:t>
+            </w:r>
+          </w:p>
+        </w:tc>
+        <w:tc>
+          <w:tcPr>
+            <w:tcW w:type="dxa" w:w="1440"/>
+            <w:shd w:val="clear" w:color="auto" w:fill="FFFFFF"/>
+          </w:tcPr>
+          <w:p>
+            <w:r/>
+            <w:r>
+              <w:rPr>
+                <w:rFonts w:ascii="Calibri" w:hAnsi="Calibri"/>
+                <w:b w:val="0"/>
+                <w:i w:val="0"/>
+                <w:sz w:val="18"/>
+              </w:rPr>
+              <w:t>Awaiting Deployment</w:t>
+            </w:r>
+          </w:p>
+        </w:tc>
+        <w:tc>
+          <w:tcPr>
+            <w:tcW w:type="dxa" w:w="1008"/>
+            <w:shd w:val="clear" w:color="auto" w:fill="FFFFFF"/>
+          </w:tcPr>
+          <w:p>
+            <w:r/>
+            <w:r>
+              <w:rPr>
+                <w:rFonts w:ascii="Calibri" w:hAnsi="Calibri"/>
+                <w:b w:val="0"/>
+                <w:i w:val="0"/>
+                <w:sz w:val="18"/>
+              </w:rPr>
+              <w:t>Incident</w:t>
+            </w:r>
+          </w:p>
+        </w:tc>
+      </w:tr>
+      <w:tr>
+        <w:tc>
+          <w:tcPr>
+            <w:tcW w:type="dxa" w:w="864"/>
+            <w:shd w:val="clear" w:color="auto" w:fill="F2F2F2"/>
+          </w:tcPr>
+          <w:p>
+            <w:r/>
+            <w:r>
+              <w:rPr>
+                <w:rFonts w:ascii="Calibri" w:hAnsi="Calibri"/>
+                <w:b w:val="0"/>
+                <w:i w:val="0"/>
+                <w:sz w:val="18"/>
+              </w:rPr>
               <w:t>134003</w:t>
             </w:r>
           </w:p>
@@ -2303,7 +2293,7 @@
                 <w:i w:val="0"/>
                 <w:sz w:val="18"/>
               </w:rPr>
-              <w:t>Zubair</w:t>
+              <w:t>Zubair Hussain T</w:t>
             </w:r>
           </w:p>
         </w:tc>
@@ -2321,7 +2311,7 @@
                 <w:i w:val="0"/>
                 <w:sz w:val="18"/>
               </w:rPr>
-              <w:t>Analytics</w:t>
+              <w:t>FinOps</w:t>
             </w:r>
           </w:p>
         </w:tc>
@@ -2375,263 +2365,7 @@
                 <w:i w:val="0"/>
                 <w:sz w:val="18"/>
               </w:rPr>
-              <w:t>Bug</w:t>
-            </w:r>
-          </w:p>
-        </w:tc>
-      </w:tr>
-      <w:tr>
-        <w:tc>
-          <w:tcPr>
-            <w:tcW w:type="dxa" w:w="864"/>
-            <w:shd w:val="clear" w:color="auto" w:fill="FFFFFF"/>
-          </w:tcPr>
-          <w:p>
-            <w:r/>
-            <w:r>
-              <w:rPr>
-                <w:rFonts w:ascii="Calibri" w:hAnsi="Calibri"/>
-                <w:b w:val="0"/>
-                <w:i w:val="0"/>
-                <w:sz w:val="18"/>
-              </w:rPr>
-              <w:t>131077</w:t>
-            </w:r>
-          </w:p>
-        </w:tc>
-        <w:tc>
-          <w:tcPr>
-            <w:tcW w:type="dxa" w:w="4032"/>
-            <w:shd w:val="clear" w:color="auto" w:fill="FFFFFF"/>
-          </w:tcPr>
-          <w:p>
-            <w:r/>
-            <w:r>
-              <w:rPr>
-                <w:rFonts w:ascii="Calibri" w:hAnsi="Calibri"/>
-                <w:b w:val="0"/>
-                <w:i w:val="0"/>
-                <w:sz w:val="18"/>
-              </w:rPr>
-              <w:t>Blackstone - Rover - Forecast data missing</w:t>
-            </w:r>
-          </w:p>
-        </w:tc>
-        <w:tc>
-          <w:tcPr>
-            <w:tcW w:type="dxa" w:w="2016"/>
-            <w:shd w:val="clear" w:color="auto" w:fill="FFFFFF"/>
-          </w:tcPr>
-          <w:p>
-            <w:r/>
-            <w:r>
-              <w:rPr>
-                <w:rFonts w:ascii="Calibri" w:hAnsi="Calibri"/>
-                <w:b w:val="0"/>
-                <w:i w:val="0"/>
-                <w:sz w:val="18"/>
-              </w:rPr>
-              <w:t>Aadhithya Shanmugapriyan</w:t>
-            </w:r>
-          </w:p>
-        </w:tc>
-        <w:tc>
-          <w:tcPr>
-            <w:tcW w:type="dxa" w:w="1296"/>
-            <w:shd w:val="clear" w:color="auto" w:fill="FFFFFF"/>
-          </w:tcPr>
-          <w:p>
-            <w:r/>
-            <w:r>
-              <w:rPr>
-                <w:rFonts w:ascii="Calibri" w:hAnsi="Calibri"/>
-                <w:b w:val="0"/>
-                <w:i w:val="0"/>
-                <w:sz w:val="18"/>
-              </w:rPr>
-              <w:t>FinOps</w:t>
-            </w:r>
-          </w:p>
-        </w:tc>
-        <w:tc>
-          <w:tcPr>
-            <w:tcW w:type="dxa" w:w="576"/>
-            <w:shd w:val="clear" w:color="auto" w:fill="FFFFFF"/>
-          </w:tcPr>
-          <w:p>
-            <w:r/>
-            <w:r>
-              <w:rPr>
-                <w:rFonts w:ascii="Calibri" w:hAnsi="Calibri"/>
-                <w:b w:val="0"/>
-                <w:i w:val="0"/>
-                <w:sz w:val="18"/>
-              </w:rPr>
-              <w:t>P2</w:t>
-            </w:r>
-          </w:p>
-        </w:tc>
-        <w:tc>
-          <w:tcPr>
-            <w:tcW w:type="dxa" w:w="1440"/>
-            <w:shd w:val="clear" w:color="auto" w:fill="FFFFFF"/>
-          </w:tcPr>
-          <w:p>
-            <w:r/>
-            <w:r>
-              <w:rPr>
-                <w:rFonts w:ascii="Calibri" w:hAnsi="Calibri"/>
-                <w:b w:val="0"/>
-                <w:i w:val="0"/>
-                <w:sz w:val="18"/>
-              </w:rPr>
-              <w:t>New</w:t>
-            </w:r>
-          </w:p>
-        </w:tc>
-        <w:tc>
-          <w:tcPr>
-            <w:tcW w:type="dxa" w:w="1008"/>
-            <w:shd w:val="clear" w:color="auto" w:fill="FFFFFF"/>
-          </w:tcPr>
-          <w:p>
-            <w:r/>
-            <w:r>
-              <w:rPr>
-                <w:rFonts w:ascii="Calibri" w:hAnsi="Calibri"/>
-                <w:b w:val="0"/>
-                <w:i w:val="0"/>
-                <w:sz w:val="18"/>
-              </w:rPr>
-              <w:t>Bug</w:t>
-            </w:r>
-          </w:p>
-        </w:tc>
-      </w:tr>
-      <w:tr>
-        <w:tc>
-          <w:tcPr>
-            <w:tcW w:type="dxa" w:w="864"/>
-            <w:shd w:val="clear" w:color="auto" w:fill="F2F2F2"/>
-          </w:tcPr>
-          <w:p>
-            <w:r/>
-            <w:r>
-              <w:rPr>
-                <w:rFonts w:ascii="Calibri" w:hAnsi="Calibri"/>
-                <w:b w:val="0"/>
-                <w:i w:val="0"/>
-                <w:sz w:val="18"/>
-              </w:rPr>
-              <w:t>131076</w:t>
-            </w:r>
-          </w:p>
-        </w:tc>
-        <w:tc>
-          <w:tcPr>
-            <w:tcW w:type="dxa" w:w="4032"/>
-            <w:shd w:val="clear" w:color="auto" w:fill="F2F2F2"/>
-          </w:tcPr>
-          <w:p>
-            <w:r/>
-            <w:r>
-              <w:rPr>
-                <w:rFonts w:ascii="Calibri" w:hAnsi="Calibri"/>
-                <w:b w:val="0"/>
-                <w:i w:val="0"/>
-                <w:sz w:val="18"/>
-              </w:rPr>
-              <w:t>Blackstone - RBAC permission issue on tenant view</w:t>
-            </w:r>
-          </w:p>
-        </w:tc>
-        <w:tc>
-          <w:tcPr>
-            <w:tcW w:type="dxa" w:w="2016"/>
-            <w:shd w:val="clear" w:color="auto" w:fill="F2F2F2"/>
-          </w:tcPr>
-          <w:p>
-            <w:r/>
-            <w:r>
-              <w:rPr>
-                <w:rFonts w:ascii="Calibri" w:hAnsi="Calibri"/>
-                <w:b w:val="0"/>
-                <w:i w:val="0"/>
-                <w:sz w:val="18"/>
-              </w:rPr>
-              <w:t>Aadhithya Shanmugapriyan</w:t>
-            </w:r>
-          </w:p>
-        </w:tc>
-        <w:tc>
-          <w:tcPr>
-            <w:tcW w:type="dxa" w:w="1296"/>
-            <w:shd w:val="clear" w:color="auto" w:fill="F2F2F2"/>
-          </w:tcPr>
-          <w:p>
-            <w:r/>
-            <w:r>
-              <w:rPr>
-                <w:rFonts w:ascii="Calibri" w:hAnsi="Calibri"/>
-                <w:b w:val="0"/>
-                <w:i w:val="0"/>
-                <w:sz w:val="18"/>
-              </w:rPr>
-              <w:t>Core</w:t>
-            </w:r>
-          </w:p>
-        </w:tc>
-        <w:tc>
-          <w:tcPr>
-            <w:tcW w:type="dxa" w:w="576"/>
-            <w:shd w:val="clear" w:color="auto" w:fill="F2F2F2"/>
-          </w:tcPr>
-          <w:p>
-            <w:r/>
-            <w:r>
-              <w:rPr>
-                <w:rFonts w:ascii="Calibri" w:hAnsi="Calibri"/>
-                <w:b w:val="0"/>
-                <w:i w:val="0"/>
-                <w:sz w:val="18"/>
-              </w:rPr>
-              <w:t>P3</w:t>
-            </w:r>
-          </w:p>
-        </w:tc>
-        <w:tc>
-          <w:tcPr>
-            <w:tcW w:type="dxa" w:w="1440"/>
-            <w:shd w:val="clear" w:color="auto" w:fill="F2F2F2"/>
-          </w:tcPr>
-          <w:p>
-            <w:r/>
-            <w:r>
-              <w:rPr>
-                <w:rFonts w:ascii="Calibri" w:hAnsi="Calibri"/>
-                <w:b w:val="0"/>
-                <w:i w:val="0"/>
-                <w:sz w:val="18"/>
-              </w:rPr>
-              <w:t>Awaiting Deployment</w:t>
-            </w:r>
-          </w:p>
-        </w:tc>
-        <w:tc>
-          <w:tcPr>
-            <w:tcW w:type="dxa" w:w="1008"/>
-            <w:shd w:val="clear" w:color="auto" w:fill="F2F2F2"/>
-          </w:tcPr>
-          <w:p>
-            <w:r/>
-            <w:r>
-              <w:rPr>
-                <w:rFonts w:ascii="Calibri" w:hAnsi="Calibri"/>
-                <w:b w:val="0"/>
-                <w:i w:val="0"/>
-                <w:sz w:val="18"/>
-              </w:rPr>
-              <w:t>Bug</w:t>
+              <w:t>Incident</w:t>
             </w:r>
           </w:p>
         </w:tc>
@@ -2659,7 +2393,7 @@
             <w:r>
               <w:drawing>
                 <wp:inline xmlns:a="http://schemas.openxmlformats.org/drawingml/2006/main" xmlns:pic="http://schemas.openxmlformats.org/drawingml/2006/picture">
-                  <wp:extent cx="3017520" cy="2024915"/>
+                  <wp:extent cx="3017520" cy="2618226"/>
                   <wp:docPr id="3" name="Picture 3"/>
                   <wp:cNvGraphicFramePr>
                     <a:graphicFrameLocks noChangeAspect="1"/>
@@ -2680,7 +2414,7 @@
                         <pic:spPr>
                           <a:xfrm>
                             <a:off x="0" y="0"/>
-                            <a:ext cx="3017520" cy="2024915"/>
+                            <a:ext cx="3017520" cy="2618226"/>
                           </a:xfrm>
                           <a:prstGeom prst="rect"/>
                         </pic:spPr>
@@ -2770,7 +2504,7 @@
           <w:color w:val="757575"/>
           <w:sz w:val="18"/>
         </w:rPr>
-        <w:t>Thursday, June 18, 2026   ·   Report generated 12:50 PM IST</w:t>
+        <w:t>Thursday, June 18, 2026   ·   Report generated 1:31 PM IST</w:t>
       </w:r>
     </w:p>
     <w:p>
@@ -2957,7 +2691,7 @@
               </w:rPr>
               <w:t>3</w:t>
               <w:br/>
-              <w:t>#134003, #131077, #131076</w:t>
+              <w:t>#131077, #131910, #134003</w:t>
             </w:r>
           </w:p>
         </w:tc>
@@ -4308,7 +4042,7 @@
             <w:r>
               <w:drawing>
                 <wp:inline xmlns:a="http://schemas.openxmlformats.org/drawingml/2006/main" xmlns:pic="http://schemas.openxmlformats.org/drawingml/2006/picture">
-                  <wp:extent cx="3017520" cy="1563624"/>
+                  <wp:extent cx="3017520" cy="1225441"/>
                   <wp:docPr id="6" name="Picture 6"/>
                   <wp:cNvGraphicFramePr>
                     <a:graphicFrameLocks noChangeAspect="1"/>
@@ -4329,7 +4063,7 @@
                         <pic:spPr>
                           <a:xfrm>
                             <a:off x="0" y="0"/>
-                            <a:ext cx="3017520" cy="1563624"/>
+                            <a:ext cx="3017520" cy="1225441"/>
                           </a:xfrm>
                           <a:prstGeom prst="rect"/>
                         </pic:spPr>
@@ -4409,272 +4143,6 @@
                 <w:sz w:val="18"/>
               </w:rPr>
               <w:t>Views</w:t>
-            </w:r>
-          </w:p>
-        </w:tc>
-      </w:tr>
-      <w:tr>
-        <w:tc>
-          <w:tcPr>
-            <w:tcW w:type="dxa" w:w="6480"/>
-            <w:shd w:val="clear" w:color="auto" w:fill="F2F2F2"/>
-          </w:tcPr>
-          <w:p>
-            <w:r/>
-            <w:r>
-              <w:rPr>
-                <w:rFonts w:ascii="Calibri" w:hAnsi="Calibri"/>
-                <w:b w:val="0"/>
-                <w:i w:val="0"/>
-                <w:sz w:val="18"/>
-              </w:rPr>
-              <w:t>Cloud Account Governance</w:t>
-            </w:r>
-          </w:p>
-        </w:tc>
-        <w:tc>
-          <w:tcPr>
-            <w:tcW w:type="dxa" w:w="1152"/>
-            <w:shd w:val="clear" w:color="auto" w:fill="F2F2F2"/>
-          </w:tcPr>
-          <w:p>
-            <w:r/>
-            <w:r>
-              <w:rPr>
-                <w:rFonts w:ascii="Calibri" w:hAnsi="Calibri"/>
-                <w:b w:val="0"/>
-                <w:i w:val="0"/>
-                <w:sz w:val="18"/>
-              </w:rPr>
-              <w:t>52</w:t>
-            </w:r>
-          </w:p>
-        </w:tc>
-      </w:tr>
-      <w:tr>
-        <w:tc>
-          <w:tcPr>
-            <w:tcW w:type="dxa" w:w="6480"/>
-            <w:shd w:val="clear" w:color="auto" w:fill="FFFFFF"/>
-          </w:tcPr>
-          <w:p>
-            <w:r/>
-            <w:r>
-              <w:rPr>
-                <w:rFonts w:ascii="Calibri" w:hAnsi="Calibri"/>
-                <w:b w:val="0"/>
-                <w:i w:val="0"/>
-                <w:sz w:val="18"/>
-              </w:rPr>
-              <w:t>Unified Governance</w:t>
-            </w:r>
-          </w:p>
-        </w:tc>
-        <w:tc>
-          <w:tcPr>
-            <w:tcW w:type="dxa" w:w="1152"/>
-            <w:shd w:val="clear" w:color="auto" w:fill="FFFFFF"/>
-          </w:tcPr>
-          <w:p>
-            <w:r/>
-            <w:r>
-              <w:rPr>
-                <w:rFonts w:ascii="Calibri" w:hAnsi="Calibri"/>
-                <w:b w:val="0"/>
-                <w:i w:val="0"/>
-                <w:sz w:val="18"/>
-              </w:rPr>
-              <w:t>9</w:t>
-            </w:r>
-          </w:p>
-        </w:tc>
-      </w:tr>
-      <w:tr>
-        <w:tc>
-          <w:tcPr>
-            <w:tcW w:type="dxa" w:w="6480"/>
-            <w:shd w:val="clear" w:color="auto" w:fill="F2F2F2"/>
-          </w:tcPr>
-          <w:p>
-            <w:r/>
-            <w:r>
-              <w:rPr>
-                <w:rFonts w:ascii="Calibri" w:hAnsi="Calibri"/>
-                <w:b w:val="0"/>
-                <w:i w:val="0"/>
-                <w:sz w:val="18"/>
-              </w:rPr>
-              <w:t>Inventory</w:t>
-            </w:r>
-          </w:p>
-        </w:tc>
-        <w:tc>
-          <w:tcPr>
-            <w:tcW w:type="dxa" w:w="1152"/>
-            <w:shd w:val="clear" w:color="auto" w:fill="F2F2F2"/>
-          </w:tcPr>
-          <w:p>
-            <w:r/>
-            <w:r>
-              <w:rPr>
-                <w:rFonts w:ascii="Calibri" w:hAnsi="Calibri"/>
-                <w:b w:val="0"/>
-                <w:i w:val="0"/>
-                <w:sz w:val="18"/>
-              </w:rPr>
-              <w:t>4</w:t>
-            </w:r>
-          </w:p>
-        </w:tc>
-      </w:tr>
-      <w:tr>
-        <w:tc>
-          <w:tcPr>
-            <w:tcW w:type="dxa" w:w="6480"/>
-            <w:shd w:val="clear" w:color="auto" w:fill="FFFFFF"/>
-          </w:tcPr>
-          <w:p>
-            <w:r/>
-            <w:r>
-              <w:rPr>
-                <w:rFonts w:ascii="Calibri" w:hAnsi="Calibri"/>
-                <w:b w:val="0"/>
-                <w:i w:val="0"/>
-                <w:sz w:val="18"/>
-              </w:rPr>
-              <w:t>Tenants</w:t>
-            </w:r>
-          </w:p>
-        </w:tc>
-        <w:tc>
-          <w:tcPr>
-            <w:tcW w:type="dxa" w:w="1152"/>
-            <w:shd w:val="clear" w:color="auto" w:fill="FFFFFF"/>
-          </w:tcPr>
-          <w:p>
-            <w:r/>
-            <w:r>
-              <w:rPr>
-                <w:rFonts w:ascii="Calibri" w:hAnsi="Calibri"/>
-                <w:b w:val="0"/>
-                <w:i w:val="0"/>
-                <w:sz w:val="18"/>
-              </w:rPr>
-              <w:t>2</w:t>
-            </w:r>
-          </w:p>
-        </w:tc>
-      </w:tr>
-      <w:tr>
-        <w:tc>
-          <w:tcPr>
-            <w:tcW w:type="dxa" w:w="6480"/>
-            <w:shd w:val="clear" w:color="auto" w:fill="F2F2F2"/>
-          </w:tcPr>
-          <w:p>
-            <w:r/>
-            <w:r>
-              <w:rPr>
-                <w:rFonts w:ascii="Calibri" w:hAnsi="Calibri"/>
-                <w:b w:val="0"/>
-                <w:i w:val="0"/>
-                <w:sz w:val="18"/>
-              </w:rPr>
-              <w:t>Optimize Rate</w:t>
-            </w:r>
-          </w:p>
-        </w:tc>
-        <w:tc>
-          <w:tcPr>
-            <w:tcW w:type="dxa" w:w="1152"/>
-            <w:shd w:val="clear" w:color="auto" w:fill="F2F2F2"/>
-          </w:tcPr>
-          <w:p>
-            <w:r/>
-            <w:r>
-              <w:rPr>
-                <w:rFonts w:ascii="Calibri" w:hAnsi="Calibri"/>
-                <w:b w:val="0"/>
-                <w:i w:val="0"/>
-                <w:sz w:val="18"/>
-              </w:rPr>
-              <w:t>2</w:t>
-            </w:r>
-          </w:p>
-        </w:tc>
-      </w:tr>
-      <w:tr>
-        <w:tc>
-          <w:tcPr>
-            <w:tcW w:type="dxa" w:w="6480"/>
-            <w:shd w:val="clear" w:color="auto" w:fill="FFFFFF"/>
-          </w:tcPr>
-          <w:p>
-            <w:r/>
-            <w:r>
-              <w:rPr>
-                <w:rFonts w:ascii="Calibri" w:hAnsi="Calibri"/>
-                <w:b w:val="0"/>
-                <w:i w:val="0"/>
-                <w:sz w:val="18"/>
-              </w:rPr>
-              <w:t>Policies</w:t>
-            </w:r>
-          </w:p>
-        </w:tc>
-        <w:tc>
-          <w:tcPr>
-            <w:tcW w:type="dxa" w:w="1152"/>
-            <w:shd w:val="clear" w:color="auto" w:fill="FFFFFF"/>
-          </w:tcPr>
-          <w:p>
-            <w:r/>
-            <w:r>
-              <w:rPr>
-                <w:rFonts w:ascii="Calibri" w:hAnsi="Calibri"/>
-                <w:b w:val="0"/>
-                <w:i w:val="0"/>
-                <w:sz w:val="18"/>
-              </w:rPr>
-              <w:t>1</w:t>
-            </w:r>
-          </w:p>
-        </w:tc>
-      </w:tr>
-      <w:tr>
-        <w:tc>
-          <w:tcPr>
-            <w:tcW w:type="dxa" w:w="6480"/>
-            <w:shd w:val="clear" w:color="auto" w:fill="F2F2F2"/>
-          </w:tcPr>
-          <w:p>
-            <w:r/>
-            <w:r>
-              <w:rPr>
-                <w:rFonts w:ascii="Calibri" w:hAnsi="Calibri"/>
-                <w:b w:val="0"/>
-                <w:i w:val="0"/>
-                <w:sz w:val="18"/>
-              </w:rPr>
-              <w:t>FinOps NexGen Reports</w:t>
-            </w:r>
-          </w:p>
-        </w:tc>
-        <w:tc>
-          <w:tcPr>
-            <w:tcW w:type="dxa" w:w="1152"/>
-            <w:shd w:val="clear" w:color="auto" w:fill="F2F2F2"/>
-          </w:tcPr>
-          <w:p>
-            <w:r/>
-            <w:r>
-              <w:rPr>
-                <w:rFonts w:ascii="Calibri" w:hAnsi="Calibri"/>
-                <w:b w:val="0"/>
-                <w:i w:val="0"/>
-                <w:sz w:val="18"/>
-              </w:rPr>
-              <w:t>1</w:t>
             </w:r>
           </w:p>
         </w:tc>
@@ -4896,6 +4364,262 @@
                 <w:i w:val="0"/>
                 <w:sz w:val="18"/>
               </w:rPr>
+              <w:t>131077</w:t>
+            </w:r>
+          </w:p>
+        </w:tc>
+        <w:tc>
+          <w:tcPr>
+            <w:tcW w:type="dxa" w:w="4032"/>
+            <w:shd w:val="clear" w:color="auto" w:fill="F2F2F2"/>
+          </w:tcPr>
+          <w:p>
+            <w:r/>
+            <w:r>
+              <w:rPr>
+                <w:rFonts w:ascii="Calibri" w:hAnsi="Calibri"/>
+                <w:b w:val="0"/>
+                <w:i w:val="0"/>
+                <w:sz w:val="18"/>
+              </w:rPr>
+              <w:t>Blackstone -Rover - Forecast</w:t>
+            </w:r>
+          </w:p>
+        </w:tc>
+        <w:tc>
+          <w:tcPr>
+            <w:tcW w:type="dxa" w:w="2016"/>
+            <w:shd w:val="clear" w:color="auto" w:fill="F2F2F2"/>
+          </w:tcPr>
+          <w:p>
+            <w:r/>
+            <w:r>
+              <w:rPr>
+                <w:rFonts w:ascii="Calibri" w:hAnsi="Calibri"/>
+                <w:b w:val="0"/>
+                <w:i w:val="0"/>
+                <w:sz w:val="18"/>
+              </w:rPr>
+              <w:t>Chitra J</w:t>
+            </w:r>
+          </w:p>
+        </w:tc>
+        <w:tc>
+          <w:tcPr>
+            <w:tcW w:type="dxa" w:w="1296"/>
+            <w:shd w:val="clear" w:color="auto" w:fill="F2F2F2"/>
+          </w:tcPr>
+          <w:p>
+            <w:r/>
+            <w:r>
+              <w:rPr>
+                <w:rFonts w:ascii="Calibri" w:hAnsi="Calibri"/>
+                <w:b w:val="0"/>
+                <w:i w:val="0"/>
+                <w:sz w:val="18"/>
+              </w:rPr>
+              <w:t>AI</w:t>
+            </w:r>
+          </w:p>
+        </w:tc>
+        <w:tc>
+          <w:tcPr>
+            <w:tcW w:type="dxa" w:w="576"/>
+            <w:shd w:val="clear" w:color="auto" w:fill="F2F2F2"/>
+          </w:tcPr>
+          <w:p>
+            <w:r/>
+            <w:r>
+              <w:rPr>
+                <w:rFonts w:ascii="Calibri" w:hAnsi="Calibri"/>
+                <w:b w:val="0"/>
+                <w:i w:val="0"/>
+                <w:sz w:val="18"/>
+              </w:rPr>
+              <w:t>P3</w:t>
+            </w:r>
+          </w:p>
+        </w:tc>
+        <w:tc>
+          <w:tcPr>
+            <w:tcW w:type="dxa" w:w="1440"/>
+            <w:shd w:val="clear" w:color="auto" w:fill="F2F2F2"/>
+          </w:tcPr>
+          <w:p>
+            <w:r/>
+            <w:r>
+              <w:rPr>
+                <w:rFonts w:ascii="Calibri" w:hAnsi="Calibri"/>
+                <w:b w:val="0"/>
+                <w:i w:val="0"/>
+                <w:sz w:val="18"/>
+              </w:rPr>
+              <w:t>Awaiting Deployment</w:t>
+            </w:r>
+          </w:p>
+        </w:tc>
+        <w:tc>
+          <w:tcPr>
+            <w:tcW w:type="dxa" w:w="1008"/>
+            <w:shd w:val="clear" w:color="auto" w:fill="F2F2F2"/>
+          </w:tcPr>
+          <w:p>
+            <w:r/>
+            <w:r>
+              <w:rPr>
+                <w:rFonts w:ascii="Calibri" w:hAnsi="Calibri"/>
+                <w:b w:val="0"/>
+                <w:i w:val="0"/>
+                <w:sz w:val="18"/>
+              </w:rPr>
+              <w:t>Incident</w:t>
+            </w:r>
+          </w:p>
+        </w:tc>
+      </w:tr>
+      <w:tr>
+        <w:tc>
+          <w:tcPr>
+            <w:tcW w:type="dxa" w:w="864"/>
+            <w:shd w:val="clear" w:color="auto" w:fill="FFFFFF"/>
+          </w:tcPr>
+          <w:p>
+            <w:r/>
+            <w:r>
+              <w:rPr>
+                <w:rFonts w:ascii="Calibri" w:hAnsi="Calibri"/>
+                <w:b w:val="0"/>
+                <w:i w:val="0"/>
+                <w:sz w:val="18"/>
+              </w:rPr>
+              <w:t>131910</w:t>
+            </w:r>
+          </w:p>
+        </w:tc>
+        <w:tc>
+          <w:tcPr>
+            <w:tcW w:type="dxa" w:w="4032"/>
+            <w:shd w:val="clear" w:color="auto" w:fill="FFFFFF"/>
+          </w:tcPr>
+          <w:p>
+            <w:r/>
+            <w:r>
+              <w:rPr>
+                <w:rFonts w:ascii="Calibri" w:hAnsi="Calibri"/>
+                <w:b w:val="0"/>
+                <w:i w:val="0"/>
+                <w:sz w:val="18"/>
+              </w:rPr>
+              <w:t>Duplicate Recommendations Visible in Custom Optimize Dashboard</w:t>
+            </w:r>
+          </w:p>
+        </w:tc>
+        <w:tc>
+          <w:tcPr>
+            <w:tcW w:type="dxa" w:w="2016"/>
+            <w:shd w:val="clear" w:color="auto" w:fill="FFFFFF"/>
+          </w:tcPr>
+          <w:p>
+            <w:r/>
+            <w:r>
+              <w:rPr>
+                <w:rFonts w:ascii="Calibri" w:hAnsi="Calibri"/>
+                <w:b w:val="0"/>
+                <w:i w:val="0"/>
+                <w:sz w:val="18"/>
+              </w:rPr>
+              <w:t>Naveen Kumar K</w:t>
+            </w:r>
+          </w:p>
+        </w:tc>
+        <w:tc>
+          <w:tcPr>
+            <w:tcW w:type="dxa" w:w="1296"/>
+            <w:shd w:val="clear" w:color="auto" w:fill="FFFFFF"/>
+          </w:tcPr>
+          <w:p>
+            <w:r/>
+            <w:r>
+              <w:rPr>
+                <w:rFonts w:ascii="Calibri" w:hAnsi="Calibri"/>
+                <w:b w:val="0"/>
+                <w:i w:val="0"/>
+                <w:sz w:val="18"/>
+              </w:rPr>
+              <w:t>Professional Services</w:t>
+            </w:r>
+          </w:p>
+        </w:tc>
+        <w:tc>
+          <w:tcPr>
+            <w:tcW w:type="dxa" w:w="576"/>
+            <w:shd w:val="clear" w:color="auto" w:fill="FFFFFF"/>
+          </w:tcPr>
+          <w:p>
+            <w:r/>
+            <w:r>
+              <w:rPr>
+                <w:rFonts w:ascii="Calibri" w:hAnsi="Calibri"/>
+                <w:b w:val="0"/>
+                <w:i w:val="0"/>
+                <w:sz w:val="18"/>
+              </w:rPr>
+              <w:t>P2</w:t>
+            </w:r>
+          </w:p>
+        </w:tc>
+        <w:tc>
+          <w:tcPr>
+            <w:tcW w:type="dxa" w:w="1440"/>
+            <w:shd w:val="clear" w:color="auto" w:fill="FFFFFF"/>
+          </w:tcPr>
+          <w:p>
+            <w:r/>
+            <w:r>
+              <w:rPr>
+                <w:rFonts w:ascii="Calibri" w:hAnsi="Calibri"/>
+                <w:b w:val="0"/>
+                <w:i w:val="0"/>
+                <w:sz w:val="18"/>
+              </w:rPr>
+              <w:t>Awaiting Deployment</w:t>
+            </w:r>
+          </w:p>
+        </w:tc>
+        <w:tc>
+          <w:tcPr>
+            <w:tcW w:type="dxa" w:w="1008"/>
+            <w:shd w:val="clear" w:color="auto" w:fill="FFFFFF"/>
+          </w:tcPr>
+          <w:p>
+            <w:r/>
+            <w:r>
+              <w:rPr>
+                <w:rFonts w:ascii="Calibri" w:hAnsi="Calibri"/>
+                <w:b w:val="0"/>
+                <w:i w:val="0"/>
+                <w:sz w:val="18"/>
+              </w:rPr>
+              <w:t>Incident</w:t>
+            </w:r>
+          </w:p>
+        </w:tc>
+      </w:tr>
+      <w:tr>
+        <w:tc>
+          <w:tcPr>
+            <w:tcW w:type="dxa" w:w="864"/>
+            <w:shd w:val="clear" w:color="auto" w:fill="F2F2F2"/>
+          </w:tcPr>
+          <w:p>
+            <w:r/>
+            <w:r>
+              <w:rPr>
+                <w:rFonts w:ascii="Calibri" w:hAnsi="Calibri"/>
+                <w:b w:val="0"/>
+                <w:i w:val="0"/>
+                <w:sz w:val="18"/>
+              </w:rPr>
               <w:t>134003</w:t>
             </w:r>
           </w:p>
@@ -4932,7 +4656,7 @@
                 <w:i w:val="0"/>
                 <w:sz w:val="18"/>
               </w:rPr>
-              <w:t>Zubair</w:t>
+              <w:t>Zubair Hussain T</w:t>
             </w:r>
           </w:p>
         </w:tc>
@@ -4950,7 +4674,7 @@
                 <w:i w:val="0"/>
                 <w:sz w:val="18"/>
               </w:rPr>
-              <w:t>Analytics</w:t>
+              <w:t>FinOps</w:t>
             </w:r>
           </w:p>
         </w:tc>
@@ -5004,263 +4728,7 @@
                 <w:i w:val="0"/>
                 <w:sz w:val="18"/>
               </w:rPr>
-              <w:t>Bug</w:t>
-            </w:r>
-          </w:p>
-        </w:tc>
-      </w:tr>
-      <w:tr>
-        <w:tc>
-          <w:tcPr>
-            <w:tcW w:type="dxa" w:w="864"/>
-            <w:shd w:val="clear" w:color="auto" w:fill="FFFFFF"/>
-          </w:tcPr>
-          <w:p>
-            <w:r/>
-            <w:r>
-              <w:rPr>
-                <w:rFonts w:ascii="Calibri" w:hAnsi="Calibri"/>
-                <w:b w:val="0"/>
-                <w:i w:val="0"/>
-                <w:sz w:val="18"/>
-              </w:rPr>
-              <w:t>131077</w:t>
-            </w:r>
-          </w:p>
-        </w:tc>
-        <w:tc>
-          <w:tcPr>
-            <w:tcW w:type="dxa" w:w="4032"/>
-            <w:shd w:val="clear" w:color="auto" w:fill="FFFFFF"/>
-          </w:tcPr>
-          <w:p>
-            <w:r/>
-            <w:r>
-              <w:rPr>
-                <w:rFonts w:ascii="Calibri" w:hAnsi="Calibri"/>
-                <w:b w:val="0"/>
-                <w:i w:val="0"/>
-                <w:sz w:val="18"/>
-              </w:rPr>
-              <w:t>Blackstone - Rover - Forecast data missing</w:t>
-            </w:r>
-          </w:p>
-        </w:tc>
-        <w:tc>
-          <w:tcPr>
-            <w:tcW w:type="dxa" w:w="2016"/>
-            <w:shd w:val="clear" w:color="auto" w:fill="FFFFFF"/>
-          </w:tcPr>
-          <w:p>
-            <w:r/>
-            <w:r>
-              <w:rPr>
-                <w:rFonts w:ascii="Calibri" w:hAnsi="Calibri"/>
-                <w:b w:val="0"/>
-                <w:i w:val="0"/>
-                <w:sz w:val="18"/>
-              </w:rPr>
-              <w:t>Aadhithya Shanmugapriyan</w:t>
-            </w:r>
-          </w:p>
-        </w:tc>
-        <w:tc>
-          <w:tcPr>
-            <w:tcW w:type="dxa" w:w="1296"/>
-            <w:shd w:val="clear" w:color="auto" w:fill="FFFFFF"/>
-          </w:tcPr>
-          <w:p>
-            <w:r/>
-            <w:r>
-              <w:rPr>
-                <w:rFonts w:ascii="Calibri" w:hAnsi="Calibri"/>
-                <w:b w:val="0"/>
-                <w:i w:val="0"/>
-                <w:sz w:val="18"/>
-              </w:rPr>
-              <w:t>FinOps</w:t>
-            </w:r>
-          </w:p>
-        </w:tc>
-        <w:tc>
-          <w:tcPr>
-            <w:tcW w:type="dxa" w:w="576"/>
-            <w:shd w:val="clear" w:color="auto" w:fill="FFFFFF"/>
-          </w:tcPr>
-          <w:p>
-            <w:r/>
-            <w:r>
-              <w:rPr>
-                <w:rFonts w:ascii="Calibri" w:hAnsi="Calibri"/>
-                <w:b w:val="0"/>
-                <w:i w:val="0"/>
-                <w:sz w:val="18"/>
-              </w:rPr>
-              <w:t>P2</w:t>
-            </w:r>
-          </w:p>
-        </w:tc>
-        <w:tc>
-          <w:tcPr>
-            <w:tcW w:type="dxa" w:w="1440"/>
-            <w:shd w:val="clear" w:color="auto" w:fill="FFFFFF"/>
-          </w:tcPr>
-          <w:p>
-            <w:r/>
-            <w:r>
-              <w:rPr>
-                <w:rFonts w:ascii="Calibri" w:hAnsi="Calibri"/>
-                <w:b w:val="0"/>
-                <w:i w:val="0"/>
-                <w:sz w:val="18"/>
-              </w:rPr>
-              <w:t>New</w:t>
-            </w:r>
-          </w:p>
-        </w:tc>
-        <w:tc>
-          <w:tcPr>
-            <w:tcW w:type="dxa" w:w="1008"/>
-            <w:shd w:val="clear" w:color="auto" w:fill="FFFFFF"/>
-          </w:tcPr>
-          <w:p>
-            <w:r/>
-            <w:r>
-              <w:rPr>
-                <w:rFonts w:ascii="Calibri" w:hAnsi="Calibri"/>
-                <w:b w:val="0"/>
-                <w:i w:val="0"/>
-                <w:sz w:val="18"/>
-              </w:rPr>
-              <w:t>Bug</w:t>
-            </w:r>
-          </w:p>
-        </w:tc>
-      </w:tr>
-      <w:tr>
-        <w:tc>
-          <w:tcPr>
-            <w:tcW w:type="dxa" w:w="864"/>
-            <w:shd w:val="clear" w:color="auto" w:fill="F2F2F2"/>
-          </w:tcPr>
-          <w:p>
-            <w:r/>
-            <w:r>
-              <w:rPr>
-                <w:rFonts w:ascii="Calibri" w:hAnsi="Calibri"/>
-                <w:b w:val="0"/>
-                <w:i w:val="0"/>
-                <w:sz w:val="18"/>
-              </w:rPr>
-              <w:t>131076</w:t>
-            </w:r>
-          </w:p>
-        </w:tc>
-        <w:tc>
-          <w:tcPr>
-            <w:tcW w:type="dxa" w:w="4032"/>
-            <w:shd w:val="clear" w:color="auto" w:fill="F2F2F2"/>
-          </w:tcPr>
-          <w:p>
-            <w:r/>
-            <w:r>
-              <w:rPr>
-                <w:rFonts w:ascii="Calibri" w:hAnsi="Calibri"/>
-                <w:b w:val="0"/>
-                <w:i w:val="0"/>
-                <w:sz w:val="18"/>
-              </w:rPr>
-              <w:t>Blackstone - RBAC permission issue on tenant view</w:t>
-            </w:r>
-          </w:p>
-        </w:tc>
-        <w:tc>
-          <w:tcPr>
-            <w:tcW w:type="dxa" w:w="2016"/>
-            <w:shd w:val="clear" w:color="auto" w:fill="F2F2F2"/>
-          </w:tcPr>
-          <w:p>
-            <w:r/>
-            <w:r>
-              <w:rPr>
-                <w:rFonts w:ascii="Calibri" w:hAnsi="Calibri"/>
-                <w:b w:val="0"/>
-                <w:i w:val="0"/>
-                <w:sz w:val="18"/>
-              </w:rPr>
-              <w:t>Aadhithya Shanmugapriyan</w:t>
-            </w:r>
-          </w:p>
-        </w:tc>
-        <w:tc>
-          <w:tcPr>
-            <w:tcW w:type="dxa" w:w="1296"/>
-            <w:shd w:val="clear" w:color="auto" w:fill="F2F2F2"/>
-          </w:tcPr>
-          <w:p>
-            <w:r/>
-            <w:r>
-              <w:rPr>
-                <w:rFonts w:ascii="Calibri" w:hAnsi="Calibri"/>
-                <w:b w:val="0"/>
-                <w:i w:val="0"/>
-                <w:sz w:val="18"/>
-              </w:rPr>
-              <w:t>Core</w:t>
-            </w:r>
-          </w:p>
-        </w:tc>
-        <w:tc>
-          <w:tcPr>
-            <w:tcW w:type="dxa" w:w="576"/>
-            <w:shd w:val="clear" w:color="auto" w:fill="F2F2F2"/>
-          </w:tcPr>
-          <w:p>
-            <w:r/>
-            <w:r>
-              <w:rPr>
-                <w:rFonts w:ascii="Calibri" w:hAnsi="Calibri"/>
-                <w:b w:val="0"/>
-                <w:i w:val="0"/>
-                <w:sz w:val="18"/>
-              </w:rPr>
-              <w:t>P3</w:t>
-            </w:r>
-          </w:p>
-        </w:tc>
-        <w:tc>
-          <w:tcPr>
-            <w:tcW w:type="dxa" w:w="1440"/>
-            <w:shd w:val="clear" w:color="auto" w:fill="F2F2F2"/>
-          </w:tcPr>
-          <w:p>
-            <w:r/>
-            <w:r>
-              <w:rPr>
-                <w:rFonts w:ascii="Calibri" w:hAnsi="Calibri"/>
-                <w:b w:val="0"/>
-                <w:i w:val="0"/>
-                <w:sz w:val="18"/>
-              </w:rPr>
-              <w:t>Awaiting Deployment</w:t>
-            </w:r>
-          </w:p>
-        </w:tc>
-        <w:tc>
-          <w:tcPr>
-            <w:tcW w:type="dxa" w:w="1008"/>
-            <w:shd w:val="clear" w:color="auto" w:fill="F2F2F2"/>
-          </w:tcPr>
-          <w:p>
-            <w:r/>
-            <w:r>
-              <w:rPr>
-                <w:rFonts w:ascii="Calibri" w:hAnsi="Calibri"/>
-                <w:b w:val="0"/>
-                <w:i w:val="0"/>
-                <w:sz w:val="18"/>
-              </w:rPr>
-              <w:t>Bug</w:t>
+              <w:t>Incident</w:t>
             </w:r>
           </w:p>
         </w:tc>
@@ -5288,7 +4756,7 @@
             <w:r>
               <w:drawing>
                 <wp:inline xmlns:a="http://schemas.openxmlformats.org/drawingml/2006/main" xmlns:pic="http://schemas.openxmlformats.org/drawingml/2006/picture">
-                  <wp:extent cx="3017520" cy="2024915"/>
+                  <wp:extent cx="3017520" cy="2618226"/>
                   <wp:docPr id="7" name="Picture 7"/>
                   <wp:cNvGraphicFramePr>
                     <a:graphicFrameLocks noChangeAspect="1"/>
@@ -5309,7 +4777,7 @@
                         <pic:spPr>
                           <a:xfrm>
                             <a:off x="0" y="0"/>
-                            <a:ext cx="3017520" cy="2024915"/>
+                            <a:ext cx="3017520" cy="2618226"/>
                           </a:xfrm>
                           <a:prstGeom prst="rect"/>
                         </pic:spPr>

</xml_diff>

<commit_message>
Single-page report: Pendo split EU/USEast, ADO shown once
Remove the two-page EU/USEast structure. The document now has one page with
Pendo engagement sections for EU and USEast side-by-side, and a single ADO
incidents table below — no duplication of work items per region.
</commit_message>
<xml_diff>
--- a/Blackstone_Scrum_20260618.docx
+++ b/Blackstone_Scrum_20260618.docx
@@ -15,7 +15,7 @@
           <w:color w:val="1F2937"/>
           <w:sz w:val="32"/>
         </w:rPr>
-        <w:t>Blackstone — daily scrum update  US East</w:t>
+        <w:t>Blackstone — daily scrum update</w:t>
       </w:r>
     </w:p>
     <w:p>
@@ -31,7 +31,7 @@
           <w:color w:val="757575"/>
           <w:sz w:val="18"/>
         </w:rPr>
-        <w:t>Thursday, June 18, 2026   ·   Report generated 1:31 PM IST</w:t>
+        <w:t>Thursday, June 18, 2026   ·   Report generated 2:00 PM IST</w:t>
       </w:r>
     </w:p>
     <w:p>
@@ -238,7 +238,7 @@
           <w:color w:val="1F2937"/>
           <w:sz w:val="24"/>
         </w:rPr>
-        <w:t>Platform performance — US East   (N-2 metric)</w:t>
+        <w:t>Platform performance  (N-2 metric)</w:t>
       </w:r>
     </w:p>
     <w:tbl>
@@ -798,7 +798,936 @@
           <w:color w:val="1F2937"/>
           <w:sz w:val="24"/>
         </w:rPr>
-        <w:t>Pendo engagement — Blackstone segment  ·  last 3 days (16 Jun – 18 Jun)</w:t>
+        <w:t>Pendo engagement — EU (portal.corestack.io)  ·  last 3 days (16 Jun – 18 Jun)</w:t>
+      </w:r>
+    </w:p>
+    <w:p>
+      <w:pPr>
+        <w:spacing w:before="0" w:after="80"/>
+        <w:jc w:val="left"/>
+      </w:pPr>
+      <w:r>
+        <w:rPr>
+          <w:rFonts w:ascii="Calibri" w:hAnsi="Calibri"/>
+          <w:b w:val="0"/>
+          <w:i/>
+          <w:color w:val="757575"/>
+          <w:sz w:val="16"/>
+        </w:rPr>
+        <w:t>Source: Blackstone Pendo segment only.  cs.support.blackstone@corestack.io excluded.  Grey rows = segment members with no activity in this window.</w:t>
+      </w:r>
+    </w:p>
+    <w:tbl>
+      <w:tblPr>
+        <w:tblStyle w:val="TableGrid"/>
+        <w:tblW w:type="auto" w:w="0"/>
+        <w:jc w:val="left"/>
+        <w:tblLook w:firstColumn="1" w:firstRow="1" w:lastColumn="0" w:lastRow="0" w:noHBand="0" w:noVBand="1" w:val="04A0"/>
+      </w:tblPr>
+      <w:tblGrid>
+        <w:gridCol w:w="1700"/>
+        <w:gridCol w:w="1700"/>
+        <w:gridCol w:w="1700"/>
+        <w:gridCol w:w="1700"/>
+        <w:gridCol w:w="1700"/>
+        <w:gridCol w:w="1700"/>
+      </w:tblGrid>
+      <w:tr>
+        <w:tc>
+          <w:tcPr>
+            <w:tcW w:type="dxa" w:w="2592"/>
+            <w:shd w:val="clear" w:color="auto" w:fill="1F2937"/>
+            <w:vAlign w:val="center"/>
+          </w:tcPr>
+          <w:p>
+            <w:r/>
+            <w:r>
+              <w:rPr>
+                <w:rFonts w:ascii="Calibri" w:hAnsi="Calibri"/>
+                <w:b/>
+                <w:i w:val="0"/>
+                <w:color w:val="FFFFFF"/>
+                <w:sz w:val="18"/>
+              </w:rPr>
+              <w:t>Visitor</w:t>
+            </w:r>
+          </w:p>
+        </w:tc>
+        <w:tc>
+          <w:tcPr>
+            <w:tcW w:type="dxa" w:w="2592"/>
+            <w:shd w:val="clear" w:color="auto" w:fill="1F2937"/>
+            <w:vAlign w:val="center"/>
+          </w:tcPr>
+          <w:p>
+            <w:r/>
+            <w:r>
+              <w:rPr>
+                <w:rFonts w:ascii="Calibri" w:hAnsi="Calibri"/>
+                <w:b/>
+                <w:i w:val="0"/>
+                <w:color w:val="FFFFFF"/>
+                <w:sz w:val="18"/>
+              </w:rPr>
+              <w:t>Domain</w:t>
+            </w:r>
+          </w:p>
+        </w:tc>
+        <w:tc>
+          <w:tcPr>
+            <w:tcW w:type="dxa" w:w="1440"/>
+            <w:shd w:val="clear" w:color="auto" w:fill="1F2937"/>
+            <w:vAlign w:val="center"/>
+          </w:tcPr>
+          <w:p>
+            <w:r/>
+            <w:r>
+              <w:rPr>
+                <w:rFonts w:ascii="Calibri" w:hAnsi="Calibri"/>
+                <w:b/>
+                <w:i w:val="0"/>
+                <w:color w:val="FFFFFF"/>
+                <w:sz w:val="18"/>
+              </w:rPr>
+              <w:t>Events (3d)</w:t>
+            </w:r>
+          </w:p>
+        </w:tc>
+        <w:tc>
+          <w:tcPr>
+            <w:tcW w:type="dxa" w:w="1440"/>
+            <w:shd w:val="clear" w:color="auto" w:fill="1F2937"/>
+            <w:vAlign w:val="center"/>
+          </w:tcPr>
+          <w:p>
+            <w:r/>
+            <w:r>
+              <w:rPr>
+                <w:rFonts w:ascii="Calibri" w:hAnsi="Calibri"/>
+                <w:b/>
+                <w:i w:val="0"/>
+                <w:color w:val="FFFFFF"/>
+                <w:sz w:val="18"/>
+              </w:rPr>
+              <w:t>Days active</w:t>
+            </w:r>
+          </w:p>
+        </w:tc>
+        <w:tc>
+          <w:tcPr>
+            <w:tcW w:type="dxa" w:w="1296"/>
+            <w:shd w:val="clear" w:color="auto" w:fill="1F2937"/>
+            <w:vAlign w:val="center"/>
+          </w:tcPr>
+          <w:p>
+            <w:r/>
+            <w:r>
+              <w:rPr>
+                <w:rFonts w:ascii="Calibri" w:hAnsi="Calibri"/>
+                <w:b/>
+                <w:i w:val="0"/>
+                <w:color w:val="FFFFFF"/>
+                <w:sz w:val="18"/>
+              </w:rPr>
+              <w:t>Minutes</w:t>
+            </w:r>
+          </w:p>
+        </w:tc>
+        <w:tc>
+          <w:tcPr>
+            <w:tcW w:type="dxa" w:w="1296"/>
+            <w:shd w:val="clear" w:color="auto" w:fill="1F2937"/>
+            <w:vAlign w:val="center"/>
+          </w:tcPr>
+          <w:p>
+            <w:r/>
+            <w:r>
+              <w:rPr>
+                <w:rFonts w:ascii="Calibri" w:hAnsi="Calibri"/>
+                <w:b/>
+                <w:i w:val="0"/>
+                <w:color w:val="FFFFFF"/>
+                <w:sz w:val="18"/>
+              </w:rPr>
+              <w:t>Last seen</w:t>
+            </w:r>
+          </w:p>
+        </w:tc>
+      </w:tr>
+      <w:tr>
+        <w:tc>
+          <w:tcPr>
+            <w:tcW w:type="dxa" w:w="2592"/>
+            <w:shd w:val="clear" w:color="auto" w:fill="F2F2F2"/>
+          </w:tcPr>
+          <w:p>
+            <w:r/>
+            <w:r>
+              <w:rPr>
+                <w:rFonts w:ascii="Calibri" w:hAnsi="Calibri"/>
+                <w:b w:val="0"/>
+                <w:i w:val="0"/>
+                <w:sz w:val="18"/>
+              </w:rPr>
+              <w:t>timo pantsari</w:t>
+            </w:r>
+          </w:p>
+        </w:tc>
+        <w:tc>
+          <w:tcPr>
+            <w:tcW w:type="dxa" w:w="2592"/>
+            <w:shd w:val="clear" w:color="auto" w:fill="F2F2F2"/>
+          </w:tcPr>
+          <w:p>
+            <w:r/>
+            <w:r>
+              <w:rPr>
+                <w:rFonts w:ascii="Calibri" w:hAnsi="Calibri"/>
+                <w:b w:val="0"/>
+                <w:i w:val="0"/>
+                <w:sz w:val="18"/>
+              </w:rPr>
+              <w:t>blackstone.com</w:t>
+            </w:r>
+          </w:p>
+        </w:tc>
+        <w:tc>
+          <w:tcPr>
+            <w:tcW w:type="dxa" w:w="1440"/>
+            <w:shd w:val="clear" w:color="auto" w:fill="F2F2F2"/>
+          </w:tcPr>
+          <w:p>
+            <w:r/>
+            <w:r>
+              <w:rPr>
+                <w:rFonts w:ascii="Calibri" w:hAnsi="Calibri"/>
+                <w:b w:val="0"/>
+                <w:i w:val="0"/>
+                <w:sz w:val="18"/>
+              </w:rPr>
+              <w:t>—</w:t>
+            </w:r>
+          </w:p>
+        </w:tc>
+        <w:tc>
+          <w:tcPr>
+            <w:tcW w:type="dxa" w:w="1440"/>
+            <w:shd w:val="clear" w:color="auto" w:fill="F2F2F2"/>
+          </w:tcPr>
+          <w:p>
+            <w:r/>
+            <w:r>
+              <w:rPr>
+                <w:rFonts w:ascii="Calibri" w:hAnsi="Calibri"/>
+                <w:b w:val="0"/>
+                <w:i w:val="0"/>
+                <w:sz w:val="18"/>
+              </w:rPr>
+              <w:t>—</w:t>
+            </w:r>
+          </w:p>
+        </w:tc>
+        <w:tc>
+          <w:tcPr>
+            <w:tcW w:type="dxa" w:w="1296"/>
+            <w:shd w:val="clear" w:color="auto" w:fill="F2F2F2"/>
+          </w:tcPr>
+          <w:p>
+            <w:r/>
+            <w:r>
+              <w:rPr>
+                <w:rFonts w:ascii="Calibri" w:hAnsi="Calibri"/>
+                <w:b w:val="0"/>
+                <w:i w:val="0"/>
+                <w:sz w:val="18"/>
+              </w:rPr>
+              <w:t>—</w:t>
+            </w:r>
+          </w:p>
+        </w:tc>
+        <w:tc>
+          <w:tcPr>
+            <w:tcW w:type="dxa" w:w="1296"/>
+            <w:shd w:val="clear" w:color="auto" w:fill="F2F2F2"/>
+          </w:tcPr>
+          <w:p>
+            <w:r/>
+            <w:r>
+              <w:rPr>
+                <w:rFonts w:ascii="Calibri" w:hAnsi="Calibri"/>
+                <w:b w:val="0"/>
+                <w:i w:val="0"/>
+                <w:sz w:val="18"/>
+              </w:rPr>
+              <w:t>15 Jun</w:t>
+            </w:r>
+          </w:p>
+        </w:tc>
+      </w:tr>
+      <w:tr>
+        <w:tc>
+          <w:tcPr>
+            <w:tcW w:type="dxa" w:w="2592"/>
+            <w:shd w:val="clear" w:color="auto" w:fill="FFFFFF"/>
+          </w:tcPr>
+          <w:p>
+            <w:r/>
+            <w:r>
+              <w:rPr>
+                <w:rFonts w:ascii="Calibri" w:hAnsi="Calibri"/>
+                <w:b w:val="0"/>
+                <w:i w:val="0"/>
+                <w:sz w:val="18"/>
+              </w:rPr>
+              <w:t>alex</w:t>
+            </w:r>
+          </w:p>
+        </w:tc>
+        <w:tc>
+          <w:tcPr>
+            <w:tcW w:type="dxa" w:w="2592"/>
+            <w:shd w:val="clear" w:color="auto" w:fill="FFFFFF"/>
+          </w:tcPr>
+          <w:p>
+            <w:r/>
+            <w:r>
+              <w:rPr>
+                <w:rFonts w:ascii="Calibri" w:hAnsi="Calibri"/>
+                <w:b w:val="0"/>
+                <w:i w:val="0"/>
+                <w:sz w:val="18"/>
+              </w:rPr>
+              <w:t>aliando.com</w:t>
+            </w:r>
+          </w:p>
+        </w:tc>
+        <w:tc>
+          <w:tcPr>
+            <w:tcW w:type="dxa" w:w="1440"/>
+            <w:shd w:val="clear" w:color="auto" w:fill="FFFFFF"/>
+          </w:tcPr>
+          <w:p>
+            <w:r/>
+            <w:r>
+              <w:rPr>
+                <w:rFonts w:ascii="Calibri" w:hAnsi="Calibri"/>
+                <w:b w:val="0"/>
+                <w:i w:val="0"/>
+                <w:sz w:val="18"/>
+              </w:rPr>
+              <w:t>—</w:t>
+            </w:r>
+          </w:p>
+        </w:tc>
+        <w:tc>
+          <w:tcPr>
+            <w:tcW w:type="dxa" w:w="1440"/>
+            <w:shd w:val="clear" w:color="auto" w:fill="FFFFFF"/>
+          </w:tcPr>
+          <w:p>
+            <w:r/>
+            <w:r>
+              <w:rPr>
+                <w:rFonts w:ascii="Calibri" w:hAnsi="Calibri"/>
+                <w:b w:val="0"/>
+                <w:i w:val="0"/>
+                <w:sz w:val="18"/>
+              </w:rPr>
+              <w:t>—</w:t>
+            </w:r>
+          </w:p>
+        </w:tc>
+        <w:tc>
+          <w:tcPr>
+            <w:tcW w:type="dxa" w:w="1296"/>
+            <w:shd w:val="clear" w:color="auto" w:fill="FFFFFF"/>
+          </w:tcPr>
+          <w:p>
+            <w:r/>
+            <w:r>
+              <w:rPr>
+                <w:rFonts w:ascii="Calibri" w:hAnsi="Calibri"/>
+                <w:b w:val="0"/>
+                <w:i w:val="0"/>
+                <w:sz w:val="18"/>
+              </w:rPr>
+              <w:t>—</w:t>
+            </w:r>
+          </w:p>
+        </w:tc>
+        <w:tc>
+          <w:tcPr>
+            <w:tcW w:type="dxa" w:w="1296"/>
+            <w:shd w:val="clear" w:color="auto" w:fill="FFFFFF"/>
+          </w:tcPr>
+          <w:p>
+            <w:r/>
+            <w:r>
+              <w:rPr>
+                <w:rFonts w:ascii="Calibri" w:hAnsi="Calibri"/>
+                <w:b w:val="0"/>
+                <w:i w:val="0"/>
+                <w:sz w:val="18"/>
+              </w:rPr>
+              <w:t>1 Jun</w:t>
+            </w:r>
+          </w:p>
+        </w:tc>
+      </w:tr>
+      <w:tr>
+        <w:tc>
+          <w:tcPr>
+            <w:tcW w:type="dxa" w:w="2592"/>
+            <w:shd w:val="clear" w:color="auto" w:fill="F2F2F2"/>
+          </w:tcPr>
+          <w:p>
+            <w:r/>
+            <w:r>
+              <w:rPr>
+                <w:rFonts w:ascii="Calibri" w:hAnsi="Calibri"/>
+                <w:b w:val="0"/>
+                <w:i w:val="0"/>
+                <w:sz w:val="18"/>
+              </w:rPr>
+              <w:t>dipali koche</w:t>
+            </w:r>
+          </w:p>
+        </w:tc>
+        <w:tc>
+          <w:tcPr>
+            <w:tcW w:type="dxa" w:w="2592"/>
+            <w:shd w:val="clear" w:color="auto" w:fill="F2F2F2"/>
+          </w:tcPr>
+          <w:p>
+            <w:r/>
+            <w:r>
+              <w:rPr>
+                <w:rFonts w:ascii="Calibri" w:hAnsi="Calibri"/>
+                <w:b w:val="0"/>
+                <w:i w:val="0"/>
+                <w:sz w:val="18"/>
+              </w:rPr>
+              <w:t>bluemantis.com</w:t>
+            </w:r>
+          </w:p>
+        </w:tc>
+        <w:tc>
+          <w:tcPr>
+            <w:tcW w:type="dxa" w:w="1440"/>
+            <w:shd w:val="clear" w:color="auto" w:fill="F2F2F2"/>
+          </w:tcPr>
+          <w:p>
+            <w:r/>
+            <w:r>
+              <w:rPr>
+                <w:rFonts w:ascii="Calibri" w:hAnsi="Calibri"/>
+                <w:b w:val="0"/>
+                <w:i w:val="0"/>
+                <w:sz w:val="18"/>
+              </w:rPr>
+              <w:t>—</w:t>
+            </w:r>
+          </w:p>
+        </w:tc>
+        <w:tc>
+          <w:tcPr>
+            <w:tcW w:type="dxa" w:w="1440"/>
+            <w:shd w:val="clear" w:color="auto" w:fill="F2F2F2"/>
+          </w:tcPr>
+          <w:p>
+            <w:r/>
+            <w:r>
+              <w:rPr>
+                <w:rFonts w:ascii="Calibri" w:hAnsi="Calibri"/>
+                <w:b w:val="0"/>
+                <w:i w:val="0"/>
+                <w:sz w:val="18"/>
+              </w:rPr>
+              <w:t>—</w:t>
+            </w:r>
+          </w:p>
+        </w:tc>
+        <w:tc>
+          <w:tcPr>
+            <w:tcW w:type="dxa" w:w="1296"/>
+            <w:shd w:val="clear" w:color="auto" w:fill="F2F2F2"/>
+          </w:tcPr>
+          <w:p>
+            <w:r/>
+            <w:r>
+              <w:rPr>
+                <w:rFonts w:ascii="Calibri" w:hAnsi="Calibri"/>
+                <w:b w:val="0"/>
+                <w:i w:val="0"/>
+                <w:sz w:val="18"/>
+              </w:rPr>
+              <w:t>—</w:t>
+            </w:r>
+          </w:p>
+        </w:tc>
+        <w:tc>
+          <w:tcPr>
+            <w:tcW w:type="dxa" w:w="1296"/>
+            <w:shd w:val="clear" w:color="auto" w:fill="F2F2F2"/>
+          </w:tcPr>
+          <w:p>
+            <w:r/>
+            <w:r>
+              <w:rPr>
+                <w:rFonts w:ascii="Calibri" w:hAnsi="Calibri"/>
+                <w:b w:val="0"/>
+                <w:i w:val="0"/>
+                <w:sz w:val="18"/>
+              </w:rPr>
+              <w:t>1 Jun</w:t>
+            </w:r>
+          </w:p>
+        </w:tc>
+      </w:tr>
+      <w:tr>
+        <w:tc>
+          <w:tcPr>
+            <w:tcW w:type="dxa" w:w="2592"/>
+            <w:shd w:val="clear" w:color="auto" w:fill="FFFFFF"/>
+          </w:tcPr>
+          <w:p>
+            <w:r/>
+            <w:r>
+              <w:rPr>
+                <w:rFonts w:ascii="Calibri" w:hAnsi="Calibri"/>
+                <w:b w:val="0"/>
+                <w:i w:val="0"/>
+                <w:sz w:val="18"/>
+              </w:rPr>
+              <w:t>chris</w:t>
+            </w:r>
+          </w:p>
+        </w:tc>
+        <w:tc>
+          <w:tcPr>
+            <w:tcW w:type="dxa" w:w="2592"/>
+            <w:shd w:val="clear" w:color="auto" w:fill="FFFFFF"/>
+          </w:tcPr>
+          <w:p>
+            <w:r/>
+            <w:r>
+              <w:rPr>
+                <w:rFonts w:ascii="Calibri" w:hAnsi="Calibri"/>
+                <w:b w:val="0"/>
+                <w:i w:val="0"/>
+                <w:sz w:val="18"/>
+              </w:rPr>
+              <w:t>aliando.com</w:t>
+            </w:r>
+          </w:p>
+        </w:tc>
+        <w:tc>
+          <w:tcPr>
+            <w:tcW w:type="dxa" w:w="1440"/>
+            <w:shd w:val="clear" w:color="auto" w:fill="FFFFFF"/>
+          </w:tcPr>
+          <w:p>
+            <w:r/>
+            <w:r>
+              <w:rPr>
+                <w:rFonts w:ascii="Calibri" w:hAnsi="Calibri"/>
+                <w:b w:val="0"/>
+                <w:i w:val="0"/>
+                <w:sz w:val="18"/>
+              </w:rPr>
+              <w:t>—</w:t>
+            </w:r>
+          </w:p>
+        </w:tc>
+        <w:tc>
+          <w:tcPr>
+            <w:tcW w:type="dxa" w:w="1440"/>
+            <w:shd w:val="clear" w:color="auto" w:fill="FFFFFF"/>
+          </w:tcPr>
+          <w:p>
+            <w:r/>
+            <w:r>
+              <w:rPr>
+                <w:rFonts w:ascii="Calibri" w:hAnsi="Calibri"/>
+                <w:b w:val="0"/>
+                <w:i w:val="0"/>
+                <w:sz w:val="18"/>
+              </w:rPr>
+              <w:t>—</w:t>
+            </w:r>
+          </w:p>
+        </w:tc>
+        <w:tc>
+          <w:tcPr>
+            <w:tcW w:type="dxa" w:w="1296"/>
+            <w:shd w:val="clear" w:color="auto" w:fill="FFFFFF"/>
+          </w:tcPr>
+          <w:p>
+            <w:r/>
+            <w:r>
+              <w:rPr>
+                <w:rFonts w:ascii="Calibri" w:hAnsi="Calibri"/>
+                <w:b w:val="0"/>
+                <w:i w:val="0"/>
+                <w:sz w:val="18"/>
+              </w:rPr>
+              <w:t>—</w:t>
+            </w:r>
+          </w:p>
+        </w:tc>
+        <w:tc>
+          <w:tcPr>
+            <w:tcW w:type="dxa" w:w="1296"/>
+            <w:shd w:val="clear" w:color="auto" w:fill="FFFFFF"/>
+          </w:tcPr>
+          <w:p>
+            <w:r/>
+            <w:r>
+              <w:rPr>
+                <w:rFonts w:ascii="Calibri" w:hAnsi="Calibri"/>
+                <w:b w:val="0"/>
+                <w:i w:val="0"/>
+                <w:sz w:val="18"/>
+              </w:rPr>
+              <w:t>4 Jun</w:t>
+            </w:r>
+          </w:p>
+        </w:tc>
+      </w:tr>
+      <w:tr>
+        <w:tc>
+          <w:tcPr>
+            <w:tcW w:type="dxa" w:w="2592"/>
+            <w:shd w:val="clear" w:color="auto" w:fill="F2F2F2"/>
+          </w:tcPr>
+          <w:p>
+            <w:r/>
+            <w:r>
+              <w:rPr>
+                <w:rFonts w:ascii="Calibri" w:hAnsi="Calibri"/>
+                <w:b w:val="0"/>
+                <w:i w:val="0"/>
+                <w:sz w:val="18"/>
+              </w:rPr>
+              <w:t>dene donovan</w:t>
+            </w:r>
+          </w:p>
+        </w:tc>
+        <w:tc>
+          <w:tcPr>
+            <w:tcW w:type="dxa" w:w="2592"/>
+            <w:shd w:val="clear" w:color="auto" w:fill="F2F2F2"/>
+          </w:tcPr>
+          <w:p>
+            <w:r/>
+            <w:r>
+              <w:rPr>
+                <w:rFonts w:ascii="Calibri" w:hAnsi="Calibri"/>
+                <w:b w:val="0"/>
+                <w:i w:val="0"/>
+                <w:sz w:val="18"/>
+              </w:rPr>
+              <w:t>ingrammicro.com</w:t>
+            </w:r>
+          </w:p>
+        </w:tc>
+        <w:tc>
+          <w:tcPr>
+            <w:tcW w:type="dxa" w:w="1440"/>
+            <w:shd w:val="clear" w:color="auto" w:fill="F2F2F2"/>
+          </w:tcPr>
+          <w:p>
+            <w:r/>
+            <w:r>
+              <w:rPr>
+                <w:rFonts w:ascii="Calibri" w:hAnsi="Calibri"/>
+                <w:b w:val="0"/>
+                <w:i w:val="0"/>
+                <w:sz w:val="18"/>
+              </w:rPr>
+              <w:t>—</w:t>
+            </w:r>
+          </w:p>
+        </w:tc>
+        <w:tc>
+          <w:tcPr>
+            <w:tcW w:type="dxa" w:w="1440"/>
+            <w:shd w:val="clear" w:color="auto" w:fill="F2F2F2"/>
+          </w:tcPr>
+          <w:p>
+            <w:r/>
+            <w:r>
+              <w:rPr>
+                <w:rFonts w:ascii="Calibri" w:hAnsi="Calibri"/>
+                <w:b w:val="0"/>
+                <w:i w:val="0"/>
+                <w:sz w:val="18"/>
+              </w:rPr>
+              <w:t>—</w:t>
+            </w:r>
+          </w:p>
+        </w:tc>
+        <w:tc>
+          <w:tcPr>
+            <w:tcW w:type="dxa" w:w="1296"/>
+            <w:shd w:val="clear" w:color="auto" w:fill="F2F2F2"/>
+          </w:tcPr>
+          <w:p>
+            <w:r/>
+            <w:r>
+              <w:rPr>
+                <w:rFonts w:ascii="Calibri" w:hAnsi="Calibri"/>
+                <w:b w:val="0"/>
+                <w:i w:val="0"/>
+                <w:sz w:val="18"/>
+              </w:rPr>
+              <w:t>—</w:t>
+            </w:r>
+          </w:p>
+        </w:tc>
+        <w:tc>
+          <w:tcPr>
+            <w:tcW w:type="dxa" w:w="1296"/>
+            <w:shd w:val="clear" w:color="auto" w:fill="F2F2F2"/>
+          </w:tcPr>
+          <w:p>
+            <w:r/>
+            <w:r>
+              <w:rPr>
+                <w:rFonts w:ascii="Calibri" w:hAnsi="Calibri"/>
+                <w:b w:val="0"/>
+                <w:i w:val="0"/>
+                <w:sz w:val="18"/>
+              </w:rPr>
+              <w:t>9 Jun</w:t>
+            </w:r>
+          </w:p>
+        </w:tc>
+      </w:tr>
+    </w:tbl>
+    <w:p/>
+    <w:tbl>
+      <w:tblPr>
+        <w:tblStyle w:val="TableGrid"/>
+        <w:tblW w:type="auto" w:w="0"/>
+        <w:jc w:val="left"/>
+        <w:tblLook w:firstColumn="1" w:firstRow="1" w:lastColumn="0" w:lastRow="0" w:noHBand="0" w:noVBand="1" w:val="04A0"/>
+      </w:tblPr>
+      <w:tblGrid>
+        <w:gridCol w:w="5100"/>
+        <w:gridCol w:w="5100"/>
+      </w:tblGrid>
+      <w:tr>
+        <w:tc>
+          <w:tcPr>
+            <w:tcW w:type="dxa" w:w="4896"/>
+            <w:shd w:val="clear" w:color="auto" w:fill="FFFFFF"/>
+          </w:tcPr>
+          <w:p>
+            <w:r>
+              <w:drawing>
+                <wp:inline xmlns:a="http://schemas.openxmlformats.org/drawingml/2006/main" xmlns:pic="http://schemas.openxmlformats.org/drawingml/2006/picture">
+                  <wp:extent cx="3017520" cy="1002548"/>
+                  <wp:docPr id="1" name="Picture 1"/>
+                  <wp:cNvGraphicFramePr>
+                    <a:graphicFrameLocks noChangeAspect="1"/>
+                  </wp:cNvGraphicFramePr>
+                  <a:graphic>
+                    <a:graphicData uri="http://schemas.openxmlformats.org/drawingml/2006/picture">
+                      <pic:pic>
+                        <pic:nvPicPr>
+                          <pic:cNvPr id="0" name="image.png"/>
+                          <pic:cNvPicPr/>
+                        </pic:nvPicPr>
+                        <pic:blipFill>
+                          <a:blip r:embed="rId9"/>
+                          <a:stretch>
+                            <a:fillRect/>
+                          </a:stretch>
+                        </pic:blipFill>
+                        <pic:spPr>
+                          <a:xfrm>
+                            <a:off x="0" y="0"/>
+                            <a:ext cx="3017520" cy="1002548"/>
+                          </a:xfrm>
+                          <a:prstGeom prst="rect"/>
+                        </pic:spPr>
+                      </pic:pic>
+                    </a:graphicData>
+                  </a:graphic>
+                </wp:inline>
+              </w:drawing>
+            </w:r>
+          </w:p>
+        </w:tc>
+        <w:tc>
+          <w:tcPr>
+            <w:tcW w:type="dxa" w:w="4896"/>
+            <w:shd w:val="clear" w:color="auto" w:fill="FFFFFF"/>
+          </w:tcPr>
+          <w:p>
+            <w:r>
+              <w:drawing>
+                <wp:inline xmlns:a="http://schemas.openxmlformats.org/drawingml/2006/main" xmlns:pic="http://schemas.openxmlformats.org/drawingml/2006/picture">
+                  <wp:extent cx="3017520" cy="1225441"/>
+                  <wp:docPr id="2" name="Picture 2"/>
+                  <wp:cNvGraphicFramePr>
+                    <a:graphicFrameLocks noChangeAspect="1"/>
+                  </wp:cNvGraphicFramePr>
+                  <a:graphic>
+                    <a:graphicData uri="http://schemas.openxmlformats.org/drawingml/2006/picture">
+                      <pic:pic>
+                        <pic:nvPicPr>
+                          <pic:cNvPr id="0" name="image.png"/>
+                          <pic:cNvPicPr/>
+                        </pic:nvPicPr>
+                        <pic:blipFill>
+                          <a:blip r:embed="rId10"/>
+                          <a:stretch>
+                            <a:fillRect/>
+                          </a:stretch>
+                        </pic:blipFill>
+                        <pic:spPr>
+                          <a:xfrm>
+                            <a:off x="0" y="0"/>
+                            <a:ext cx="3017520" cy="1225441"/>
+                          </a:xfrm>
+                          <a:prstGeom prst="rect"/>
+                        </pic:spPr>
+                      </pic:pic>
+                    </a:graphicData>
+                  </a:graphic>
+                </wp:inline>
+              </w:drawing>
+            </w:r>
+          </w:p>
+        </w:tc>
+      </w:tr>
+    </w:tbl>
+    <w:p/>
+    <w:p>
+      <w:pPr>
+        <w:spacing w:before="200" w:after="40"/>
+        <w:jc w:val="left"/>
+      </w:pPr>
+      <w:r>
+        <w:rPr>
+          <w:rFonts w:ascii="Calibri" w:hAnsi="Calibri"/>
+          <w:b/>
+          <w:i w:val="0"/>
+          <w:color w:val="1F2937"/>
+          <w:sz w:val="20"/>
+        </w:rPr>
+        <w:t>Top pages — EU (portal.corestack.io)</w:t>
+      </w:r>
+    </w:p>
+    <w:tbl>
+      <w:tblPr>
+        <w:tblStyle w:val="TableGrid"/>
+        <w:tblW w:type="auto" w:w="0"/>
+        <w:jc w:val="left"/>
+        <w:tblLook w:firstColumn="1" w:firstRow="1" w:lastColumn="0" w:lastRow="0" w:noHBand="0" w:noVBand="1" w:val="04A0"/>
+      </w:tblPr>
+      <w:tblGrid>
+        <w:gridCol w:w="5100"/>
+        <w:gridCol w:w="5100"/>
+      </w:tblGrid>
+      <w:tr>
+        <w:tc>
+          <w:tcPr>
+            <w:tcW w:type="dxa" w:w="6480"/>
+            <w:shd w:val="clear" w:color="auto" w:fill="1F2937"/>
+            <w:vAlign w:val="center"/>
+          </w:tcPr>
+          <w:p>
+            <w:r/>
+            <w:r>
+              <w:rPr>
+                <w:rFonts w:ascii="Calibri" w:hAnsi="Calibri"/>
+                <w:b/>
+                <w:i w:val="0"/>
+                <w:color w:val="FFFFFF"/>
+                <w:sz w:val="18"/>
+              </w:rPr>
+              <w:t>Page</w:t>
+            </w:r>
+          </w:p>
+        </w:tc>
+        <w:tc>
+          <w:tcPr>
+            <w:tcW w:type="dxa" w:w="1152"/>
+            <w:shd w:val="clear" w:color="auto" w:fill="1F2937"/>
+            <w:vAlign w:val="center"/>
+          </w:tcPr>
+          <w:p>
+            <w:r/>
+            <w:r>
+              <w:rPr>
+                <w:rFonts w:ascii="Calibri" w:hAnsi="Calibri"/>
+                <w:b/>
+                <w:i w:val="0"/>
+                <w:color w:val="FFFFFF"/>
+                <w:sz w:val="18"/>
+              </w:rPr>
+              <w:t>Views</w:t>
+            </w:r>
+          </w:p>
+        </w:tc>
+      </w:tr>
+      <w:tr>
+        <w:tc>
+          <w:tcPr>
+            <w:tcW w:type="dxa" w:w="6480"/>
+            <w:shd w:val="clear" w:color="auto" w:fill="F2F2F2"/>
+          </w:tcPr>
+          <w:p>
+            <w:r/>
+            <w:r>
+              <w:rPr>
+                <w:rFonts w:ascii="Calibri" w:hAnsi="Calibri"/>
+                <w:b w:val="0"/>
+                <w:i w:val="0"/>
+                <w:sz w:val="18"/>
+              </w:rPr>
+              <w:t>—</w:t>
+            </w:r>
+          </w:p>
+        </w:tc>
+        <w:tc>
+          <w:tcPr>
+            <w:tcW w:type="dxa" w:w="1152"/>
+            <w:shd w:val="clear" w:color="auto" w:fill="F2F2F2"/>
+          </w:tcPr>
+          <w:p>
+            <w:r/>
+            <w:r>
+              <w:rPr>
+                <w:rFonts w:ascii="Calibri" w:hAnsi="Calibri"/>
+                <w:b w:val="0"/>
+                <w:i w:val="0"/>
+                <w:sz w:val="18"/>
+              </w:rPr>
+              <w:t>—</w:t>
+            </w:r>
+          </w:p>
+        </w:tc>
+      </w:tr>
+    </w:tbl>
+    <w:p/>
+    <w:p>
+      <w:pPr>
+        <w:spacing w:before="200" w:after="40"/>
+        <w:jc w:val="left"/>
+      </w:pPr>
+      <w:r>
+        <w:rPr>
+          <w:rFonts w:ascii="Calibri" w:hAnsi="Calibri"/>
+          <w:b/>
+          <w:i w:val="0"/>
+          <w:color w:val="1F2937"/>
+          <w:sz w:val="24"/>
+        </w:rPr>
+        <w:t>Pendo engagement — USEast (useast.corestack.io)  ·  last 3 days (16 Jun – 18 Jun)</w:t>
       </w:r>
     </w:p>
     <w:p>
@@ -1638,7 +2567,7 @@
               <w:drawing>
                 <wp:inline xmlns:a="http://schemas.openxmlformats.org/drawingml/2006/main" xmlns:pic="http://schemas.openxmlformats.org/drawingml/2006/picture">
                   <wp:extent cx="3017520" cy="2387148"/>
-                  <wp:docPr id="1" name="Picture 1"/>
+                  <wp:docPr id="3" name="Picture 3"/>
                   <wp:cNvGraphicFramePr>
                     <a:graphicFrameLocks noChangeAspect="1"/>
                   </wp:cNvGraphicFramePr>
@@ -1650,7 +2579,7 @@
                           <pic:cNvPicPr/>
                         </pic:nvPicPr>
                         <pic:blipFill>
-                          <a:blip r:embed="rId9"/>
+                          <a:blip r:embed="rId11"/>
                           <a:stretch>
                             <a:fillRect/>
                           </a:stretch>
@@ -1680,7 +2609,7 @@
               <w:drawing>
                 <wp:inline xmlns:a="http://schemas.openxmlformats.org/drawingml/2006/main" xmlns:pic="http://schemas.openxmlformats.org/drawingml/2006/picture">
                   <wp:extent cx="3017520" cy="1225441"/>
-                  <wp:docPr id="2" name="Picture 2"/>
+                  <wp:docPr id="4" name="Picture 4"/>
                   <wp:cNvGraphicFramePr>
                     <a:graphicFrameLocks noChangeAspect="1"/>
                   </wp:cNvGraphicFramePr>
@@ -1728,7 +2657,7 @@
           <w:color w:val="1F2937"/>
           <w:sz w:val="20"/>
         </w:rPr>
-        <w:t>Top pages visited</w:t>
+        <w:t>Top pages — USEast (useast.corestack.io)</w:t>
       </w:r>
     </w:p>
     <w:tbl>
@@ -1780,6 +2709,44 @@
                 <w:sz w:val="18"/>
               </w:rPr>
               <w:t>Views</w:t>
+            </w:r>
+          </w:p>
+        </w:tc>
+      </w:tr>
+      <w:tr>
+        <w:tc>
+          <w:tcPr>
+            <w:tcW w:type="dxa" w:w="6480"/>
+            <w:shd w:val="clear" w:color="auto" w:fill="F2F2F2"/>
+          </w:tcPr>
+          <w:p>
+            <w:r/>
+            <w:r>
+              <w:rPr>
+                <w:rFonts w:ascii="Calibri" w:hAnsi="Calibri"/>
+                <w:b w:val="0"/>
+                <w:i w:val="0"/>
+                <w:sz w:val="18"/>
+              </w:rPr>
+              <w:t>—</w:t>
+            </w:r>
+          </w:p>
+        </w:tc>
+        <w:tc>
+          <w:tcPr>
+            <w:tcW w:type="dxa" w:w="1152"/>
+            <w:shd w:val="clear" w:color="auto" w:fill="F2F2F2"/>
+          </w:tcPr>
+          <w:p>
+            <w:r/>
+            <w:r>
+              <w:rPr>
+                <w:rFonts w:ascii="Calibri" w:hAnsi="Calibri"/>
+                <w:b w:val="0"/>
+                <w:i w:val="0"/>
+                <w:sz w:val="18"/>
+              </w:rPr>
+              <w:t>—</w:t>
             </w:r>
           </w:p>
         </w:tc>
@@ -2394,7 +3361,7 @@
               <w:drawing>
                 <wp:inline xmlns:a="http://schemas.openxmlformats.org/drawingml/2006/main" xmlns:pic="http://schemas.openxmlformats.org/drawingml/2006/picture">
                   <wp:extent cx="3017520" cy="2618226"/>
-                  <wp:docPr id="3" name="Picture 3"/>
+                  <wp:docPr id="5" name="Picture 5"/>
                   <wp:cNvGraphicFramePr>
                     <a:graphicFrameLocks noChangeAspect="1"/>
                   </wp:cNvGraphicFramePr>
@@ -2406,7 +3373,7 @@
                           <pic:cNvPicPr/>
                         </pic:nvPicPr>
                         <pic:blipFill>
-                          <a:blip r:embed="rId11"/>
+                          <a:blip r:embed="rId12"/>
                           <a:stretch>
                             <a:fillRect/>
                           </a:stretch>
@@ -2436,1572 +3403,7 @@
               <w:drawing>
                 <wp:inline xmlns:a="http://schemas.openxmlformats.org/drawingml/2006/main" xmlns:pic="http://schemas.openxmlformats.org/drawingml/2006/picture">
                   <wp:extent cx="3017520" cy="2126502"/>
-                  <wp:docPr id="4" name="Picture 4"/>
-                  <wp:cNvGraphicFramePr>
-                    <a:graphicFrameLocks noChangeAspect="1"/>
-                  </wp:cNvGraphicFramePr>
-                  <a:graphic>
-                    <a:graphicData uri="http://schemas.openxmlformats.org/drawingml/2006/picture">
-                      <pic:pic>
-                        <pic:nvPicPr>
-                          <pic:cNvPr id="0" name="image.png"/>
-                          <pic:cNvPicPr/>
-                        </pic:nvPicPr>
-                        <pic:blipFill>
-                          <a:blip r:embed="rId12"/>
-                          <a:stretch>
-                            <a:fillRect/>
-                          </a:stretch>
-                        </pic:blipFill>
-                        <pic:spPr>
-                          <a:xfrm>
-                            <a:off x="0" y="0"/>
-                            <a:ext cx="3017520" cy="2126502"/>
-                          </a:xfrm>
-                          <a:prstGeom prst="rect"/>
-                        </pic:spPr>
-                      </pic:pic>
-                    </a:graphicData>
-                  </a:graphic>
-                </wp:inline>
-              </w:drawing>
-            </w:r>
-          </w:p>
-        </w:tc>
-      </w:tr>
-    </w:tbl>
-    <w:p>
-      <w:r>
-        <w:br w:type="page"/>
-      </w:r>
-    </w:p>
-    <w:p>
-      <w:pPr>
-        <w:spacing w:before="0" w:after="40"/>
-        <w:jc w:val="left"/>
-      </w:pPr>
-      <w:r>
-        <w:rPr>
-          <w:rFonts w:ascii="Calibri" w:hAnsi="Calibri"/>
-          <w:b/>
-          <w:i w:val="0"/>
-          <w:color w:val="1F2937"/>
-          <w:sz w:val="32"/>
-        </w:rPr>
-        <w:t>Blackstone — daily scrum update  EU</w:t>
-      </w:r>
-    </w:p>
-    <w:p>
-      <w:pPr>
-        <w:spacing w:before="0" w:after="120"/>
-        <w:jc w:val="left"/>
-      </w:pPr>
-      <w:r>
-        <w:rPr>
-          <w:rFonts w:ascii="Calibri" w:hAnsi="Calibri"/>
-          <w:b w:val="0"/>
-          <w:i w:val="0"/>
-          <w:color w:val="757575"/>
-          <w:sz w:val="18"/>
-        </w:rPr>
-        <w:t>Thursday, June 18, 2026   ·   Report generated 1:31 PM IST</w:t>
-      </w:r>
-    </w:p>
-    <w:p>
-      <w:pPr>
-        <w:spacing w:before="200" w:after="40"/>
-        <w:jc w:val="left"/>
-      </w:pPr>
-      <w:r>
-        <w:rPr>
-          <w:rFonts w:ascii="Calibri" w:hAnsi="Calibri"/>
-          <w:b/>
-          <w:i w:val="0"/>
-          <w:color w:val="1F2937"/>
-          <w:sz w:val="24"/>
-        </w:rPr>
-        <w:t>At a glance</w:t>
-      </w:r>
-    </w:p>
-    <w:tbl>
-      <w:tblPr>
-        <w:tblStyle w:val="TableGrid"/>
-        <w:tblW w:type="auto" w:w="0"/>
-        <w:jc w:val="left"/>
-        <w:tblLook w:firstColumn="1" w:firstRow="1" w:lastColumn="0" w:lastRow="0" w:noHBand="0" w:noVBand="1" w:val="04A0"/>
-      </w:tblPr>
-      <w:tblGrid>
-        <w:gridCol w:w="2550"/>
-        <w:gridCol w:w="2550"/>
-        <w:gridCol w:w="2550"/>
-        <w:gridCol w:w="2550"/>
-      </w:tblGrid>
-      <w:tr>
-        <w:tc>
-          <w:tcPr>
-            <w:tcW w:type="dxa" w:w="2160"/>
-            <w:shd w:val="clear" w:color="auto" w:fill="1F2937"/>
-          </w:tcPr>
-          <w:p>
-            <w:r/>
-            <w:r>
-              <w:rPr>
-                <w:rFonts w:ascii="Calibri" w:hAnsi="Calibri"/>
-                <w:b/>
-                <w:i w:val="0"/>
-                <w:color w:val="FFFFFF"/>
-                <w:sz w:val="18"/>
-              </w:rPr>
-              <w:t>Compliance</w:t>
-            </w:r>
-          </w:p>
-        </w:tc>
-        <w:tc>
-          <w:tcPr>
-            <w:tcW w:type="dxa" w:w="2592"/>
-            <w:shd w:val="clear" w:color="auto" w:fill="1F2937"/>
-          </w:tcPr>
-          <w:p>
-            <w:r/>
-            <w:r>
-              <w:rPr>
-                <w:rFonts w:ascii="Calibri" w:hAnsi="Calibri"/>
-                <w:b/>
-                <w:i w:val="0"/>
-                <w:color w:val="FFFFFF"/>
-                <w:sz w:val="18"/>
-              </w:rPr>
-              <w:t>API requests</w:t>
-            </w:r>
-          </w:p>
-        </w:tc>
-        <w:tc>
-          <w:tcPr>
-            <w:tcW w:type="dxa" w:w="2592"/>
-            <w:shd w:val="clear" w:color="auto" w:fill="1F2937"/>
-          </w:tcPr>
-          <w:p>
-            <w:r/>
-            <w:r>
-              <w:rPr>
-                <w:rFonts w:ascii="Calibri" w:hAnsi="Calibri"/>
-                <w:b/>
-                <w:i w:val="0"/>
-                <w:color w:val="FFFFFF"/>
-                <w:sz w:val="18"/>
-              </w:rPr>
-              <w:t>Slow req ≥30s</w:t>
-            </w:r>
-          </w:p>
-        </w:tc>
-        <w:tc>
-          <w:tcPr>
-            <w:tcW w:type="dxa" w:w="2592"/>
-            <w:shd w:val="clear" w:color="auto" w:fill="1F2937"/>
-          </w:tcPr>
-          <w:p>
-            <w:r/>
-            <w:r>
-              <w:rPr>
-                <w:rFonts w:ascii="Calibri" w:hAnsi="Calibri"/>
-                <w:b/>
-                <w:i w:val="0"/>
-                <w:color w:val="FFFFFF"/>
-                <w:sz w:val="18"/>
-              </w:rPr>
-              <w:t>Open incidents</w:t>
-            </w:r>
-          </w:p>
-        </w:tc>
-      </w:tr>
-      <w:tr>
-        <w:tc>
-          <w:tcPr>
-            <w:tcW w:type="dxa" w:w="2160"/>
-            <w:shd w:val="clear" w:color="auto" w:fill="F2F2F2"/>
-          </w:tcPr>
-          <w:p>
-            <w:r/>
-            <w:r>
-              <w:rPr>
-                <w:rFonts w:ascii="Calibri" w:hAnsi="Calibri"/>
-                <w:b/>
-                <w:i w:val="0"/>
-                <w:color w:val="0070C0"/>
-                <w:sz w:val="26"/>
-              </w:rPr>
-              <w:t>100%</w:t>
-            </w:r>
-          </w:p>
-        </w:tc>
-        <w:tc>
-          <w:tcPr>
-            <w:tcW w:type="dxa" w:w="2592"/>
-            <w:shd w:val="clear" w:color="auto" w:fill="F2F2F2"/>
-          </w:tcPr>
-          <w:p>
-            <w:r/>
-            <w:r>
-              <w:rPr>
-                <w:rFonts w:ascii="Calibri" w:hAnsi="Calibri"/>
-                <w:b/>
-                <w:i w:val="0"/>
-                <w:color w:val="0070C0"/>
-                <w:sz w:val="26"/>
-              </w:rPr>
-              <w:t>522</w:t>
-              <w:br/>
-              <w:t>Max 3.76s resp.</w:t>
-            </w:r>
-          </w:p>
-        </w:tc>
-        <w:tc>
-          <w:tcPr>
-            <w:tcW w:type="dxa" w:w="2592"/>
-            <w:shd w:val="clear" w:color="auto" w:fill="F2F2F2"/>
-          </w:tcPr>
-          <w:p>
-            <w:r/>
-            <w:r>
-              <w:rPr>
-                <w:rFonts w:ascii="Calibri" w:hAnsi="Calibri"/>
-                <w:b/>
-                <w:i w:val="0"/>
-                <w:color w:val="0070C0"/>
-                <w:sz w:val="26"/>
-              </w:rPr>
-              <w:t>0</w:t>
-            </w:r>
-          </w:p>
-        </w:tc>
-        <w:tc>
-          <w:tcPr>
-            <w:tcW w:type="dxa" w:w="2592"/>
-            <w:shd w:val="clear" w:color="auto" w:fill="F2F2F2"/>
-          </w:tcPr>
-          <w:p>
-            <w:r/>
-            <w:r>
-              <w:rPr>
-                <w:rFonts w:ascii="Calibri" w:hAnsi="Calibri"/>
-                <w:b/>
-                <w:i w:val="0"/>
-                <w:color w:val="0070C0"/>
-                <w:sz w:val="26"/>
-              </w:rPr>
-              <w:t>3</w:t>
-              <w:br/>
-              <w:t>#131077, #131910, #134003</w:t>
-            </w:r>
-          </w:p>
-        </w:tc>
-      </w:tr>
-    </w:tbl>
-    <w:p/>
-    <w:p>
-      <w:pPr>
-        <w:spacing w:before="200" w:after="40"/>
-        <w:jc w:val="left"/>
-      </w:pPr>
-      <w:r>
-        <w:rPr>
-          <w:rFonts w:ascii="Calibri" w:hAnsi="Calibri"/>
-          <w:b/>
-          <w:i w:val="0"/>
-          <w:color w:val="1F2937"/>
-          <w:sz w:val="24"/>
-        </w:rPr>
-        <w:t>Platform performance — EU   (N-2 metric)</w:t>
-      </w:r>
-    </w:p>
-    <w:tbl>
-      <w:tblPr>
-        <w:tblStyle w:val="TableGrid"/>
-        <w:tblW w:type="auto" w:w="0"/>
-        <w:jc w:val="left"/>
-        <w:tblLook w:firstColumn="1" w:firstRow="1" w:lastColumn="0" w:lastRow="0" w:noHBand="0" w:noVBand="1" w:val="04A0"/>
-      </w:tblPr>
-      <w:tblGrid>
-        <w:gridCol w:w="5100"/>
-        <w:gridCol w:w="5100"/>
-      </w:tblGrid>
-      <w:tr>
-        <w:tc>
-          <w:tcPr>
-            <w:tcW w:type="dxa" w:w="5040"/>
-            <w:shd w:val="clear" w:color="auto" w:fill="1F2937"/>
-            <w:vAlign w:val="center"/>
-          </w:tcPr>
-          <w:p>
-            <w:r/>
-            <w:r>
-              <w:rPr>
-                <w:rFonts w:ascii="Calibri" w:hAnsi="Calibri"/>
-                <w:b/>
-                <w:i w:val="0"/>
-                <w:color w:val="FFFFFF"/>
-                <w:sz w:val="18"/>
-              </w:rPr>
-              <w:t>Metric</w:t>
-            </w:r>
-          </w:p>
-        </w:tc>
-        <w:tc>
-          <w:tcPr>
-            <w:tcW w:type="dxa" w:w="2160"/>
-            <w:shd w:val="clear" w:color="auto" w:fill="1F2937"/>
-            <w:vAlign w:val="center"/>
-          </w:tcPr>
-          <w:p>
-            <w:r/>
-            <w:r>
-              <w:rPr>
-                <w:rFonts w:ascii="Calibri" w:hAnsi="Calibri"/>
-                <w:b/>
-                <w:i w:val="0"/>
-                <w:color w:val="FFFFFF"/>
-                <w:sz w:val="18"/>
-              </w:rPr>
-              <w:t>Value</w:t>
-            </w:r>
-          </w:p>
-        </w:tc>
-      </w:tr>
-      <w:tr>
-        <w:tc>
-          <w:tcPr>
-            <w:tcW w:type="dxa" w:w="5040"/>
-            <w:shd w:val="clear" w:color="auto" w:fill="F2F2F2"/>
-          </w:tcPr>
-          <w:p>
-            <w:r/>
-            <w:r>
-              <w:rPr>
-                <w:rFonts w:ascii="Calibri" w:hAnsi="Calibri"/>
-                <w:b w:val="0"/>
-                <w:i w:val="0"/>
-                <w:sz w:val="18"/>
-              </w:rPr>
-              <w:t>Total accounts</w:t>
-            </w:r>
-          </w:p>
-        </w:tc>
-        <w:tc>
-          <w:tcPr>
-            <w:tcW w:type="dxa" w:w="2160"/>
-            <w:shd w:val="clear" w:color="auto" w:fill="F2F2F2"/>
-          </w:tcPr>
-          <w:p>
-            <w:r/>
-            <w:r>
-              <w:rPr>
-                <w:rFonts w:ascii="Calibri" w:hAnsi="Calibri"/>
-                <w:b w:val="0"/>
-                <w:i w:val="0"/>
-                <w:sz w:val="18"/>
-              </w:rPr>
-              <w:t>175</w:t>
-            </w:r>
-          </w:p>
-        </w:tc>
-      </w:tr>
-      <w:tr>
-        <w:tc>
-          <w:tcPr>
-            <w:tcW w:type="dxa" w:w="5040"/>
-            <w:shd w:val="clear" w:color="auto" w:fill="FFFFFF"/>
-          </w:tcPr>
-          <w:p>
-            <w:r/>
-            <w:r>
-              <w:rPr>
-                <w:rFonts w:ascii="Calibri" w:hAnsi="Calibri"/>
-                <w:b w:val="0"/>
-                <w:i w:val="0"/>
-                <w:sz w:val="18"/>
-              </w:rPr>
-              <w:t>Completed jobs (24h)</w:t>
-            </w:r>
-          </w:p>
-        </w:tc>
-        <w:tc>
-          <w:tcPr>
-            <w:tcW w:type="dxa" w:w="2160"/>
-            <w:shd w:val="clear" w:color="auto" w:fill="FFFFFF"/>
-          </w:tcPr>
-          <w:p>
-            <w:r/>
-            <w:r>
-              <w:rPr>
-                <w:rFonts w:ascii="Calibri" w:hAnsi="Calibri"/>
-                <w:b w:val="0"/>
-                <w:i w:val="0"/>
-                <w:sz w:val="18"/>
-              </w:rPr>
-              <w:t>524</w:t>
-            </w:r>
-          </w:p>
-        </w:tc>
-      </w:tr>
-      <w:tr>
-        <w:tc>
-          <w:tcPr>
-            <w:tcW w:type="dxa" w:w="5040"/>
-            <w:shd w:val="clear" w:color="auto" w:fill="F2F2F2"/>
-          </w:tcPr>
-          <w:p>
-            <w:r/>
-            <w:r>
-              <w:rPr>
-                <w:rFonts w:ascii="Calibri" w:hAnsi="Calibri"/>
-                <w:b w:val="0"/>
-                <w:i w:val="0"/>
-                <w:sz w:val="18"/>
-              </w:rPr>
-              <w:t>Tenants impacted</w:t>
-            </w:r>
-          </w:p>
-        </w:tc>
-        <w:tc>
-          <w:tcPr>
-            <w:tcW w:type="dxa" w:w="2160"/>
-            <w:shd w:val="clear" w:color="auto" w:fill="F2F2F2"/>
-          </w:tcPr>
-          <w:p>
-            <w:r/>
-            <w:r>
-              <w:rPr>
-                <w:rFonts w:ascii="Calibri" w:hAnsi="Calibri"/>
-                <w:b w:val="0"/>
-                <w:i w:val="0"/>
-                <w:sz w:val="18"/>
-              </w:rPr>
-              <w:t>0</w:t>
-            </w:r>
-          </w:p>
-        </w:tc>
-      </w:tr>
-      <w:tr>
-        <w:tc>
-          <w:tcPr>
-            <w:tcW w:type="dxa" w:w="5040"/>
-            <w:shd w:val="clear" w:color="auto" w:fill="FFFFFF"/>
-          </w:tcPr>
-          <w:p>
-            <w:r/>
-            <w:r>
-              <w:rPr>
-                <w:rFonts w:ascii="Calibri" w:hAnsi="Calibri"/>
-                <w:b w:val="0"/>
-                <w:i w:val="0"/>
-                <w:sz w:val="18"/>
-              </w:rPr>
-              <w:t>Pending N-2 accts</w:t>
-            </w:r>
-          </w:p>
-        </w:tc>
-        <w:tc>
-          <w:tcPr>
-            <w:tcW w:type="dxa" w:w="2160"/>
-            <w:shd w:val="clear" w:color="auto" w:fill="FFFFFF"/>
-          </w:tcPr>
-          <w:p>
-            <w:r/>
-            <w:r>
-              <w:rPr>
-                <w:rFonts w:ascii="Calibri" w:hAnsi="Calibri"/>
-                <w:b w:val="0"/>
-                <w:i w:val="0"/>
-                <w:sz w:val="18"/>
-              </w:rPr>
-              <w:t>0</w:t>
-            </w:r>
-          </w:p>
-        </w:tc>
-      </w:tr>
-      <w:tr>
-        <w:tc>
-          <w:tcPr>
-            <w:tcW w:type="dxa" w:w="5040"/>
-            <w:shd w:val="clear" w:color="auto" w:fill="F2F2F2"/>
-          </w:tcPr>
-          <w:p>
-            <w:r/>
-            <w:r>
-              <w:rPr>
-                <w:rFonts w:ascii="Calibri" w:hAnsi="Calibri"/>
-                <w:b w:val="0"/>
-                <w:i w:val="0"/>
-                <w:sz w:val="18"/>
-              </w:rPr>
-              <w:t>Older backlog</w:t>
-            </w:r>
-          </w:p>
-        </w:tc>
-        <w:tc>
-          <w:tcPr>
-            <w:tcW w:type="dxa" w:w="2160"/>
-            <w:shd w:val="clear" w:color="auto" w:fill="F2F2F2"/>
-          </w:tcPr>
-          <w:p>
-            <w:r/>
-            <w:r>
-              <w:rPr>
-                <w:rFonts w:ascii="Calibri" w:hAnsi="Calibri"/>
-                <w:b w:val="0"/>
-                <w:i w:val="0"/>
-                <w:sz w:val="18"/>
-              </w:rPr>
-              <w:t>0</w:t>
-            </w:r>
-          </w:p>
-        </w:tc>
-      </w:tr>
-      <w:tr>
-        <w:tc>
-          <w:tcPr>
-            <w:tcW w:type="dxa" w:w="5040"/>
-            <w:shd w:val="clear" w:color="auto" w:fill="FFFFFF"/>
-          </w:tcPr>
-          <w:p>
-            <w:r/>
-            <w:r>
-              <w:rPr>
-                <w:rFonts w:ascii="Calibri" w:hAnsi="Calibri"/>
-                <w:b w:val="0"/>
-                <w:i w:val="0"/>
-                <w:sz w:val="18"/>
-              </w:rPr>
-              <w:t>Compliance %</w:t>
-            </w:r>
-          </w:p>
-        </w:tc>
-        <w:tc>
-          <w:tcPr>
-            <w:tcW w:type="dxa" w:w="2160"/>
-            <w:shd w:val="clear" w:color="auto" w:fill="FFFFFF"/>
-          </w:tcPr>
-          <w:p>
-            <w:r/>
-            <w:r>
-              <w:rPr>
-                <w:rFonts w:ascii="Calibri" w:hAnsi="Calibri"/>
-                <w:b w:val="0"/>
-                <w:i w:val="0"/>
-                <w:sz w:val="18"/>
-              </w:rPr>
-              <w:t>100%</w:t>
-            </w:r>
-          </w:p>
-        </w:tc>
-      </w:tr>
-    </w:tbl>
-    <w:p/>
-    <w:p>
-      <w:pPr>
-        <w:spacing w:before="200" w:after="40"/>
-        <w:jc w:val="left"/>
-      </w:pPr>
-      <w:r>
-        <w:rPr>
-          <w:rFonts w:ascii="Calibri" w:hAnsi="Calibri"/>
-          <w:b/>
-          <w:i w:val="0"/>
-          <w:color w:val="1F2937"/>
-          <w:sz w:val="24"/>
-        </w:rPr>
-        <w:t>Service metric (COST)</w:t>
-      </w:r>
-    </w:p>
-    <w:tbl>
-      <w:tblPr>
-        <w:tblStyle w:val="TableGrid"/>
-        <w:tblW w:type="auto" w:w="0"/>
-        <w:jc w:val="left"/>
-        <w:tblLook w:firstColumn="1" w:firstRow="1" w:lastColumn="0" w:lastRow="0" w:noHBand="0" w:noVBand="1" w:val="04A0"/>
-      </w:tblPr>
-      <w:tblGrid>
-        <w:gridCol w:w="5100"/>
-        <w:gridCol w:w="5100"/>
-      </w:tblGrid>
-      <w:tr>
-        <w:tc>
-          <w:tcPr>
-            <w:tcW w:type="dxa" w:w="5040"/>
-            <w:shd w:val="clear" w:color="auto" w:fill="1F2937"/>
-            <w:vAlign w:val="center"/>
-          </w:tcPr>
-          <w:p>
-            <w:r/>
-            <w:r>
-              <w:rPr>
-                <w:rFonts w:ascii="Calibri" w:hAnsi="Calibri"/>
-                <w:b/>
-                <w:i w:val="0"/>
-                <w:color w:val="FFFFFF"/>
-                <w:sz w:val="18"/>
-              </w:rPr>
-              <w:t>Metric</w:t>
-            </w:r>
-          </w:p>
-        </w:tc>
-        <w:tc>
-          <w:tcPr>
-            <w:tcW w:type="dxa" w:w="2160"/>
-            <w:shd w:val="clear" w:color="auto" w:fill="1F2937"/>
-            <w:vAlign w:val="center"/>
-          </w:tcPr>
-          <w:p>
-            <w:r/>
-            <w:r>
-              <w:rPr>
-                <w:rFonts w:ascii="Calibri" w:hAnsi="Calibri"/>
-                <w:b/>
-                <w:i w:val="0"/>
-                <w:color w:val="FFFFFF"/>
-                <w:sz w:val="18"/>
-              </w:rPr>
-              <w:t>Value</w:t>
-            </w:r>
-          </w:p>
-        </w:tc>
-      </w:tr>
-      <w:tr>
-        <w:tc>
-          <w:tcPr>
-            <w:tcW w:type="dxa" w:w="5040"/>
-            <w:shd w:val="clear" w:color="auto" w:fill="F2F2F2"/>
-          </w:tcPr>
-          <w:p>
-            <w:r/>
-            <w:r>
-              <w:rPr>
-                <w:rFonts w:ascii="Calibri" w:hAnsi="Calibri"/>
-                <w:b w:val="0"/>
-                <w:i w:val="0"/>
-                <w:sz w:val="18"/>
-              </w:rPr>
-              <w:t>Total requests (24h)</w:t>
-            </w:r>
-          </w:p>
-        </w:tc>
-        <w:tc>
-          <w:tcPr>
-            <w:tcW w:type="dxa" w:w="2160"/>
-            <w:shd w:val="clear" w:color="auto" w:fill="F2F2F2"/>
-          </w:tcPr>
-          <w:p>
-            <w:r/>
-            <w:r>
-              <w:rPr>
-                <w:rFonts w:ascii="Calibri" w:hAnsi="Calibri"/>
-                <w:b w:val="0"/>
-                <w:i w:val="0"/>
-                <w:sz w:val="18"/>
-              </w:rPr>
-              <w:t>522</w:t>
-            </w:r>
-          </w:p>
-        </w:tc>
-      </w:tr>
-      <w:tr>
-        <w:tc>
-          <w:tcPr>
-            <w:tcW w:type="dxa" w:w="5040"/>
-            <w:shd w:val="clear" w:color="auto" w:fill="FFFFFF"/>
-          </w:tcPr>
-          <w:p>
-            <w:r/>
-            <w:r>
-              <w:rPr>
-                <w:rFonts w:ascii="Calibri" w:hAnsi="Calibri"/>
-                <w:b w:val="0"/>
-                <w:i w:val="0"/>
-                <w:sz w:val="18"/>
-              </w:rPr>
-              <w:t>Max response time</w:t>
-            </w:r>
-          </w:p>
-        </w:tc>
-        <w:tc>
-          <w:tcPr>
-            <w:tcW w:type="dxa" w:w="2160"/>
-            <w:shd w:val="clear" w:color="auto" w:fill="FFFFFF"/>
-          </w:tcPr>
-          <w:p>
-            <w:r/>
-            <w:r>
-              <w:rPr>
-                <w:rFonts w:ascii="Calibri" w:hAnsi="Calibri"/>
-                <w:b w:val="0"/>
-                <w:i w:val="0"/>
-                <w:sz w:val="18"/>
-              </w:rPr>
-              <w:t>3.76 sec</w:t>
-            </w:r>
-          </w:p>
-        </w:tc>
-      </w:tr>
-      <w:tr>
-        <w:tc>
-          <w:tcPr>
-            <w:tcW w:type="dxa" w:w="5040"/>
-            <w:shd w:val="clear" w:color="auto" w:fill="F2F2F2"/>
-          </w:tcPr>
-          <w:p>
-            <w:r/>
-            <w:r>
-              <w:rPr>
-                <w:rFonts w:ascii="Calibri" w:hAnsi="Calibri"/>
-                <w:b w:val="0"/>
-                <w:i w:val="0"/>
-                <w:sz w:val="18"/>
-              </w:rPr>
-              <w:t>Slow requests ≥30s</w:t>
-            </w:r>
-          </w:p>
-        </w:tc>
-        <w:tc>
-          <w:tcPr>
-            <w:tcW w:type="dxa" w:w="2160"/>
-            <w:shd w:val="clear" w:color="auto" w:fill="F2F2F2"/>
-          </w:tcPr>
-          <w:p>
-            <w:r/>
-            <w:r>
-              <w:rPr>
-                <w:rFonts w:ascii="Calibri" w:hAnsi="Calibri"/>
-                <w:b w:val="0"/>
-                <w:i w:val="0"/>
-                <w:sz w:val="18"/>
-              </w:rPr>
-              <w:t>0</w:t>
-            </w:r>
-          </w:p>
-        </w:tc>
-      </w:tr>
-      <w:tr>
-        <w:tc>
-          <w:tcPr>
-            <w:tcW w:type="dxa" w:w="5040"/>
-            <w:shd w:val="clear" w:color="auto" w:fill="FFFFFF"/>
-          </w:tcPr>
-          <w:p>
-            <w:r/>
-            <w:r>
-              <w:rPr>
-                <w:rFonts w:ascii="Calibri" w:hAnsi="Calibri"/>
-                <w:b w:val="0"/>
-                <w:i w:val="0"/>
-                <w:sz w:val="18"/>
-              </w:rPr>
-              <w:t>Users impacted</w:t>
-            </w:r>
-          </w:p>
-        </w:tc>
-        <w:tc>
-          <w:tcPr>
-            <w:tcW w:type="dxa" w:w="2160"/>
-            <w:shd w:val="clear" w:color="auto" w:fill="FFFFFF"/>
-          </w:tcPr>
-          <w:p>
-            <w:r/>
-            <w:r>
-              <w:rPr>
-                <w:rFonts w:ascii="Calibri" w:hAnsi="Calibri"/>
-                <w:b w:val="0"/>
-                <w:i w:val="0"/>
-                <w:sz w:val="18"/>
-              </w:rPr>
-              <w:t>0</w:t>
-            </w:r>
-          </w:p>
-        </w:tc>
-      </w:tr>
-      <w:tr>
-        <w:tc>
-          <w:tcPr>
-            <w:tcW w:type="dxa" w:w="5040"/>
-            <w:shd w:val="clear" w:color="auto" w:fill="F2F2F2"/>
-          </w:tcPr>
-          <w:p>
-            <w:r/>
-            <w:r>
-              <w:rPr>
-                <w:rFonts w:ascii="Calibri" w:hAnsi="Calibri"/>
-                <w:b w:val="0"/>
-                <w:i w:val="0"/>
-                <w:sz w:val="18"/>
-              </w:rPr>
-              <w:t>Health status</w:t>
-            </w:r>
-          </w:p>
-        </w:tc>
-        <w:tc>
-          <w:tcPr>
-            <w:tcW w:type="dxa" w:w="2160"/>
-            <w:shd w:val="clear" w:color="auto" w:fill="F2F2F2"/>
-          </w:tcPr>
-          <w:p>
-            <w:r/>
-            <w:r>
-              <w:rPr>
-                <w:rFonts w:ascii="Calibri" w:hAnsi="Calibri"/>
-                <w:b w:val="0"/>
-                <w:i w:val="0"/>
-                <w:sz w:val="18"/>
-              </w:rPr>
-              <w:t>Good</w:t>
-            </w:r>
-          </w:p>
-        </w:tc>
-      </w:tr>
-    </w:tbl>
-    <w:p/>
-    <w:p>
-      <w:pPr>
-        <w:spacing w:before="200" w:after="40"/>
-        <w:jc w:val="left"/>
-      </w:pPr>
-      <w:r>
-        <w:rPr>
-          <w:rFonts w:ascii="Calibri" w:hAnsi="Calibri"/>
-          <w:b/>
-          <w:i w:val="0"/>
-          <w:color w:val="1F2937"/>
-          <w:sz w:val="24"/>
-        </w:rPr>
-        <w:t>Pendo engagement — Blackstone segment  ·  last 3 days (16 Jun – 18 Jun)</w:t>
-      </w:r>
-    </w:p>
-    <w:p>
-      <w:pPr>
-        <w:spacing w:before="0" w:after="80"/>
-        <w:jc w:val="left"/>
-      </w:pPr>
-      <w:r>
-        <w:rPr>
-          <w:rFonts w:ascii="Calibri" w:hAnsi="Calibri"/>
-          <w:b w:val="0"/>
-          <w:i/>
-          <w:color w:val="757575"/>
-          <w:sz w:val="16"/>
-        </w:rPr>
-        <w:t>Source: Blackstone Pendo segment only.  cs.support.blackstone@corestack.io excluded.  Grey rows = segment members with no activity in this window.</w:t>
-      </w:r>
-    </w:p>
-    <w:tbl>
-      <w:tblPr>
-        <w:tblStyle w:val="TableGrid"/>
-        <w:tblW w:type="auto" w:w="0"/>
-        <w:jc w:val="left"/>
-        <w:tblLook w:firstColumn="1" w:firstRow="1" w:lastColumn="0" w:lastRow="0" w:noHBand="0" w:noVBand="1" w:val="04A0"/>
-      </w:tblPr>
-      <w:tblGrid>
-        <w:gridCol w:w="1700"/>
-        <w:gridCol w:w="1700"/>
-        <w:gridCol w:w="1700"/>
-        <w:gridCol w:w="1700"/>
-        <w:gridCol w:w="1700"/>
-        <w:gridCol w:w="1700"/>
-      </w:tblGrid>
-      <w:tr>
-        <w:tc>
-          <w:tcPr>
-            <w:tcW w:type="dxa" w:w="2592"/>
-            <w:shd w:val="clear" w:color="auto" w:fill="1F2937"/>
-            <w:vAlign w:val="center"/>
-          </w:tcPr>
-          <w:p>
-            <w:r/>
-            <w:r>
-              <w:rPr>
-                <w:rFonts w:ascii="Calibri" w:hAnsi="Calibri"/>
-                <w:b/>
-                <w:i w:val="0"/>
-                <w:color w:val="FFFFFF"/>
-                <w:sz w:val="18"/>
-              </w:rPr>
-              <w:t>Visitor</w:t>
-            </w:r>
-          </w:p>
-        </w:tc>
-        <w:tc>
-          <w:tcPr>
-            <w:tcW w:type="dxa" w:w="2592"/>
-            <w:shd w:val="clear" w:color="auto" w:fill="1F2937"/>
-            <w:vAlign w:val="center"/>
-          </w:tcPr>
-          <w:p>
-            <w:r/>
-            <w:r>
-              <w:rPr>
-                <w:rFonts w:ascii="Calibri" w:hAnsi="Calibri"/>
-                <w:b/>
-                <w:i w:val="0"/>
-                <w:color w:val="FFFFFF"/>
-                <w:sz w:val="18"/>
-              </w:rPr>
-              <w:t>Domain</w:t>
-            </w:r>
-          </w:p>
-        </w:tc>
-        <w:tc>
-          <w:tcPr>
-            <w:tcW w:type="dxa" w:w="1440"/>
-            <w:shd w:val="clear" w:color="auto" w:fill="1F2937"/>
-            <w:vAlign w:val="center"/>
-          </w:tcPr>
-          <w:p>
-            <w:r/>
-            <w:r>
-              <w:rPr>
-                <w:rFonts w:ascii="Calibri" w:hAnsi="Calibri"/>
-                <w:b/>
-                <w:i w:val="0"/>
-                <w:color w:val="FFFFFF"/>
-                <w:sz w:val="18"/>
-              </w:rPr>
-              <w:t>Events (3d)</w:t>
-            </w:r>
-          </w:p>
-        </w:tc>
-        <w:tc>
-          <w:tcPr>
-            <w:tcW w:type="dxa" w:w="1440"/>
-            <w:shd w:val="clear" w:color="auto" w:fill="1F2937"/>
-            <w:vAlign w:val="center"/>
-          </w:tcPr>
-          <w:p>
-            <w:r/>
-            <w:r>
-              <w:rPr>
-                <w:rFonts w:ascii="Calibri" w:hAnsi="Calibri"/>
-                <w:b/>
-                <w:i w:val="0"/>
-                <w:color w:val="FFFFFF"/>
-                <w:sz w:val="18"/>
-              </w:rPr>
-              <w:t>Days active</w:t>
-            </w:r>
-          </w:p>
-        </w:tc>
-        <w:tc>
-          <w:tcPr>
-            <w:tcW w:type="dxa" w:w="1296"/>
-            <w:shd w:val="clear" w:color="auto" w:fill="1F2937"/>
-            <w:vAlign w:val="center"/>
-          </w:tcPr>
-          <w:p>
-            <w:r/>
-            <w:r>
-              <w:rPr>
-                <w:rFonts w:ascii="Calibri" w:hAnsi="Calibri"/>
-                <w:b/>
-                <w:i w:val="0"/>
-                <w:color w:val="FFFFFF"/>
-                <w:sz w:val="18"/>
-              </w:rPr>
-              <w:t>Minutes</w:t>
-            </w:r>
-          </w:p>
-        </w:tc>
-        <w:tc>
-          <w:tcPr>
-            <w:tcW w:type="dxa" w:w="1296"/>
-            <w:shd w:val="clear" w:color="auto" w:fill="1F2937"/>
-            <w:vAlign w:val="center"/>
-          </w:tcPr>
-          <w:p>
-            <w:r/>
-            <w:r>
-              <w:rPr>
-                <w:rFonts w:ascii="Calibri" w:hAnsi="Calibri"/>
-                <w:b/>
-                <w:i w:val="0"/>
-                <w:color w:val="FFFFFF"/>
-                <w:sz w:val="18"/>
-              </w:rPr>
-              <w:t>Last seen</w:t>
-            </w:r>
-          </w:p>
-        </w:tc>
-      </w:tr>
-      <w:tr>
-        <w:tc>
-          <w:tcPr>
-            <w:tcW w:type="dxa" w:w="2592"/>
-            <w:shd w:val="clear" w:color="auto" w:fill="F2F2F2"/>
-          </w:tcPr>
-          <w:p>
-            <w:r/>
-            <w:r>
-              <w:rPr>
-                <w:rFonts w:ascii="Calibri" w:hAnsi="Calibri"/>
-                <w:b w:val="0"/>
-                <w:i w:val="0"/>
-                <w:sz w:val="18"/>
-              </w:rPr>
-              <w:t>timo pantsari</w:t>
-            </w:r>
-          </w:p>
-        </w:tc>
-        <w:tc>
-          <w:tcPr>
-            <w:tcW w:type="dxa" w:w="2592"/>
-            <w:shd w:val="clear" w:color="auto" w:fill="F2F2F2"/>
-          </w:tcPr>
-          <w:p>
-            <w:r/>
-            <w:r>
-              <w:rPr>
-                <w:rFonts w:ascii="Calibri" w:hAnsi="Calibri"/>
-                <w:b w:val="0"/>
-                <w:i w:val="0"/>
-                <w:sz w:val="18"/>
-              </w:rPr>
-              <w:t>blackstone.com</w:t>
-            </w:r>
-          </w:p>
-        </w:tc>
-        <w:tc>
-          <w:tcPr>
-            <w:tcW w:type="dxa" w:w="1440"/>
-            <w:shd w:val="clear" w:color="auto" w:fill="F2F2F2"/>
-          </w:tcPr>
-          <w:p>
-            <w:r/>
-            <w:r>
-              <w:rPr>
-                <w:rFonts w:ascii="Calibri" w:hAnsi="Calibri"/>
-                <w:b w:val="0"/>
-                <w:i w:val="0"/>
-                <w:sz w:val="18"/>
-              </w:rPr>
-              <w:t>—</w:t>
-            </w:r>
-          </w:p>
-        </w:tc>
-        <w:tc>
-          <w:tcPr>
-            <w:tcW w:type="dxa" w:w="1440"/>
-            <w:shd w:val="clear" w:color="auto" w:fill="F2F2F2"/>
-          </w:tcPr>
-          <w:p>
-            <w:r/>
-            <w:r>
-              <w:rPr>
-                <w:rFonts w:ascii="Calibri" w:hAnsi="Calibri"/>
-                <w:b w:val="0"/>
-                <w:i w:val="0"/>
-                <w:sz w:val="18"/>
-              </w:rPr>
-              <w:t>—</w:t>
-            </w:r>
-          </w:p>
-        </w:tc>
-        <w:tc>
-          <w:tcPr>
-            <w:tcW w:type="dxa" w:w="1296"/>
-            <w:shd w:val="clear" w:color="auto" w:fill="F2F2F2"/>
-          </w:tcPr>
-          <w:p>
-            <w:r/>
-            <w:r>
-              <w:rPr>
-                <w:rFonts w:ascii="Calibri" w:hAnsi="Calibri"/>
-                <w:b w:val="0"/>
-                <w:i w:val="0"/>
-                <w:sz w:val="18"/>
-              </w:rPr>
-              <w:t>—</w:t>
-            </w:r>
-          </w:p>
-        </w:tc>
-        <w:tc>
-          <w:tcPr>
-            <w:tcW w:type="dxa" w:w="1296"/>
-            <w:shd w:val="clear" w:color="auto" w:fill="F2F2F2"/>
-          </w:tcPr>
-          <w:p>
-            <w:r/>
-            <w:r>
-              <w:rPr>
-                <w:rFonts w:ascii="Calibri" w:hAnsi="Calibri"/>
-                <w:b w:val="0"/>
-                <w:i w:val="0"/>
-                <w:sz w:val="18"/>
-              </w:rPr>
-              <w:t>15 Jun</w:t>
-            </w:r>
-          </w:p>
-        </w:tc>
-      </w:tr>
-      <w:tr>
-        <w:tc>
-          <w:tcPr>
-            <w:tcW w:type="dxa" w:w="2592"/>
-            <w:shd w:val="clear" w:color="auto" w:fill="FFFFFF"/>
-          </w:tcPr>
-          <w:p>
-            <w:r/>
-            <w:r>
-              <w:rPr>
-                <w:rFonts w:ascii="Calibri" w:hAnsi="Calibri"/>
-                <w:b w:val="0"/>
-                <w:i w:val="0"/>
-                <w:sz w:val="18"/>
-              </w:rPr>
-              <w:t>alex</w:t>
-            </w:r>
-          </w:p>
-        </w:tc>
-        <w:tc>
-          <w:tcPr>
-            <w:tcW w:type="dxa" w:w="2592"/>
-            <w:shd w:val="clear" w:color="auto" w:fill="FFFFFF"/>
-          </w:tcPr>
-          <w:p>
-            <w:r/>
-            <w:r>
-              <w:rPr>
-                <w:rFonts w:ascii="Calibri" w:hAnsi="Calibri"/>
-                <w:b w:val="0"/>
-                <w:i w:val="0"/>
-                <w:sz w:val="18"/>
-              </w:rPr>
-              <w:t>aliando.com</w:t>
-            </w:r>
-          </w:p>
-        </w:tc>
-        <w:tc>
-          <w:tcPr>
-            <w:tcW w:type="dxa" w:w="1440"/>
-            <w:shd w:val="clear" w:color="auto" w:fill="FFFFFF"/>
-          </w:tcPr>
-          <w:p>
-            <w:r/>
-            <w:r>
-              <w:rPr>
-                <w:rFonts w:ascii="Calibri" w:hAnsi="Calibri"/>
-                <w:b w:val="0"/>
-                <w:i w:val="0"/>
-                <w:sz w:val="18"/>
-              </w:rPr>
-              <w:t>—</w:t>
-            </w:r>
-          </w:p>
-        </w:tc>
-        <w:tc>
-          <w:tcPr>
-            <w:tcW w:type="dxa" w:w="1440"/>
-            <w:shd w:val="clear" w:color="auto" w:fill="FFFFFF"/>
-          </w:tcPr>
-          <w:p>
-            <w:r/>
-            <w:r>
-              <w:rPr>
-                <w:rFonts w:ascii="Calibri" w:hAnsi="Calibri"/>
-                <w:b w:val="0"/>
-                <w:i w:val="0"/>
-                <w:sz w:val="18"/>
-              </w:rPr>
-              <w:t>—</w:t>
-            </w:r>
-          </w:p>
-        </w:tc>
-        <w:tc>
-          <w:tcPr>
-            <w:tcW w:type="dxa" w:w="1296"/>
-            <w:shd w:val="clear" w:color="auto" w:fill="FFFFFF"/>
-          </w:tcPr>
-          <w:p>
-            <w:r/>
-            <w:r>
-              <w:rPr>
-                <w:rFonts w:ascii="Calibri" w:hAnsi="Calibri"/>
-                <w:b w:val="0"/>
-                <w:i w:val="0"/>
-                <w:sz w:val="18"/>
-              </w:rPr>
-              <w:t>—</w:t>
-            </w:r>
-          </w:p>
-        </w:tc>
-        <w:tc>
-          <w:tcPr>
-            <w:tcW w:type="dxa" w:w="1296"/>
-            <w:shd w:val="clear" w:color="auto" w:fill="FFFFFF"/>
-          </w:tcPr>
-          <w:p>
-            <w:r/>
-            <w:r>
-              <w:rPr>
-                <w:rFonts w:ascii="Calibri" w:hAnsi="Calibri"/>
-                <w:b w:val="0"/>
-                <w:i w:val="0"/>
-                <w:sz w:val="18"/>
-              </w:rPr>
-              <w:t>1 Jun</w:t>
-            </w:r>
-          </w:p>
-        </w:tc>
-      </w:tr>
-      <w:tr>
-        <w:tc>
-          <w:tcPr>
-            <w:tcW w:type="dxa" w:w="2592"/>
-            <w:shd w:val="clear" w:color="auto" w:fill="F2F2F2"/>
-          </w:tcPr>
-          <w:p>
-            <w:r/>
-            <w:r>
-              <w:rPr>
-                <w:rFonts w:ascii="Calibri" w:hAnsi="Calibri"/>
-                <w:b w:val="0"/>
-                <w:i w:val="0"/>
-                <w:sz w:val="18"/>
-              </w:rPr>
-              <w:t>dipali koche</w:t>
-            </w:r>
-          </w:p>
-        </w:tc>
-        <w:tc>
-          <w:tcPr>
-            <w:tcW w:type="dxa" w:w="2592"/>
-            <w:shd w:val="clear" w:color="auto" w:fill="F2F2F2"/>
-          </w:tcPr>
-          <w:p>
-            <w:r/>
-            <w:r>
-              <w:rPr>
-                <w:rFonts w:ascii="Calibri" w:hAnsi="Calibri"/>
-                <w:b w:val="0"/>
-                <w:i w:val="0"/>
-                <w:sz w:val="18"/>
-              </w:rPr>
-              <w:t>bluemantis.com</w:t>
-            </w:r>
-          </w:p>
-        </w:tc>
-        <w:tc>
-          <w:tcPr>
-            <w:tcW w:type="dxa" w:w="1440"/>
-            <w:shd w:val="clear" w:color="auto" w:fill="F2F2F2"/>
-          </w:tcPr>
-          <w:p>
-            <w:r/>
-            <w:r>
-              <w:rPr>
-                <w:rFonts w:ascii="Calibri" w:hAnsi="Calibri"/>
-                <w:b w:val="0"/>
-                <w:i w:val="0"/>
-                <w:sz w:val="18"/>
-              </w:rPr>
-              <w:t>—</w:t>
-            </w:r>
-          </w:p>
-        </w:tc>
-        <w:tc>
-          <w:tcPr>
-            <w:tcW w:type="dxa" w:w="1440"/>
-            <w:shd w:val="clear" w:color="auto" w:fill="F2F2F2"/>
-          </w:tcPr>
-          <w:p>
-            <w:r/>
-            <w:r>
-              <w:rPr>
-                <w:rFonts w:ascii="Calibri" w:hAnsi="Calibri"/>
-                <w:b w:val="0"/>
-                <w:i w:val="0"/>
-                <w:sz w:val="18"/>
-              </w:rPr>
-              <w:t>—</w:t>
-            </w:r>
-          </w:p>
-        </w:tc>
-        <w:tc>
-          <w:tcPr>
-            <w:tcW w:type="dxa" w:w="1296"/>
-            <w:shd w:val="clear" w:color="auto" w:fill="F2F2F2"/>
-          </w:tcPr>
-          <w:p>
-            <w:r/>
-            <w:r>
-              <w:rPr>
-                <w:rFonts w:ascii="Calibri" w:hAnsi="Calibri"/>
-                <w:b w:val="0"/>
-                <w:i w:val="0"/>
-                <w:sz w:val="18"/>
-              </w:rPr>
-              <w:t>—</w:t>
-            </w:r>
-          </w:p>
-        </w:tc>
-        <w:tc>
-          <w:tcPr>
-            <w:tcW w:type="dxa" w:w="1296"/>
-            <w:shd w:val="clear" w:color="auto" w:fill="F2F2F2"/>
-          </w:tcPr>
-          <w:p>
-            <w:r/>
-            <w:r>
-              <w:rPr>
-                <w:rFonts w:ascii="Calibri" w:hAnsi="Calibri"/>
-                <w:b w:val="0"/>
-                <w:i w:val="0"/>
-                <w:sz w:val="18"/>
-              </w:rPr>
-              <w:t>1 Jun</w:t>
-            </w:r>
-          </w:p>
-        </w:tc>
-      </w:tr>
-      <w:tr>
-        <w:tc>
-          <w:tcPr>
-            <w:tcW w:type="dxa" w:w="2592"/>
-            <w:shd w:val="clear" w:color="auto" w:fill="FFFFFF"/>
-          </w:tcPr>
-          <w:p>
-            <w:r/>
-            <w:r>
-              <w:rPr>
-                <w:rFonts w:ascii="Calibri" w:hAnsi="Calibri"/>
-                <w:b w:val="0"/>
-                <w:i w:val="0"/>
-                <w:sz w:val="18"/>
-              </w:rPr>
-              <w:t>chris</w:t>
-            </w:r>
-          </w:p>
-        </w:tc>
-        <w:tc>
-          <w:tcPr>
-            <w:tcW w:type="dxa" w:w="2592"/>
-            <w:shd w:val="clear" w:color="auto" w:fill="FFFFFF"/>
-          </w:tcPr>
-          <w:p>
-            <w:r/>
-            <w:r>
-              <w:rPr>
-                <w:rFonts w:ascii="Calibri" w:hAnsi="Calibri"/>
-                <w:b w:val="0"/>
-                <w:i w:val="0"/>
-                <w:sz w:val="18"/>
-              </w:rPr>
-              <w:t>aliando.com</w:t>
-            </w:r>
-          </w:p>
-        </w:tc>
-        <w:tc>
-          <w:tcPr>
-            <w:tcW w:type="dxa" w:w="1440"/>
-            <w:shd w:val="clear" w:color="auto" w:fill="FFFFFF"/>
-          </w:tcPr>
-          <w:p>
-            <w:r/>
-            <w:r>
-              <w:rPr>
-                <w:rFonts w:ascii="Calibri" w:hAnsi="Calibri"/>
-                <w:b w:val="0"/>
-                <w:i w:val="0"/>
-                <w:sz w:val="18"/>
-              </w:rPr>
-              <w:t>—</w:t>
-            </w:r>
-          </w:p>
-        </w:tc>
-        <w:tc>
-          <w:tcPr>
-            <w:tcW w:type="dxa" w:w="1440"/>
-            <w:shd w:val="clear" w:color="auto" w:fill="FFFFFF"/>
-          </w:tcPr>
-          <w:p>
-            <w:r/>
-            <w:r>
-              <w:rPr>
-                <w:rFonts w:ascii="Calibri" w:hAnsi="Calibri"/>
-                <w:b w:val="0"/>
-                <w:i w:val="0"/>
-                <w:sz w:val="18"/>
-              </w:rPr>
-              <w:t>—</w:t>
-            </w:r>
-          </w:p>
-        </w:tc>
-        <w:tc>
-          <w:tcPr>
-            <w:tcW w:type="dxa" w:w="1296"/>
-            <w:shd w:val="clear" w:color="auto" w:fill="FFFFFF"/>
-          </w:tcPr>
-          <w:p>
-            <w:r/>
-            <w:r>
-              <w:rPr>
-                <w:rFonts w:ascii="Calibri" w:hAnsi="Calibri"/>
-                <w:b w:val="0"/>
-                <w:i w:val="0"/>
-                <w:sz w:val="18"/>
-              </w:rPr>
-              <w:t>—</w:t>
-            </w:r>
-          </w:p>
-        </w:tc>
-        <w:tc>
-          <w:tcPr>
-            <w:tcW w:type="dxa" w:w="1296"/>
-            <w:shd w:val="clear" w:color="auto" w:fill="FFFFFF"/>
-          </w:tcPr>
-          <w:p>
-            <w:r/>
-            <w:r>
-              <w:rPr>
-                <w:rFonts w:ascii="Calibri" w:hAnsi="Calibri"/>
-                <w:b w:val="0"/>
-                <w:i w:val="0"/>
-                <w:sz w:val="18"/>
-              </w:rPr>
-              <w:t>4 Jun</w:t>
-            </w:r>
-          </w:p>
-        </w:tc>
-      </w:tr>
-      <w:tr>
-        <w:tc>
-          <w:tcPr>
-            <w:tcW w:type="dxa" w:w="2592"/>
-            <w:shd w:val="clear" w:color="auto" w:fill="F2F2F2"/>
-          </w:tcPr>
-          <w:p>
-            <w:r/>
-            <w:r>
-              <w:rPr>
-                <w:rFonts w:ascii="Calibri" w:hAnsi="Calibri"/>
-                <w:b w:val="0"/>
-                <w:i w:val="0"/>
-                <w:sz w:val="18"/>
-              </w:rPr>
-              <w:t>dene donovan</w:t>
-            </w:r>
-          </w:p>
-        </w:tc>
-        <w:tc>
-          <w:tcPr>
-            <w:tcW w:type="dxa" w:w="2592"/>
-            <w:shd w:val="clear" w:color="auto" w:fill="F2F2F2"/>
-          </w:tcPr>
-          <w:p>
-            <w:r/>
-            <w:r>
-              <w:rPr>
-                <w:rFonts w:ascii="Calibri" w:hAnsi="Calibri"/>
-                <w:b w:val="0"/>
-                <w:i w:val="0"/>
-                <w:sz w:val="18"/>
-              </w:rPr>
-              <w:t>ingrammicro.com</w:t>
-            </w:r>
-          </w:p>
-        </w:tc>
-        <w:tc>
-          <w:tcPr>
-            <w:tcW w:type="dxa" w:w="1440"/>
-            <w:shd w:val="clear" w:color="auto" w:fill="F2F2F2"/>
-          </w:tcPr>
-          <w:p>
-            <w:r/>
-            <w:r>
-              <w:rPr>
-                <w:rFonts w:ascii="Calibri" w:hAnsi="Calibri"/>
-                <w:b w:val="0"/>
-                <w:i w:val="0"/>
-                <w:sz w:val="18"/>
-              </w:rPr>
-              <w:t>—</w:t>
-            </w:r>
-          </w:p>
-        </w:tc>
-        <w:tc>
-          <w:tcPr>
-            <w:tcW w:type="dxa" w:w="1440"/>
-            <w:shd w:val="clear" w:color="auto" w:fill="F2F2F2"/>
-          </w:tcPr>
-          <w:p>
-            <w:r/>
-            <w:r>
-              <w:rPr>
-                <w:rFonts w:ascii="Calibri" w:hAnsi="Calibri"/>
-                <w:b w:val="0"/>
-                <w:i w:val="0"/>
-                <w:sz w:val="18"/>
-              </w:rPr>
-              <w:t>—</w:t>
-            </w:r>
-          </w:p>
-        </w:tc>
-        <w:tc>
-          <w:tcPr>
-            <w:tcW w:type="dxa" w:w="1296"/>
-            <w:shd w:val="clear" w:color="auto" w:fill="F2F2F2"/>
-          </w:tcPr>
-          <w:p>
-            <w:r/>
-            <w:r>
-              <w:rPr>
-                <w:rFonts w:ascii="Calibri" w:hAnsi="Calibri"/>
-                <w:b w:val="0"/>
-                <w:i w:val="0"/>
-                <w:sz w:val="18"/>
-              </w:rPr>
-              <w:t>—</w:t>
-            </w:r>
-          </w:p>
-        </w:tc>
-        <w:tc>
-          <w:tcPr>
-            <w:tcW w:type="dxa" w:w="1296"/>
-            <w:shd w:val="clear" w:color="auto" w:fill="F2F2F2"/>
-          </w:tcPr>
-          <w:p>
-            <w:r/>
-            <w:r>
-              <w:rPr>
-                <w:rFonts w:ascii="Calibri" w:hAnsi="Calibri"/>
-                <w:b w:val="0"/>
-                <w:i w:val="0"/>
-                <w:sz w:val="18"/>
-              </w:rPr>
-              <w:t>9 Jun</w:t>
-            </w:r>
-          </w:p>
-        </w:tc>
-      </w:tr>
-    </w:tbl>
-    <w:p/>
-    <w:tbl>
-      <w:tblPr>
-        <w:tblStyle w:val="TableGrid"/>
-        <w:tblW w:type="auto" w:w="0"/>
-        <w:jc w:val="left"/>
-        <w:tblLook w:firstColumn="1" w:firstRow="1" w:lastColumn="0" w:lastRow="0" w:noHBand="0" w:noVBand="1" w:val="04A0"/>
-      </w:tblPr>
-      <w:tblGrid>
-        <w:gridCol w:w="5100"/>
-        <w:gridCol w:w="5100"/>
-      </w:tblGrid>
-      <w:tr>
-        <w:tc>
-          <w:tcPr>
-            <w:tcW w:type="dxa" w:w="4896"/>
-            <w:shd w:val="clear" w:color="auto" w:fill="FFFFFF"/>
-          </w:tcPr>
-          <w:p>
-            <w:r>
-              <w:drawing>
-                <wp:inline xmlns:a="http://schemas.openxmlformats.org/drawingml/2006/main" xmlns:pic="http://schemas.openxmlformats.org/drawingml/2006/picture">
-                  <wp:extent cx="3017520" cy="1002548"/>
-                  <wp:docPr id="5" name="Picture 5"/>
+                  <wp:docPr id="6" name="Picture 6"/>
                   <wp:cNvGraphicFramePr>
                     <a:graphicFrameLocks noChangeAspect="1"/>
                   </wp:cNvGraphicFramePr>
@@ -4014,804 +3416,6 @@
                         </pic:nvPicPr>
                         <pic:blipFill>
                           <a:blip r:embed="rId13"/>
-                          <a:stretch>
-                            <a:fillRect/>
-                          </a:stretch>
-                        </pic:blipFill>
-                        <pic:spPr>
-                          <a:xfrm>
-                            <a:off x="0" y="0"/>
-                            <a:ext cx="3017520" cy="1002548"/>
-                          </a:xfrm>
-                          <a:prstGeom prst="rect"/>
-                        </pic:spPr>
-                      </pic:pic>
-                    </a:graphicData>
-                  </a:graphic>
-                </wp:inline>
-              </w:drawing>
-            </w:r>
-          </w:p>
-        </w:tc>
-        <w:tc>
-          <w:tcPr>
-            <w:tcW w:type="dxa" w:w="4896"/>
-            <w:shd w:val="clear" w:color="auto" w:fill="FFFFFF"/>
-          </w:tcPr>
-          <w:p>
-            <w:r>
-              <w:drawing>
-                <wp:inline xmlns:a="http://schemas.openxmlformats.org/drawingml/2006/main" xmlns:pic="http://schemas.openxmlformats.org/drawingml/2006/picture">
-                  <wp:extent cx="3017520" cy="1225441"/>
-                  <wp:docPr id="6" name="Picture 6"/>
-                  <wp:cNvGraphicFramePr>
-                    <a:graphicFrameLocks noChangeAspect="1"/>
-                  </wp:cNvGraphicFramePr>
-                  <a:graphic>
-                    <a:graphicData uri="http://schemas.openxmlformats.org/drawingml/2006/picture">
-                      <pic:pic>
-                        <pic:nvPicPr>
-                          <pic:cNvPr id="0" name="image.png"/>
-                          <pic:cNvPicPr/>
-                        </pic:nvPicPr>
-                        <pic:blipFill>
-                          <a:blip r:embed="rId10"/>
-                          <a:stretch>
-                            <a:fillRect/>
-                          </a:stretch>
-                        </pic:blipFill>
-                        <pic:spPr>
-                          <a:xfrm>
-                            <a:off x="0" y="0"/>
-                            <a:ext cx="3017520" cy="1225441"/>
-                          </a:xfrm>
-                          <a:prstGeom prst="rect"/>
-                        </pic:spPr>
-                      </pic:pic>
-                    </a:graphicData>
-                  </a:graphic>
-                </wp:inline>
-              </w:drawing>
-            </w:r>
-          </w:p>
-        </w:tc>
-      </w:tr>
-    </w:tbl>
-    <w:p/>
-    <w:p>
-      <w:pPr>
-        <w:spacing w:before="200" w:after="40"/>
-        <w:jc w:val="left"/>
-      </w:pPr>
-      <w:r>
-        <w:rPr>
-          <w:rFonts w:ascii="Calibri" w:hAnsi="Calibri"/>
-          <w:b/>
-          <w:i w:val="0"/>
-          <w:color w:val="1F2937"/>
-          <w:sz w:val="20"/>
-        </w:rPr>
-        <w:t>Top pages visited</w:t>
-      </w:r>
-    </w:p>
-    <w:tbl>
-      <w:tblPr>
-        <w:tblStyle w:val="TableGrid"/>
-        <w:tblW w:type="auto" w:w="0"/>
-        <w:jc w:val="left"/>
-        <w:tblLook w:firstColumn="1" w:firstRow="1" w:lastColumn="0" w:lastRow="0" w:noHBand="0" w:noVBand="1" w:val="04A0"/>
-      </w:tblPr>
-      <w:tblGrid>
-        <w:gridCol w:w="5100"/>
-        <w:gridCol w:w="5100"/>
-      </w:tblGrid>
-      <w:tr>
-        <w:tc>
-          <w:tcPr>
-            <w:tcW w:type="dxa" w:w="6480"/>
-            <w:shd w:val="clear" w:color="auto" w:fill="1F2937"/>
-            <w:vAlign w:val="center"/>
-          </w:tcPr>
-          <w:p>
-            <w:r/>
-            <w:r>
-              <w:rPr>
-                <w:rFonts w:ascii="Calibri" w:hAnsi="Calibri"/>
-                <w:b/>
-                <w:i w:val="0"/>
-                <w:color w:val="FFFFFF"/>
-                <w:sz w:val="18"/>
-              </w:rPr>
-              <w:t>Page</w:t>
-            </w:r>
-          </w:p>
-        </w:tc>
-        <w:tc>
-          <w:tcPr>
-            <w:tcW w:type="dxa" w:w="1152"/>
-            <w:shd w:val="clear" w:color="auto" w:fill="1F2937"/>
-            <w:vAlign w:val="center"/>
-          </w:tcPr>
-          <w:p>
-            <w:r/>
-            <w:r>
-              <w:rPr>
-                <w:rFonts w:ascii="Calibri" w:hAnsi="Calibri"/>
-                <w:b/>
-                <w:i w:val="0"/>
-                <w:color w:val="FFFFFF"/>
-                <w:sz w:val="18"/>
-              </w:rPr>
-              <w:t>Views</w:t>
-            </w:r>
-          </w:p>
-        </w:tc>
-      </w:tr>
-    </w:tbl>
-    <w:p/>
-    <w:p>
-      <w:pPr>
-        <w:spacing w:before="200" w:after="40"/>
-        <w:jc w:val="left"/>
-      </w:pPr>
-      <w:r>
-        <w:rPr>
-          <w:rFonts w:ascii="Calibri" w:hAnsi="Calibri"/>
-          <w:b/>
-          <w:i w:val="0"/>
-          <w:color w:val="1F2937"/>
-          <w:sz w:val="24"/>
-        </w:rPr>
-        <w:t>Blackstone incidents — ADO status</w:t>
-      </w:r>
-    </w:p>
-    <w:p>
-      <w:pPr>
-        <w:spacing w:before="0" w:after="80"/>
-        <w:jc w:val="left"/>
-      </w:pPr>
-      <w:r>
-        <w:rPr>
-          <w:rFonts w:ascii="Calibri" w:hAnsi="Calibri"/>
-          <w:b w:val="0"/>
-          <w:i w:val="0"/>
-          <w:color w:val="757575"/>
-          <w:sz w:val="18"/>
-        </w:rPr>
-        <w:t xml:space="preserve">ADO query: </w:t>
-      </w:r>
-      <w:r>
-        <w:rPr>
-          <w:rFonts w:ascii="Calibri" w:hAnsi="Calibri"/>
-          <w:b w:val="0"/>
-          <w:i w:val="0"/>
-          <w:color w:val="0070C0"/>
-          <w:sz w:val="18"/>
-        </w:rPr>
-        <w:t>https://dev.azure.com/CoreStack-Tech/Product_Mgmt/_workitems?filter=tags+eq+'Blackstone'</w:t>
-      </w:r>
-    </w:p>
-    <w:tbl>
-      <w:tblPr>
-        <w:tblStyle w:val="TableGrid"/>
-        <w:tblW w:type="auto" w:w="0"/>
-        <w:jc w:val="left"/>
-        <w:tblLook w:firstColumn="1" w:firstRow="1" w:lastColumn="0" w:lastRow="0" w:noHBand="0" w:noVBand="1" w:val="04A0"/>
-      </w:tblPr>
-      <w:tblGrid>
-        <w:gridCol w:w="1457"/>
-        <w:gridCol w:w="1457"/>
-        <w:gridCol w:w="1457"/>
-        <w:gridCol w:w="1457"/>
-        <w:gridCol w:w="1457"/>
-        <w:gridCol w:w="1457"/>
-        <w:gridCol w:w="1457"/>
-      </w:tblGrid>
-      <w:tr>
-        <w:tc>
-          <w:tcPr>
-            <w:tcW w:type="dxa" w:w="864"/>
-            <w:shd w:val="clear" w:color="auto" w:fill="1F2937"/>
-            <w:vAlign w:val="center"/>
-          </w:tcPr>
-          <w:p>
-            <w:r/>
-            <w:r>
-              <w:rPr>
-                <w:rFonts w:ascii="Calibri" w:hAnsi="Calibri"/>
-                <w:b/>
-                <w:i w:val="0"/>
-                <w:color w:val="FFFFFF"/>
-                <w:sz w:val="18"/>
-              </w:rPr>
-              <w:t>ID</w:t>
-            </w:r>
-          </w:p>
-        </w:tc>
-        <w:tc>
-          <w:tcPr>
-            <w:tcW w:type="dxa" w:w="4032"/>
-            <w:shd w:val="clear" w:color="auto" w:fill="1F2937"/>
-            <w:vAlign w:val="center"/>
-          </w:tcPr>
-          <w:p>
-            <w:r/>
-            <w:r>
-              <w:rPr>
-                <w:rFonts w:ascii="Calibri" w:hAnsi="Calibri"/>
-                <w:b/>
-                <w:i w:val="0"/>
-                <w:color w:val="FFFFFF"/>
-                <w:sz w:val="18"/>
-              </w:rPr>
-              <w:t>Title</w:t>
-            </w:r>
-          </w:p>
-        </w:tc>
-        <w:tc>
-          <w:tcPr>
-            <w:tcW w:type="dxa" w:w="2016"/>
-            <w:shd w:val="clear" w:color="auto" w:fill="1F2937"/>
-            <w:vAlign w:val="center"/>
-          </w:tcPr>
-          <w:p>
-            <w:r/>
-            <w:r>
-              <w:rPr>
-                <w:rFonts w:ascii="Calibri" w:hAnsi="Calibri"/>
-                <w:b/>
-                <w:i w:val="0"/>
-                <w:color w:val="FFFFFF"/>
-                <w:sz w:val="18"/>
-              </w:rPr>
-              <w:t>Assigned to</w:t>
-            </w:r>
-          </w:p>
-        </w:tc>
-        <w:tc>
-          <w:tcPr>
-            <w:tcW w:type="dxa" w:w="1296"/>
-            <w:shd w:val="clear" w:color="auto" w:fill="1F2937"/>
-            <w:vAlign w:val="center"/>
-          </w:tcPr>
-          <w:p>
-            <w:r/>
-            <w:r>
-              <w:rPr>
-                <w:rFonts w:ascii="Calibri" w:hAnsi="Calibri"/>
-                <w:b/>
-                <w:i w:val="0"/>
-                <w:color w:val="FFFFFF"/>
-                <w:sz w:val="18"/>
-              </w:rPr>
-              <w:t>Bundle</w:t>
-            </w:r>
-          </w:p>
-        </w:tc>
-        <w:tc>
-          <w:tcPr>
-            <w:tcW w:type="dxa" w:w="576"/>
-            <w:shd w:val="clear" w:color="auto" w:fill="1F2937"/>
-            <w:vAlign w:val="center"/>
-          </w:tcPr>
-          <w:p>
-            <w:r/>
-            <w:r>
-              <w:rPr>
-                <w:rFonts w:ascii="Calibri" w:hAnsi="Calibri"/>
-                <w:b/>
-                <w:i w:val="0"/>
-                <w:color w:val="FFFFFF"/>
-                <w:sz w:val="18"/>
-              </w:rPr>
-              <w:t>Pri</w:t>
-            </w:r>
-          </w:p>
-        </w:tc>
-        <w:tc>
-          <w:tcPr>
-            <w:tcW w:type="dxa" w:w="1440"/>
-            <w:shd w:val="clear" w:color="auto" w:fill="1F2937"/>
-            <w:vAlign w:val="center"/>
-          </w:tcPr>
-          <w:p>
-            <w:r/>
-            <w:r>
-              <w:rPr>
-                <w:rFonts w:ascii="Calibri" w:hAnsi="Calibri"/>
-                <w:b/>
-                <w:i w:val="0"/>
-                <w:color w:val="FFFFFF"/>
-                <w:sz w:val="18"/>
-              </w:rPr>
-              <w:t>State</w:t>
-            </w:r>
-          </w:p>
-        </w:tc>
-        <w:tc>
-          <w:tcPr>
-            <w:tcW w:type="dxa" w:w="1008"/>
-            <w:shd w:val="clear" w:color="auto" w:fill="1F2937"/>
-            <w:vAlign w:val="center"/>
-          </w:tcPr>
-          <w:p>
-            <w:r/>
-            <w:r>
-              <w:rPr>
-                <w:rFonts w:ascii="Calibri" w:hAnsi="Calibri"/>
-                <w:b/>
-                <w:i w:val="0"/>
-                <w:color w:val="FFFFFF"/>
-                <w:sz w:val="18"/>
-              </w:rPr>
-              <w:t>Type</w:t>
-            </w:r>
-          </w:p>
-        </w:tc>
-      </w:tr>
-      <w:tr>
-        <w:tc>
-          <w:tcPr>
-            <w:tcW w:type="dxa" w:w="864"/>
-            <w:shd w:val="clear" w:color="auto" w:fill="F2F2F2"/>
-          </w:tcPr>
-          <w:p>
-            <w:r/>
-            <w:r>
-              <w:rPr>
-                <w:rFonts w:ascii="Calibri" w:hAnsi="Calibri"/>
-                <w:b w:val="0"/>
-                <w:i w:val="0"/>
-                <w:sz w:val="18"/>
-              </w:rPr>
-              <w:t>131077</w:t>
-            </w:r>
-          </w:p>
-        </w:tc>
-        <w:tc>
-          <w:tcPr>
-            <w:tcW w:type="dxa" w:w="4032"/>
-            <w:shd w:val="clear" w:color="auto" w:fill="F2F2F2"/>
-          </w:tcPr>
-          <w:p>
-            <w:r/>
-            <w:r>
-              <w:rPr>
-                <w:rFonts w:ascii="Calibri" w:hAnsi="Calibri"/>
-                <w:b w:val="0"/>
-                <w:i w:val="0"/>
-                <w:sz w:val="18"/>
-              </w:rPr>
-              <w:t>Blackstone -Rover - Forecast</w:t>
-            </w:r>
-          </w:p>
-        </w:tc>
-        <w:tc>
-          <w:tcPr>
-            <w:tcW w:type="dxa" w:w="2016"/>
-            <w:shd w:val="clear" w:color="auto" w:fill="F2F2F2"/>
-          </w:tcPr>
-          <w:p>
-            <w:r/>
-            <w:r>
-              <w:rPr>
-                <w:rFonts w:ascii="Calibri" w:hAnsi="Calibri"/>
-                <w:b w:val="0"/>
-                <w:i w:val="0"/>
-                <w:sz w:val="18"/>
-              </w:rPr>
-              <w:t>Chitra J</w:t>
-            </w:r>
-          </w:p>
-        </w:tc>
-        <w:tc>
-          <w:tcPr>
-            <w:tcW w:type="dxa" w:w="1296"/>
-            <w:shd w:val="clear" w:color="auto" w:fill="F2F2F2"/>
-          </w:tcPr>
-          <w:p>
-            <w:r/>
-            <w:r>
-              <w:rPr>
-                <w:rFonts w:ascii="Calibri" w:hAnsi="Calibri"/>
-                <w:b w:val="0"/>
-                <w:i w:val="0"/>
-                <w:sz w:val="18"/>
-              </w:rPr>
-              <w:t>AI</w:t>
-            </w:r>
-          </w:p>
-        </w:tc>
-        <w:tc>
-          <w:tcPr>
-            <w:tcW w:type="dxa" w:w="576"/>
-            <w:shd w:val="clear" w:color="auto" w:fill="F2F2F2"/>
-          </w:tcPr>
-          <w:p>
-            <w:r/>
-            <w:r>
-              <w:rPr>
-                <w:rFonts w:ascii="Calibri" w:hAnsi="Calibri"/>
-                <w:b w:val="0"/>
-                <w:i w:val="0"/>
-                <w:sz w:val="18"/>
-              </w:rPr>
-              <w:t>P3</w:t>
-            </w:r>
-          </w:p>
-        </w:tc>
-        <w:tc>
-          <w:tcPr>
-            <w:tcW w:type="dxa" w:w="1440"/>
-            <w:shd w:val="clear" w:color="auto" w:fill="F2F2F2"/>
-          </w:tcPr>
-          <w:p>
-            <w:r/>
-            <w:r>
-              <w:rPr>
-                <w:rFonts w:ascii="Calibri" w:hAnsi="Calibri"/>
-                <w:b w:val="0"/>
-                <w:i w:val="0"/>
-                <w:sz w:val="18"/>
-              </w:rPr>
-              <w:t>Awaiting Deployment</w:t>
-            </w:r>
-          </w:p>
-        </w:tc>
-        <w:tc>
-          <w:tcPr>
-            <w:tcW w:type="dxa" w:w="1008"/>
-            <w:shd w:val="clear" w:color="auto" w:fill="F2F2F2"/>
-          </w:tcPr>
-          <w:p>
-            <w:r/>
-            <w:r>
-              <w:rPr>
-                <w:rFonts w:ascii="Calibri" w:hAnsi="Calibri"/>
-                <w:b w:val="0"/>
-                <w:i w:val="0"/>
-                <w:sz w:val="18"/>
-              </w:rPr>
-              <w:t>Incident</w:t>
-            </w:r>
-          </w:p>
-        </w:tc>
-      </w:tr>
-      <w:tr>
-        <w:tc>
-          <w:tcPr>
-            <w:tcW w:type="dxa" w:w="864"/>
-            <w:shd w:val="clear" w:color="auto" w:fill="FFFFFF"/>
-          </w:tcPr>
-          <w:p>
-            <w:r/>
-            <w:r>
-              <w:rPr>
-                <w:rFonts w:ascii="Calibri" w:hAnsi="Calibri"/>
-                <w:b w:val="0"/>
-                <w:i w:val="0"/>
-                <w:sz w:val="18"/>
-              </w:rPr>
-              <w:t>131910</w:t>
-            </w:r>
-          </w:p>
-        </w:tc>
-        <w:tc>
-          <w:tcPr>
-            <w:tcW w:type="dxa" w:w="4032"/>
-            <w:shd w:val="clear" w:color="auto" w:fill="FFFFFF"/>
-          </w:tcPr>
-          <w:p>
-            <w:r/>
-            <w:r>
-              <w:rPr>
-                <w:rFonts w:ascii="Calibri" w:hAnsi="Calibri"/>
-                <w:b w:val="0"/>
-                <w:i w:val="0"/>
-                <w:sz w:val="18"/>
-              </w:rPr>
-              <w:t>Duplicate Recommendations Visible in Custom Optimize Dashboard</w:t>
-            </w:r>
-          </w:p>
-        </w:tc>
-        <w:tc>
-          <w:tcPr>
-            <w:tcW w:type="dxa" w:w="2016"/>
-            <w:shd w:val="clear" w:color="auto" w:fill="FFFFFF"/>
-          </w:tcPr>
-          <w:p>
-            <w:r/>
-            <w:r>
-              <w:rPr>
-                <w:rFonts w:ascii="Calibri" w:hAnsi="Calibri"/>
-                <w:b w:val="0"/>
-                <w:i w:val="0"/>
-                <w:sz w:val="18"/>
-              </w:rPr>
-              <w:t>Naveen Kumar K</w:t>
-            </w:r>
-          </w:p>
-        </w:tc>
-        <w:tc>
-          <w:tcPr>
-            <w:tcW w:type="dxa" w:w="1296"/>
-            <w:shd w:val="clear" w:color="auto" w:fill="FFFFFF"/>
-          </w:tcPr>
-          <w:p>
-            <w:r/>
-            <w:r>
-              <w:rPr>
-                <w:rFonts w:ascii="Calibri" w:hAnsi="Calibri"/>
-                <w:b w:val="0"/>
-                <w:i w:val="0"/>
-                <w:sz w:val="18"/>
-              </w:rPr>
-              <w:t>Professional Services</w:t>
-            </w:r>
-          </w:p>
-        </w:tc>
-        <w:tc>
-          <w:tcPr>
-            <w:tcW w:type="dxa" w:w="576"/>
-            <w:shd w:val="clear" w:color="auto" w:fill="FFFFFF"/>
-          </w:tcPr>
-          <w:p>
-            <w:r/>
-            <w:r>
-              <w:rPr>
-                <w:rFonts w:ascii="Calibri" w:hAnsi="Calibri"/>
-                <w:b w:val="0"/>
-                <w:i w:val="0"/>
-                <w:sz w:val="18"/>
-              </w:rPr>
-              <w:t>P2</w:t>
-            </w:r>
-          </w:p>
-        </w:tc>
-        <w:tc>
-          <w:tcPr>
-            <w:tcW w:type="dxa" w:w="1440"/>
-            <w:shd w:val="clear" w:color="auto" w:fill="FFFFFF"/>
-          </w:tcPr>
-          <w:p>
-            <w:r/>
-            <w:r>
-              <w:rPr>
-                <w:rFonts w:ascii="Calibri" w:hAnsi="Calibri"/>
-                <w:b w:val="0"/>
-                <w:i w:val="0"/>
-                <w:sz w:val="18"/>
-              </w:rPr>
-              <w:t>Awaiting Deployment</w:t>
-            </w:r>
-          </w:p>
-        </w:tc>
-        <w:tc>
-          <w:tcPr>
-            <w:tcW w:type="dxa" w:w="1008"/>
-            <w:shd w:val="clear" w:color="auto" w:fill="FFFFFF"/>
-          </w:tcPr>
-          <w:p>
-            <w:r/>
-            <w:r>
-              <w:rPr>
-                <w:rFonts w:ascii="Calibri" w:hAnsi="Calibri"/>
-                <w:b w:val="0"/>
-                <w:i w:val="0"/>
-                <w:sz w:val="18"/>
-              </w:rPr>
-              <w:t>Incident</w:t>
-            </w:r>
-          </w:p>
-        </w:tc>
-      </w:tr>
-      <w:tr>
-        <w:tc>
-          <w:tcPr>
-            <w:tcW w:type="dxa" w:w="864"/>
-            <w:shd w:val="clear" w:color="auto" w:fill="F2F2F2"/>
-          </w:tcPr>
-          <w:p>
-            <w:r/>
-            <w:r>
-              <w:rPr>
-                <w:rFonts w:ascii="Calibri" w:hAnsi="Calibri"/>
-                <w:b w:val="0"/>
-                <w:i w:val="0"/>
-                <w:sz w:val="18"/>
-              </w:rPr>
-              <w:t>134003</w:t>
-            </w:r>
-          </w:p>
-        </w:tc>
-        <w:tc>
-          <w:tcPr>
-            <w:tcW w:type="dxa" w:w="4032"/>
-            <w:shd w:val="clear" w:color="auto" w:fill="F2F2F2"/>
-          </w:tcPr>
-          <w:p>
-            <w:r/>
-            <w:r>
-              <w:rPr>
-                <w:rFonts w:ascii="Calibri" w:hAnsi="Calibri"/>
-                <w:b w:val="0"/>
-                <w:i w:val="0"/>
-                <w:sz w:val="18"/>
-              </w:rPr>
-              <w:t>Assessment Report UI Error Despite Successful Report Generation</w:t>
-            </w:r>
-          </w:p>
-        </w:tc>
-        <w:tc>
-          <w:tcPr>
-            <w:tcW w:type="dxa" w:w="2016"/>
-            <w:shd w:val="clear" w:color="auto" w:fill="F2F2F2"/>
-          </w:tcPr>
-          <w:p>
-            <w:r/>
-            <w:r>
-              <w:rPr>
-                <w:rFonts w:ascii="Calibri" w:hAnsi="Calibri"/>
-                <w:b w:val="0"/>
-                <w:i w:val="0"/>
-                <w:sz w:val="18"/>
-              </w:rPr>
-              <w:t>Zubair Hussain T</w:t>
-            </w:r>
-          </w:p>
-        </w:tc>
-        <w:tc>
-          <w:tcPr>
-            <w:tcW w:type="dxa" w:w="1296"/>
-            <w:shd w:val="clear" w:color="auto" w:fill="F2F2F2"/>
-          </w:tcPr>
-          <w:p>
-            <w:r/>
-            <w:r>
-              <w:rPr>
-                <w:rFonts w:ascii="Calibri" w:hAnsi="Calibri"/>
-                <w:b w:val="0"/>
-                <w:i w:val="0"/>
-                <w:sz w:val="18"/>
-              </w:rPr>
-              <w:t>FinOps</w:t>
-            </w:r>
-          </w:p>
-        </w:tc>
-        <w:tc>
-          <w:tcPr>
-            <w:tcW w:type="dxa" w:w="576"/>
-            <w:shd w:val="clear" w:color="auto" w:fill="F2F2F2"/>
-          </w:tcPr>
-          <w:p>
-            <w:r/>
-            <w:r>
-              <w:rPr>
-                <w:rFonts w:ascii="Calibri" w:hAnsi="Calibri"/>
-                <w:b w:val="0"/>
-                <w:i w:val="0"/>
-                <w:sz w:val="18"/>
-              </w:rPr>
-              <w:t>P2</w:t>
-            </w:r>
-          </w:p>
-        </w:tc>
-        <w:tc>
-          <w:tcPr>
-            <w:tcW w:type="dxa" w:w="1440"/>
-            <w:shd w:val="clear" w:color="auto" w:fill="F2F2F2"/>
-          </w:tcPr>
-          <w:p>
-            <w:r/>
-            <w:r>
-              <w:rPr>
-                <w:rFonts w:ascii="Calibri" w:hAnsi="Calibri"/>
-                <w:b w:val="0"/>
-                <w:i w:val="0"/>
-                <w:sz w:val="18"/>
-              </w:rPr>
-              <w:t>In Progress</w:t>
-            </w:r>
-          </w:p>
-        </w:tc>
-        <w:tc>
-          <w:tcPr>
-            <w:tcW w:type="dxa" w:w="1008"/>
-            <w:shd w:val="clear" w:color="auto" w:fill="F2F2F2"/>
-          </w:tcPr>
-          <w:p>
-            <w:r/>
-            <w:r>
-              <w:rPr>
-                <w:rFonts w:ascii="Calibri" w:hAnsi="Calibri"/>
-                <w:b w:val="0"/>
-                <w:i w:val="0"/>
-                <w:sz w:val="18"/>
-              </w:rPr>
-              <w:t>Incident</w:t>
-            </w:r>
-          </w:p>
-        </w:tc>
-      </w:tr>
-    </w:tbl>
-    <w:p/>
-    <w:tbl>
-      <w:tblPr>
-        <w:tblStyle w:val="TableGrid"/>
-        <w:tblW w:type="auto" w:w="0"/>
-        <w:jc w:val="left"/>
-        <w:tblLook w:firstColumn="1" w:firstRow="1" w:lastColumn="0" w:lastRow="0" w:noHBand="0" w:noVBand="1" w:val="04A0"/>
-      </w:tblPr>
-      <w:tblGrid>
-        <w:gridCol w:w="5100"/>
-        <w:gridCol w:w="5100"/>
-      </w:tblGrid>
-      <w:tr>
-        <w:tc>
-          <w:tcPr>
-            <w:tcW w:type="dxa" w:w="4896"/>
-            <w:shd w:val="clear" w:color="auto" w:fill="FFFFFF"/>
-          </w:tcPr>
-          <w:p>
-            <w:r>
-              <w:drawing>
-                <wp:inline xmlns:a="http://schemas.openxmlformats.org/drawingml/2006/main" xmlns:pic="http://schemas.openxmlformats.org/drawingml/2006/picture">
-                  <wp:extent cx="3017520" cy="2618226"/>
-                  <wp:docPr id="7" name="Picture 7"/>
-                  <wp:cNvGraphicFramePr>
-                    <a:graphicFrameLocks noChangeAspect="1"/>
-                  </wp:cNvGraphicFramePr>
-                  <a:graphic>
-                    <a:graphicData uri="http://schemas.openxmlformats.org/drawingml/2006/picture">
-                      <pic:pic>
-                        <pic:nvPicPr>
-                          <pic:cNvPr id="0" name="image.png"/>
-                          <pic:cNvPicPr/>
-                        </pic:nvPicPr>
-                        <pic:blipFill>
-                          <a:blip r:embed="rId11"/>
-                          <a:stretch>
-                            <a:fillRect/>
-                          </a:stretch>
-                        </pic:blipFill>
-                        <pic:spPr>
-                          <a:xfrm>
-                            <a:off x="0" y="0"/>
-                            <a:ext cx="3017520" cy="2618226"/>
-                          </a:xfrm>
-                          <a:prstGeom prst="rect"/>
-                        </pic:spPr>
-                      </pic:pic>
-                    </a:graphicData>
-                  </a:graphic>
-                </wp:inline>
-              </w:drawing>
-            </w:r>
-          </w:p>
-        </w:tc>
-        <w:tc>
-          <w:tcPr>
-            <w:tcW w:type="dxa" w:w="4896"/>
-            <w:shd w:val="clear" w:color="auto" w:fill="FFFFFF"/>
-          </w:tcPr>
-          <w:p>
-            <w:r>
-              <w:drawing>
-                <wp:inline xmlns:a="http://schemas.openxmlformats.org/drawingml/2006/main" xmlns:pic="http://schemas.openxmlformats.org/drawingml/2006/picture">
-                  <wp:extent cx="3017520" cy="2126502"/>
-                  <wp:docPr id="8" name="Picture 8"/>
-                  <wp:cNvGraphicFramePr>
-                    <a:graphicFrameLocks noChangeAspect="1"/>
-                  </wp:cNvGraphicFramePr>
-                  <a:graphic>
-                    <a:graphicData uri="http://schemas.openxmlformats.org/drawingml/2006/picture">
-                      <pic:pic>
-                        <pic:nvPicPr>
-                          <pic:cNvPr id="0" name="image.png"/>
-                          <pic:cNvPicPr/>
-                        </pic:nvPicPr>
-                        <pic:blipFill>
-                          <a:blip r:embed="rId12"/>
                           <a:stretch>
                             <a:fillRect/>
                           </a:stretch>

</xml_diff>

<commit_message>
Match June17 layout: single Pendo section combining EU + USEast
One document, one Pendo section showing all visitors with a Region column
and an EU/USEast active-visitor count summary line at the top. ADO incidents
appear once. Removed the duplicate two-section structure entirely.
</commit_message>
<xml_diff>
--- a/Blackstone_Scrum_20260618.docx
+++ b/Blackstone_Scrum_20260618.docx
@@ -31,7 +31,7 @@
           <w:color w:val="757575"/>
           <w:sz w:val="18"/>
         </w:rPr>
-        <w:t>Thursday, June 18, 2026   ·   Report generated 2:00 PM IST</w:t>
+        <w:t>Thursday, June 18, 2026   ·   Report generated 2:06 PM IST</w:t>
       </w:r>
     </w:p>
     <w:p>
@@ -798,7 +798,7 @@
           <w:color w:val="1F2937"/>
           <w:sz w:val="24"/>
         </w:rPr>
-        <w:t>Pendo engagement — EU (portal.corestack.io)  ·  last 3 days (16 Jun – 18 Jun)</w:t>
+        <w:t>Pendo engagement — Blackstone segment  ·  last 3 days (16 Jun–18 Jun)</w:t>
       </w:r>
     </w:p>
     <w:p>
@@ -814,7 +814,69 @@
           <w:color w:val="757575"/>
           <w:sz w:val="16"/>
         </w:rPr>
-        <w:t>Source: Blackstone Pendo segment only.  cs.support.blackstone@corestack.io excluded.  Grey rows = segment members with no activity in this window.</w:t>
+        <w:t>Source: Blackstone Pendo segment only.  cs.support.blackstone@corestack.io excluded from all counts.  Grey rows = segment members with no activity in this window.</w:t>
+      </w:r>
+    </w:p>
+    <w:p>
+      <w:pPr>
+        <w:spacing w:before="0" w:after="120"/>
+        <w:jc w:val="left"/>
+      </w:pPr>
+      <w:r>
+        <w:rPr>
+          <w:rFonts w:ascii="Calibri" w:hAnsi="Calibri"/>
+          <w:b/>
+          <w:i w:val="0"/>
+          <w:color w:val="1F2937"/>
+          <w:sz w:val="18"/>
+        </w:rPr>
+        <w:t xml:space="preserve">EU (portal.corestack.io): </w:t>
+      </w:r>
+      <w:r>
+        <w:rPr>
+          <w:rFonts w:ascii="Calibri" w:hAnsi="Calibri"/>
+          <w:b w:val="0"/>
+          <w:i w:val="0"/>
+          <w:color w:val="0070C0"/>
+          <w:sz w:val="18"/>
+        </w:rPr>
+        <w:t>5 active visitors</w:t>
+      </w:r>
+      <w:r>
+        <w:rPr>
+          <w:rFonts w:ascii="Calibri" w:hAnsi="Calibri"/>
+          <w:b/>
+          <w:i w:val="0"/>
+          <w:color w:val="1F2937"/>
+          <w:sz w:val="18"/>
+        </w:rPr>
+        <w:t xml:space="preserve">     USEast (useast.corestack.io): </w:t>
+      </w:r>
+      <w:r>
+        <w:rPr>
+          <w:rFonts w:ascii="Calibri" w:hAnsi="Calibri"/>
+          <w:b w:val="0"/>
+          <w:i w:val="0"/>
+          <w:color w:val="0070C0"/>
+          <w:sz w:val="18"/>
+        </w:rPr>
+        <w:t>6 active visitors</w:t>
+      </w:r>
+    </w:p>
+    <w:p>
+      <w:pPr>
+        <w:spacing w:before="200" w:after="40"/>
+        <w:jc w:val="left"/>
+      </w:pPr>
+      <w:r>
+        <w:rPr>
+          <w:rFonts w:ascii="Calibri" w:hAnsi="Calibri"/>
+          <w:b/>
+          <w:i w:val="0"/>
+          <w:color w:val="1F2937"/>
+          <w:sz w:val="20"/>
+        </w:rPr>
+        <w:t>Active visitors</w:t>
       </w:r>
     </w:p>
     <w:tbl>
@@ -825,17 +887,18 @@
         <w:tblLook w:firstColumn="1" w:firstRow="1" w:lastColumn="0" w:lastRow="0" w:noHBand="0" w:noVBand="1" w:val="04A0"/>
       </w:tblPr>
       <w:tblGrid>
-        <w:gridCol w:w="1700"/>
-        <w:gridCol w:w="1700"/>
-        <w:gridCol w:w="1700"/>
-        <w:gridCol w:w="1700"/>
-        <w:gridCol w:w="1700"/>
-        <w:gridCol w:w="1700"/>
+        <w:gridCol w:w="1457"/>
+        <w:gridCol w:w="1457"/>
+        <w:gridCol w:w="1457"/>
+        <w:gridCol w:w="1457"/>
+        <w:gridCol w:w="1457"/>
+        <w:gridCol w:w="1457"/>
+        <w:gridCol w:w="1457"/>
       </w:tblGrid>
       <w:tr>
         <w:tc>
           <w:tcPr>
-            <w:tcW w:type="dxa" w:w="2592"/>
+            <w:tcW w:type="dxa" w:w="2304"/>
             <w:shd w:val="clear" w:color="auto" w:fill="1F2937"/>
             <w:vAlign w:val="center"/>
           </w:tcPr>
@@ -849,13 +912,13 @@
                 <w:color w:val="FFFFFF"/>
                 <w:sz w:val="18"/>
               </w:rPr>
-              <w:t>Visitor</w:t>
+              <w:t>Visitor (Blackstone segment)</w:t>
             </w:r>
           </w:p>
         </w:tc>
         <w:tc>
           <w:tcPr>
-            <w:tcW w:type="dxa" w:w="2592"/>
+            <w:tcW w:type="dxa" w:w="2160"/>
             <w:shd w:val="clear" w:color="auto" w:fill="1F2937"/>
             <w:vAlign w:val="center"/>
           </w:tcPr>
@@ -875,7 +938,27 @@
         </w:tc>
         <w:tc>
           <w:tcPr>
-            <w:tcW w:type="dxa" w:w="1440"/>
+            <w:tcW w:type="dxa" w:w="1008"/>
+            <w:shd w:val="clear" w:color="auto" w:fill="1F2937"/>
+            <w:vAlign w:val="center"/>
+          </w:tcPr>
+          <w:p>
+            <w:r/>
+            <w:r>
+              <w:rPr>
+                <w:rFonts w:ascii="Calibri" w:hAnsi="Calibri"/>
+                <w:b/>
+                <w:i w:val="0"/>
+                <w:color w:val="FFFFFF"/>
+                <w:sz w:val="18"/>
+              </w:rPr>
+              <w:t>Region</w:t>
+            </w:r>
+          </w:p>
+        </w:tc>
+        <w:tc>
+          <w:tcPr>
+            <w:tcW w:type="dxa" w:w="1296"/>
             <w:shd w:val="clear" w:color="auto" w:fill="1F2937"/>
             <w:vAlign w:val="center"/>
           </w:tcPr>
@@ -895,7 +978,7 @@
         </w:tc>
         <w:tc>
           <w:tcPr>
-            <w:tcW w:type="dxa" w:w="1440"/>
+            <w:tcW w:type="dxa" w:w="1296"/>
             <w:shd w:val="clear" w:color="auto" w:fill="1F2937"/>
             <w:vAlign w:val="center"/>
           </w:tcPr>
@@ -915,7 +998,7 @@
         </w:tc>
         <w:tc>
           <w:tcPr>
-            <w:tcW w:type="dxa" w:w="1296"/>
+            <w:tcW w:type="dxa" w:w="1008"/>
             <w:shd w:val="clear" w:color="auto" w:fill="1F2937"/>
             <w:vAlign w:val="center"/>
           </w:tcPr>
@@ -957,7 +1040,7 @@
       <w:tr>
         <w:tc>
           <w:tcPr>
-            <w:tcW w:type="dxa" w:w="2592"/>
+            <w:tcW w:type="dxa" w:w="2304"/>
             <w:shd w:val="clear" w:color="auto" w:fill="F2F2F2"/>
           </w:tcPr>
           <w:p>
@@ -975,7 +1058,7 @@
         </w:tc>
         <w:tc>
           <w:tcPr>
-            <w:tcW w:type="dxa" w:w="2592"/>
+            <w:tcW w:type="dxa" w:w="2160"/>
             <w:shd w:val="clear" w:color="auto" w:fill="F2F2F2"/>
           </w:tcPr>
           <w:p>
@@ -993,7 +1076,7 @@
         </w:tc>
         <w:tc>
           <w:tcPr>
-            <w:tcW w:type="dxa" w:w="1440"/>
+            <w:tcW w:type="dxa" w:w="1008"/>
             <w:shd w:val="clear" w:color="auto" w:fill="F2F2F2"/>
           </w:tcPr>
           <w:p>
@@ -1005,13 +1088,13 @@
                 <w:i w:val="0"/>
                 <w:sz w:val="18"/>
               </w:rPr>
-              <w:t>—</w:t>
+              <w:t>EU</w:t>
             </w:r>
           </w:p>
         </w:tc>
         <w:tc>
           <w:tcPr>
-            <w:tcW w:type="dxa" w:w="1440"/>
+            <w:tcW w:type="dxa" w:w="1296"/>
             <w:shd w:val="clear" w:color="auto" w:fill="F2F2F2"/>
           </w:tcPr>
           <w:p>
@@ -1030,6 +1113,24 @@
         <w:tc>
           <w:tcPr>
             <w:tcW w:type="dxa" w:w="1296"/>
+            <w:shd w:val="clear" w:color="auto" w:fill="F2F2F2"/>
+          </w:tcPr>
+          <w:p>
+            <w:r/>
+            <w:r>
+              <w:rPr>
+                <w:rFonts w:ascii="Calibri" w:hAnsi="Calibri"/>
+                <w:b w:val="0"/>
+                <w:i w:val="0"/>
+                <w:sz w:val="18"/>
+              </w:rPr>
+              <w:t>—</w:t>
+            </w:r>
+          </w:p>
+        </w:tc>
+        <w:tc>
+          <w:tcPr>
+            <w:tcW w:type="dxa" w:w="1008"/>
             <w:shd w:val="clear" w:color="auto" w:fill="F2F2F2"/>
           </w:tcPr>
           <w:p>
@@ -1067,7 +1168,7 @@
       <w:tr>
         <w:tc>
           <w:tcPr>
-            <w:tcW w:type="dxa" w:w="2592"/>
+            <w:tcW w:type="dxa" w:w="2304"/>
             <w:shd w:val="clear" w:color="auto" w:fill="FFFFFF"/>
           </w:tcPr>
           <w:p>
@@ -1085,7 +1186,7 @@
         </w:tc>
         <w:tc>
           <w:tcPr>
-            <w:tcW w:type="dxa" w:w="2592"/>
+            <w:tcW w:type="dxa" w:w="2160"/>
             <w:shd w:val="clear" w:color="auto" w:fill="FFFFFF"/>
           </w:tcPr>
           <w:p>
@@ -1103,7 +1204,7 @@
         </w:tc>
         <w:tc>
           <w:tcPr>
-            <w:tcW w:type="dxa" w:w="1440"/>
+            <w:tcW w:type="dxa" w:w="1008"/>
             <w:shd w:val="clear" w:color="auto" w:fill="FFFFFF"/>
           </w:tcPr>
           <w:p>
@@ -1115,13 +1216,13 @@
                 <w:i w:val="0"/>
                 <w:sz w:val="18"/>
               </w:rPr>
-              <w:t>—</w:t>
+              <w:t>EU</w:t>
             </w:r>
           </w:p>
         </w:tc>
         <w:tc>
           <w:tcPr>
-            <w:tcW w:type="dxa" w:w="1440"/>
+            <w:tcW w:type="dxa" w:w="1296"/>
             <w:shd w:val="clear" w:color="auto" w:fill="FFFFFF"/>
           </w:tcPr>
           <w:p>
@@ -1140,6 +1241,24 @@
         <w:tc>
           <w:tcPr>
             <w:tcW w:type="dxa" w:w="1296"/>
+            <w:shd w:val="clear" w:color="auto" w:fill="FFFFFF"/>
+          </w:tcPr>
+          <w:p>
+            <w:r/>
+            <w:r>
+              <w:rPr>
+                <w:rFonts w:ascii="Calibri" w:hAnsi="Calibri"/>
+                <w:b w:val="0"/>
+                <w:i w:val="0"/>
+                <w:sz w:val="18"/>
+              </w:rPr>
+              <w:t>—</w:t>
+            </w:r>
+          </w:p>
+        </w:tc>
+        <w:tc>
+          <w:tcPr>
+            <w:tcW w:type="dxa" w:w="1008"/>
             <w:shd w:val="clear" w:color="auto" w:fill="FFFFFF"/>
           </w:tcPr>
           <w:p>
@@ -1177,7 +1296,7 @@
       <w:tr>
         <w:tc>
           <w:tcPr>
-            <w:tcW w:type="dxa" w:w="2592"/>
+            <w:tcW w:type="dxa" w:w="2304"/>
             <w:shd w:val="clear" w:color="auto" w:fill="F2F2F2"/>
           </w:tcPr>
           <w:p>
@@ -1195,7 +1314,7 @@
         </w:tc>
         <w:tc>
           <w:tcPr>
-            <w:tcW w:type="dxa" w:w="2592"/>
+            <w:tcW w:type="dxa" w:w="2160"/>
             <w:shd w:val="clear" w:color="auto" w:fill="F2F2F2"/>
           </w:tcPr>
           <w:p>
@@ -1213,7 +1332,7 @@
         </w:tc>
         <w:tc>
           <w:tcPr>
-            <w:tcW w:type="dxa" w:w="1440"/>
+            <w:tcW w:type="dxa" w:w="1008"/>
             <w:shd w:val="clear" w:color="auto" w:fill="F2F2F2"/>
           </w:tcPr>
           <w:p>
@@ -1225,13 +1344,13 @@
                 <w:i w:val="0"/>
                 <w:sz w:val="18"/>
               </w:rPr>
-              <w:t>—</w:t>
+              <w:t>EU</w:t>
             </w:r>
           </w:p>
         </w:tc>
         <w:tc>
           <w:tcPr>
-            <w:tcW w:type="dxa" w:w="1440"/>
+            <w:tcW w:type="dxa" w:w="1296"/>
             <w:shd w:val="clear" w:color="auto" w:fill="F2F2F2"/>
           </w:tcPr>
           <w:p>
@@ -1250,6 +1369,24 @@
         <w:tc>
           <w:tcPr>
             <w:tcW w:type="dxa" w:w="1296"/>
+            <w:shd w:val="clear" w:color="auto" w:fill="F2F2F2"/>
+          </w:tcPr>
+          <w:p>
+            <w:r/>
+            <w:r>
+              <w:rPr>
+                <w:rFonts w:ascii="Calibri" w:hAnsi="Calibri"/>
+                <w:b w:val="0"/>
+                <w:i w:val="0"/>
+                <w:sz w:val="18"/>
+              </w:rPr>
+              <w:t>—</w:t>
+            </w:r>
+          </w:p>
+        </w:tc>
+        <w:tc>
+          <w:tcPr>
+            <w:tcW w:type="dxa" w:w="1008"/>
             <w:shd w:val="clear" w:color="auto" w:fill="F2F2F2"/>
           </w:tcPr>
           <w:p>
@@ -1287,7 +1424,7 @@
       <w:tr>
         <w:tc>
           <w:tcPr>
-            <w:tcW w:type="dxa" w:w="2592"/>
+            <w:tcW w:type="dxa" w:w="2304"/>
             <w:shd w:val="clear" w:color="auto" w:fill="FFFFFF"/>
           </w:tcPr>
           <w:p>
@@ -1305,7 +1442,7 @@
         </w:tc>
         <w:tc>
           <w:tcPr>
-            <w:tcW w:type="dxa" w:w="2592"/>
+            <w:tcW w:type="dxa" w:w="2160"/>
             <w:shd w:val="clear" w:color="auto" w:fill="FFFFFF"/>
           </w:tcPr>
           <w:p>
@@ -1323,7 +1460,7 @@
         </w:tc>
         <w:tc>
           <w:tcPr>
-            <w:tcW w:type="dxa" w:w="1440"/>
+            <w:tcW w:type="dxa" w:w="1008"/>
             <w:shd w:val="clear" w:color="auto" w:fill="FFFFFF"/>
           </w:tcPr>
           <w:p>
@@ -1335,13 +1472,13 @@
                 <w:i w:val="0"/>
                 <w:sz w:val="18"/>
               </w:rPr>
-              <w:t>—</w:t>
+              <w:t>EU</w:t>
             </w:r>
           </w:p>
         </w:tc>
         <w:tc>
           <w:tcPr>
-            <w:tcW w:type="dxa" w:w="1440"/>
+            <w:tcW w:type="dxa" w:w="1296"/>
             <w:shd w:val="clear" w:color="auto" w:fill="FFFFFF"/>
           </w:tcPr>
           <w:p>
@@ -1360,6 +1497,24 @@
         <w:tc>
           <w:tcPr>
             <w:tcW w:type="dxa" w:w="1296"/>
+            <w:shd w:val="clear" w:color="auto" w:fill="FFFFFF"/>
+          </w:tcPr>
+          <w:p>
+            <w:r/>
+            <w:r>
+              <w:rPr>
+                <w:rFonts w:ascii="Calibri" w:hAnsi="Calibri"/>
+                <w:b w:val="0"/>
+                <w:i w:val="0"/>
+                <w:sz w:val="18"/>
+              </w:rPr>
+              <w:t>—</w:t>
+            </w:r>
+          </w:p>
+        </w:tc>
+        <w:tc>
+          <w:tcPr>
+            <w:tcW w:type="dxa" w:w="1008"/>
             <w:shd w:val="clear" w:color="auto" w:fill="FFFFFF"/>
           </w:tcPr>
           <w:p>
@@ -1397,7 +1552,7 @@
       <w:tr>
         <w:tc>
           <w:tcPr>
-            <w:tcW w:type="dxa" w:w="2592"/>
+            <w:tcW w:type="dxa" w:w="2304"/>
             <w:shd w:val="clear" w:color="auto" w:fill="F2F2F2"/>
           </w:tcPr>
           <w:p>
@@ -1415,7 +1570,7 @@
         </w:tc>
         <w:tc>
           <w:tcPr>
-            <w:tcW w:type="dxa" w:w="2592"/>
+            <w:tcW w:type="dxa" w:w="2160"/>
             <w:shd w:val="clear" w:color="auto" w:fill="F2F2F2"/>
           </w:tcPr>
           <w:p>
@@ -1433,7 +1588,7 @@
         </w:tc>
         <w:tc>
           <w:tcPr>
-            <w:tcW w:type="dxa" w:w="1440"/>
+            <w:tcW w:type="dxa" w:w="1008"/>
             <w:shd w:val="clear" w:color="auto" w:fill="F2F2F2"/>
           </w:tcPr>
           <w:p>
@@ -1445,13 +1600,13 @@
                 <w:i w:val="0"/>
                 <w:sz w:val="18"/>
               </w:rPr>
-              <w:t>—</w:t>
+              <w:t>EU</w:t>
             </w:r>
           </w:p>
         </w:tc>
         <w:tc>
           <w:tcPr>
-            <w:tcW w:type="dxa" w:w="1440"/>
+            <w:tcW w:type="dxa" w:w="1296"/>
             <w:shd w:val="clear" w:color="auto" w:fill="F2F2F2"/>
           </w:tcPr>
           <w:p>
@@ -1487,6 +1642,24 @@
         </w:tc>
         <w:tc>
           <w:tcPr>
+            <w:tcW w:type="dxa" w:w="1008"/>
+            <w:shd w:val="clear" w:color="auto" w:fill="F2F2F2"/>
+          </w:tcPr>
+          <w:p>
+            <w:r/>
+            <w:r>
+              <w:rPr>
+                <w:rFonts w:ascii="Calibri" w:hAnsi="Calibri"/>
+                <w:b w:val="0"/>
+                <w:i w:val="0"/>
+                <w:sz w:val="18"/>
+              </w:rPr>
+              <w:t>—</w:t>
+            </w:r>
+          </w:p>
+        </w:tc>
+        <w:tc>
+          <w:tcPr>
             <w:tcW w:type="dxa" w:w="1296"/>
             <w:shd w:val="clear" w:color="auto" w:fill="F2F2F2"/>
           </w:tcPr>
@@ -1500,6 +1673,774 @@
                 <w:sz w:val="18"/>
               </w:rPr>
               <w:t>9 Jun</w:t>
+            </w:r>
+          </w:p>
+        </w:tc>
+      </w:tr>
+      <w:tr>
+        <w:tc>
+          <w:tcPr>
+            <w:tcW w:type="dxa" w:w="2304"/>
+            <w:shd w:val="clear" w:color="auto" w:fill="FFFFFF"/>
+          </w:tcPr>
+          <w:p>
+            <w:r/>
+            <w:r>
+              <w:rPr>
+                <w:rFonts w:ascii="Calibri" w:hAnsi="Calibri"/>
+                <w:b w:val="0"/>
+                <w:i w:val="0"/>
+                <w:sz w:val="18"/>
+              </w:rPr>
+              <w:t>robert young</w:t>
+            </w:r>
+          </w:p>
+        </w:tc>
+        <w:tc>
+          <w:tcPr>
+            <w:tcW w:type="dxa" w:w="2160"/>
+            <w:shd w:val="clear" w:color="auto" w:fill="FFFFFF"/>
+          </w:tcPr>
+          <w:p>
+            <w:r/>
+            <w:r>
+              <w:rPr>
+                <w:rFonts w:ascii="Calibri" w:hAnsi="Calibri"/>
+                <w:b w:val="0"/>
+                <w:i w:val="0"/>
+                <w:sz w:val="18"/>
+              </w:rPr>
+              <w:t>bluemantis.com</w:t>
+            </w:r>
+          </w:p>
+        </w:tc>
+        <w:tc>
+          <w:tcPr>
+            <w:tcW w:type="dxa" w:w="1008"/>
+            <w:shd w:val="clear" w:color="auto" w:fill="FFFFFF"/>
+          </w:tcPr>
+          <w:p>
+            <w:r/>
+            <w:r>
+              <w:rPr>
+                <w:rFonts w:ascii="Calibri" w:hAnsi="Calibri"/>
+                <w:b w:val="0"/>
+                <w:i w:val="0"/>
+                <w:sz w:val="18"/>
+              </w:rPr>
+              <w:t>USEast</w:t>
+            </w:r>
+          </w:p>
+        </w:tc>
+        <w:tc>
+          <w:tcPr>
+            <w:tcW w:type="dxa" w:w="1296"/>
+            <w:shd w:val="clear" w:color="auto" w:fill="FFFFFF"/>
+          </w:tcPr>
+          <w:p>
+            <w:r/>
+            <w:r>
+              <w:rPr>
+                <w:rFonts w:ascii="Calibri" w:hAnsi="Calibri"/>
+                <w:b w:val="0"/>
+                <w:i w:val="0"/>
+                <w:sz w:val="18"/>
+              </w:rPr>
+              <w:t>152</w:t>
+            </w:r>
+          </w:p>
+        </w:tc>
+        <w:tc>
+          <w:tcPr>
+            <w:tcW w:type="dxa" w:w="1296"/>
+            <w:shd w:val="clear" w:color="auto" w:fill="FFFFFF"/>
+          </w:tcPr>
+          <w:p>
+            <w:r/>
+            <w:r>
+              <w:rPr>
+                <w:rFonts w:ascii="Calibri" w:hAnsi="Calibri"/>
+                <w:b w:val="0"/>
+                <w:i w:val="0"/>
+                <w:sz w:val="18"/>
+              </w:rPr>
+              <w:t>1</w:t>
+            </w:r>
+          </w:p>
+        </w:tc>
+        <w:tc>
+          <w:tcPr>
+            <w:tcW w:type="dxa" w:w="1008"/>
+            <w:shd w:val="clear" w:color="auto" w:fill="FFFFFF"/>
+          </w:tcPr>
+          <w:p>
+            <w:r/>
+            <w:r>
+              <w:rPr>
+                <w:rFonts w:ascii="Calibri" w:hAnsi="Calibri"/>
+                <w:b w:val="0"/>
+                <w:i w:val="0"/>
+                <w:sz w:val="18"/>
+              </w:rPr>
+              <w:t>10</w:t>
+            </w:r>
+          </w:p>
+        </w:tc>
+        <w:tc>
+          <w:tcPr>
+            <w:tcW w:type="dxa" w:w="1296"/>
+            <w:shd w:val="clear" w:color="auto" w:fill="FFFFFF"/>
+          </w:tcPr>
+          <w:p>
+            <w:r/>
+            <w:r>
+              <w:rPr>
+                <w:rFonts w:ascii="Calibri" w:hAnsi="Calibri"/>
+                <w:b w:val="0"/>
+                <w:i w:val="0"/>
+                <w:sz w:val="18"/>
+              </w:rPr>
+              <w:t>16 Jun</w:t>
+            </w:r>
+          </w:p>
+        </w:tc>
+      </w:tr>
+      <w:tr>
+        <w:tc>
+          <w:tcPr>
+            <w:tcW w:type="dxa" w:w="2304"/>
+            <w:shd w:val="clear" w:color="auto" w:fill="F2F2F2"/>
+          </w:tcPr>
+          <w:p>
+            <w:r/>
+            <w:r>
+              <w:rPr>
+                <w:rFonts w:ascii="Calibri" w:hAnsi="Calibri"/>
+                <w:b w:val="0"/>
+                <w:i w:val="0"/>
+                <w:sz w:val="18"/>
+              </w:rPr>
+              <w:t>adam schutska</w:t>
+            </w:r>
+          </w:p>
+        </w:tc>
+        <w:tc>
+          <w:tcPr>
+            <w:tcW w:type="dxa" w:w="2160"/>
+            <w:shd w:val="clear" w:color="auto" w:fill="F2F2F2"/>
+          </w:tcPr>
+          <w:p>
+            <w:r/>
+            <w:r>
+              <w:rPr>
+                <w:rFonts w:ascii="Calibri" w:hAnsi="Calibri"/>
+                <w:b w:val="0"/>
+                <w:i w:val="0"/>
+                <w:sz w:val="18"/>
+              </w:rPr>
+              <w:t>bluemantis.com</w:t>
+            </w:r>
+          </w:p>
+        </w:tc>
+        <w:tc>
+          <w:tcPr>
+            <w:tcW w:type="dxa" w:w="1008"/>
+            <w:shd w:val="clear" w:color="auto" w:fill="F2F2F2"/>
+          </w:tcPr>
+          <w:p>
+            <w:r/>
+            <w:r>
+              <w:rPr>
+                <w:rFonts w:ascii="Calibri" w:hAnsi="Calibri"/>
+                <w:b w:val="0"/>
+                <w:i w:val="0"/>
+                <w:sz w:val="18"/>
+              </w:rPr>
+              <w:t>USEast</w:t>
+            </w:r>
+          </w:p>
+        </w:tc>
+        <w:tc>
+          <w:tcPr>
+            <w:tcW w:type="dxa" w:w="1296"/>
+            <w:shd w:val="clear" w:color="auto" w:fill="F2F2F2"/>
+          </w:tcPr>
+          <w:p>
+            <w:r/>
+            <w:r>
+              <w:rPr>
+                <w:rFonts w:ascii="Calibri" w:hAnsi="Calibri"/>
+                <w:b w:val="0"/>
+                <w:i w:val="0"/>
+                <w:sz w:val="18"/>
+              </w:rPr>
+              <w:t>—</w:t>
+            </w:r>
+          </w:p>
+        </w:tc>
+        <w:tc>
+          <w:tcPr>
+            <w:tcW w:type="dxa" w:w="1296"/>
+            <w:shd w:val="clear" w:color="auto" w:fill="F2F2F2"/>
+          </w:tcPr>
+          <w:p>
+            <w:r/>
+            <w:r>
+              <w:rPr>
+                <w:rFonts w:ascii="Calibri" w:hAnsi="Calibri"/>
+                <w:b w:val="0"/>
+                <w:i w:val="0"/>
+                <w:sz w:val="18"/>
+              </w:rPr>
+              <w:t>—</w:t>
+            </w:r>
+          </w:p>
+        </w:tc>
+        <w:tc>
+          <w:tcPr>
+            <w:tcW w:type="dxa" w:w="1008"/>
+            <w:shd w:val="clear" w:color="auto" w:fill="F2F2F2"/>
+          </w:tcPr>
+          <w:p>
+            <w:r/>
+            <w:r>
+              <w:rPr>
+                <w:rFonts w:ascii="Calibri" w:hAnsi="Calibri"/>
+                <w:b w:val="0"/>
+                <w:i w:val="0"/>
+                <w:sz w:val="18"/>
+              </w:rPr>
+              <w:t>—</w:t>
+            </w:r>
+          </w:p>
+        </w:tc>
+        <w:tc>
+          <w:tcPr>
+            <w:tcW w:type="dxa" w:w="1296"/>
+            <w:shd w:val="clear" w:color="auto" w:fill="F2F2F2"/>
+          </w:tcPr>
+          <w:p>
+            <w:r/>
+            <w:r>
+              <w:rPr>
+                <w:rFonts w:ascii="Calibri" w:hAnsi="Calibri"/>
+                <w:b w:val="0"/>
+                <w:i w:val="0"/>
+                <w:sz w:val="18"/>
+              </w:rPr>
+              <w:t>15 Jun</w:t>
+            </w:r>
+          </w:p>
+        </w:tc>
+      </w:tr>
+      <w:tr>
+        <w:tc>
+          <w:tcPr>
+            <w:tcW w:type="dxa" w:w="2304"/>
+            <w:shd w:val="clear" w:color="auto" w:fill="FFFFFF"/>
+          </w:tcPr>
+          <w:p>
+            <w:r/>
+            <w:r>
+              <w:rPr>
+                <w:rFonts w:ascii="Calibri" w:hAnsi="Calibri"/>
+                <w:b w:val="0"/>
+                <w:i w:val="0"/>
+                <w:sz w:val="18"/>
+              </w:rPr>
+              <w:t>bhavana prabhuswamy</w:t>
+            </w:r>
+          </w:p>
+        </w:tc>
+        <w:tc>
+          <w:tcPr>
+            <w:tcW w:type="dxa" w:w="2160"/>
+            <w:shd w:val="clear" w:color="auto" w:fill="FFFFFF"/>
+          </w:tcPr>
+          <w:p>
+            <w:r/>
+            <w:r>
+              <w:rPr>
+                <w:rFonts w:ascii="Calibri" w:hAnsi="Calibri"/>
+                <w:b w:val="0"/>
+                <w:i w:val="0"/>
+                <w:sz w:val="18"/>
+              </w:rPr>
+              <w:t>bluemantis.com</w:t>
+            </w:r>
+          </w:p>
+        </w:tc>
+        <w:tc>
+          <w:tcPr>
+            <w:tcW w:type="dxa" w:w="1008"/>
+            <w:shd w:val="clear" w:color="auto" w:fill="FFFFFF"/>
+          </w:tcPr>
+          <w:p>
+            <w:r/>
+            <w:r>
+              <w:rPr>
+                <w:rFonts w:ascii="Calibri" w:hAnsi="Calibri"/>
+                <w:b w:val="0"/>
+                <w:i w:val="0"/>
+                <w:sz w:val="18"/>
+              </w:rPr>
+              <w:t>USEast</w:t>
+            </w:r>
+          </w:p>
+        </w:tc>
+        <w:tc>
+          <w:tcPr>
+            <w:tcW w:type="dxa" w:w="1296"/>
+            <w:shd w:val="clear" w:color="auto" w:fill="FFFFFF"/>
+          </w:tcPr>
+          <w:p>
+            <w:r/>
+            <w:r>
+              <w:rPr>
+                <w:rFonts w:ascii="Calibri" w:hAnsi="Calibri"/>
+                <w:b w:val="0"/>
+                <w:i w:val="0"/>
+                <w:sz w:val="18"/>
+              </w:rPr>
+              <w:t>—</w:t>
+            </w:r>
+          </w:p>
+        </w:tc>
+        <w:tc>
+          <w:tcPr>
+            <w:tcW w:type="dxa" w:w="1296"/>
+            <w:shd w:val="clear" w:color="auto" w:fill="FFFFFF"/>
+          </w:tcPr>
+          <w:p>
+            <w:r/>
+            <w:r>
+              <w:rPr>
+                <w:rFonts w:ascii="Calibri" w:hAnsi="Calibri"/>
+                <w:b w:val="0"/>
+                <w:i w:val="0"/>
+                <w:sz w:val="18"/>
+              </w:rPr>
+              <w:t>—</w:t>
+            </w:r>
+          </w:p>
+        </w:tc>
+        <w:tc>
+          <w:tcPr>
+            <w:tcW w:type="dxa" w:w="1008"/>
+            <w:shd w:val="clear" w:color="auto" w:fill="FFFFFF"/>
+          </w:tcPr>
+          <w:p>
+            <w:r/>
+            <w:r>
+              <w:rPr>
+                <w:rFonts w:ascii="Calibri" w:hAnsi="Calibri"/>
+                <w:b w:val="0"/>
+                <w:i w:val="0"/>
+                <w:sz w:val="18"/>
+              </w:rPr>
+              <w:t>—</w:t>
+            </w:r>
+          </w:p>
+        </w:tc>
+        <w:tc>
+          <w:tcPr>
+            <w:tcW w:type="dxa" w:w="1296"/>
+            <w:shd w:val="clear" w:color="auto" w:fill="FFFFFF"/>
+          </w:tcPr>
+          <w:p>
+            <w:r/>
+            <w:r>
+              <w:rPr>
+                <w:rFonts w:ascii="Calibri" w:hAnsi="Calibri"/>
+                <w:b w:val="0"/>
+                <w:i w:val="0"/>
+                <w:sz w:val="18"/>
+              </w:rPr>
+              <w:t>15 Jun</w:t>
+            </w:r>
+          </w:p>
+        </w:tc>
+      </w:tr>
+      <w:tr>
+        <w:tc>
+          <w:tcPr>
+            <w:tcW w:type="dxa" w:w="2304"/>
+            <w:shd w:val="clear" w:color="auto" w:fill="F2F2F2"/>
+          </w:tcPr>
+          <w:p>
+            <w:r/>
+            <w:r>
+              <w:rPr>
+                <w:rFonts w:ascii="Calibri" w:hAnsi="Calibri"/>
+                <w:b w:val="0"/>
+                <w:i w:val="0"/>
+                <w:sz w:val="18"/>
+              </w:rPr>
+              <w:t>rj gravel</w:t>
+            </w:r>
+          </w:p>
+        </w:tc>
+        <w:tc>
+          <w:tcPr>
+            <w:tcW w:type="dxa" w:w="2160"/>
+            <w:shd w:val="clear" w:color="auto" w:fill="F2F2F2"/>
+          </w:tcPr>
+          <w:p>
+            <w:r/>
+            <w:r>
+              <w:rPr>
+                <w:rFonts w:ascii="Calibri" w:hAnsi="Calibri"/>
+                <w:b w:val="0"/>
+                <w:i w:val="0"/>
+                <w:sz w:val="18"/>
+              </w:rPr>
+              <w:t>bluemantis.com</w:t>
+            </w:r>
+          </w:p>
+        </w:tc>
+        <w:tc>
+          <w:tcPr>
+            <w:tcW w:type="dxa" w:w="1008"/>
+            <w:shd w:val="clear" w:color="auto" w:fill="F2F2F2"/>
+          </w:tcPr>
+          <w:p>
+            <w:r/>
+            <w:r>
+              <w:rPr>
+                <w:rFonts w:ascii="Calibri" w:hAnsi="Calibri"/>
+                <w:b w:val="0"/>
+                <w:i w:val="0"/>
+                <w:sz w:val="18"/>
+              </w:rPr>
+              <w:t>USEast</w:t>
+            </w:r>
+          </w:p>
+        </w:tc>
+        <w:tc>
+          <w:tcPr>
+            <w:tcW w:type="dxa" w:w="1296"/>
+            <w:shd w:val="clear" w:color="auto" w:fill="F2F2F2"/>
+          </w:tcPr>
+          <w:p>
+            <w:r/>
+            <w:r>
+              <w:rPr>
+                <w:rFonts w:ascii="Calibri" w:hAnsi="Calibri"/>
+                <w:b w:val="0"/>
+                <w:i w:val="0"/>
+                <w:sz w:val="18"/>
+              </w:rPr>
+              <w:t>—</w:t>
+            </w:r>
+          </w:p>
+        </w:tc>
+        <w:tc>
+          <w:tcPr>
+            <w:tcW w:type="dxa" w:w="1296"/>
+            <w:shd w:val="clear" w:color="auto" w:fill="F2F2F2"/>
+          </w:tcPr>
+          <w:p>
+            <w:r/>
+            <w:r>
+              <w:rPr>
+                <w:rFonts w:ascii="Calibri" w:hAnsi="Calibri"/>
+                <w:b w:val="0"/>
+                <w:i w:val="0"/>
+                <w:sz w:val="18"/>
+              </w:rPr>
+              <w:t>—</w:t>
+            </w:r>
+          </w:p>
+        </w:tc>
+        <w:tc>
+          <w:tcPr>
+            <w:tcW w:type="dxa" w:w="1008"/>
+            <w:shd w:val="clear" w:color="auto" w:fill="F2F2F2"/>
+          </w:tcPr>
+          <w:p>
+            <w:r/>
+            <w:r>
+              <w:rPr>
+                <w:rFonts w:ascii="Calibri" w:hAnsi="Calibri"/>
+                <w:b w:val="0"/>
+                <w:i w:val="0"/>
+                <w:sz w:val="18"/>
+              </w:rPr>
+              <w:t>—</w:t>
+            </w:r>
+          </w:p>
+        </w:tc>
+        <w:tc>
+          <w:tcPr>
+            <w:tcW w:type="dxa" w:w="1296"/>
+            <w:shd w:val="clear" w:color="auto" w:fill="F2F2F2"/>
+          </w:tcPr>
+          <w:p>
+            <w:r/>
+            <w:r>
+              <w:rPr>
+                <w:rFonts w:ascii="Calibri" w:hAnsi="Calibri"/>
+                <w:b w:val="0"/>
+                <w:i w:val="0"/>
+                <w:sz w:val="18"/>
+              </w:rPr>
+              <w:t>19 May</w:t>
+            </w:r>
+          </w:p>
+        </w:tc>
+      </w:tr>
+      <w:tr>
+        <w:tc>
+          <w:tcPr>
+            <w:tcW w:type="dxa" w:w="2304"/>
+            <w:shd w:val="clear" w:color="auto" w:fill="FFFFFF"/>
+          </w:tcPr>
+          <w:p>
+            <w:r/>
+            <w:r>
+              <w:rPr>
+                <w:rFonts w:ascii="Calibri" w:hAnsi="Calibri"/>
+                <w:b w:val="0"/>
+                <w:i w:val="0"/>
+                <w:sz w:val="18"/>
+              </w:rPr>
+              <w:t>abagchi</w:t>
+            </w:r>
+          </w:p>
+        </w:tc>
+        <w:tc>
+          <w:tcPr>
+            <w:tcW w:type="dxa" w:w="2160"/>
+            <w:shd w:val="clear" w:color="auto" w:fill="FFFFFF"/>
+          </w:tcPr>
+          <w:p>
+            <w:r/>
+            <w:r>
+              <w:rPr>
+                <w:rFonts w:ascii="Calibri" w:hAnsi="Calibri"/>
+                <w:b w:val="0"/>
+                <w:i w:val="0"/>
+                <w:sz w:val="18"/>
+              </w:rPr>
+              <w:t>corestack.io</w:t>
+            </w:r>
+          </w:p>
+        </w:tc>
+        <w:tc>
+          <w:tcPr>
+            <w:tcW w:type="dxa" w:w="1008"/>
+            <w:shd w:val="clear" w:color="auto" w:fill="FFFFFF"/>
+          </w:tcPr>
+          <w:p>
+            <w:r/>
+            <w:r>
+              <w:rPr>
+                <w:rFonts w:ascii="Calibri" w:hAnsi="Calibri"/>
+                <w:b w:val="0"/>
+                <w:i w:val="0"/>
+                <w:sz w:val="18"/>
+              </w:rPr>
+              <w:t>USEast</w:t>
+            </w:r>
+          </w:p>
+        </w:tc>
+        <w:tc>
+          <w:tcPr>
+            <w:tcW w:type="dxa" w:w="1296"/>
+            <w:shd w:val="clear" w:color="auto" w:fill="FFFFFF"/>
+          </w:tcPr>
+          <w:p>
+            <w:r/>
+            <w:r>
+              <w:rPr>
+                <w:rFonts w:ascii="Calibri" w:hAnsi="Calibri"/>
+                <w:b w:val="0"/>
+                <w:i w:val="0"/>
+                <w:sz w:val="18"/>
+              </w:rPr>
+              <w:t>—</w:t>
+            </w:r>
+          </w:p>
+        </w:tc>
+        <w:tc>
+          <w:tcPr>
+            <w:tcW w:type="dxa" w:w="1296"/>
+            <w:shd w:val="clear" w:color="auto" w:fill="FFFFFF"/>
+          </w:tcPr>
+          <w:p>
+            <w:r/>
+            <w:r>
+              <w:rPr>
+                <w:rFonts w:ascii="Calibri" w:hAnsi="Calibri"/>
+                <w:b w:val="0"/>
+                <w:i w:val="0"/>
+                <w:sz w:val="18"/>
+              </w:rPr>
+              <w:t>—</w:t>
+            </w:r>
+          </w:p>
+        </w:tc>
+        <w:tc>
+          <w:tcPr>
+            <w:tcW w:type="dxa" w:w="1008"/>
+            <w:shd w:val="clear" w:color="auto" w:fill="FFFFFF"/>
+          </w:tcPr>
+          <w:p>
+            <w:r/>
+            <w:r>
+              <w:rPr>
+                <w:rFonts w:ascii="Calibri" w:hAnsi="Calibri"/>
+                <w:b w:val="0"/>
+                <w:i w:val="0"/>
+                <w:sz w:val="18"/>
+              </w:rPr>
+              <w:t>—</w:t>
+            </w:r>
+          </w:p>
+        </w:tc>
+        <w:tc>
+          <w:tcPr>
+            <w:tcW w:type="dxa" w:w="1296"/>
+            <w:shd w:val="clear" w:color="auto" w:fill="FFFFFF"/>
+          </w:tcPr>
+          <w:p>
+            <w:r/>
+            <w:r>
+              <w:rPr>
+                <w:rFonts w:ascii="Calibri" w:hAnsi="Calibri"/>
+                <w:b w:val="0"/>
+                <w:i w:val="0"/>
+                <w:sz w:val="18"/>
+              </w:rPr>
+              <w:t>2 Jun</w:t>
+            </w:r>
+          </w:p>
+        </w:tc>
+      </w:tr>
+      <w:tr>
+        <w:tc>
+          <w:tcPr>
+            <w:tcW w:type="dxa" w:w="2304"/>
+            <w:shd w:val="clear" w:color="auto" w:fill="F2F2F2"/>
+          </w:tcPr>
+          <w:p>
+            <w:r/>
+            <w:r>
+              <w:rPr>
+                <w:rFonts w:ascii="Calibri" w:hAnsi="Calibri"/>
+                <w:b w:val="0"/>
+                <w:i w:val="0"/>
+                <w:sz w:val="18"/>
+              </w:rPr>
+              <w:t>cspbillingapi</w:t>
+            </w:r>
+          </w:p>
+        </w:tc>
+        <w:tc>
+          <w:tcPr>
+            <w:tcW w:type="dxa" w:w="2160"/>
+            <w:shd w:val="clear" w:color="auto" w:fill="F2F2F2"/>
+          </w:tcPr>
+          <w:p>
+            <w:r/>
+            <w:r>
+              <w:rPr>
+                <w:rFonts w:ascii="Calibri" w:hAnsi="Calibri"/>
+                <w:b w:val="0"/>
+                <w:i w:val="0"/>
+                <w:sz w:val="18"/>
+              </w:rPr>
+              <w:t>bluemantis.com</w:t>
+            </w:r>
+          </w:p>
+        </w:tc>
+        <w:tc>
+          <w:tcPr>
+            <w:tcW w:type="dxa" w:w="1008"/>
+            <w:shd w:val="clear" w:color="auto" w:fill="F2F2F2"/>
+          </w:tcPr>
+          <w:p>
+            <w:r/>
+            <w:r>
+              <w:rPr>
+                <w:rFonts w:ascii="Calibri" w:hAnsi="Calibri"/>
+                <w:b w:val="0"/>
+                <w:i w:val="0"/>
+                <w:sz w:val="18"/>
+              </w:rPr>
+              <w:t>USEast</w:t>
+            </w:r>
+          </w:p>
+        </w:tc>
+        <w:tc>
+          <w:tcPr>
+            <w:tcW w:type="dxa" w:w="1296"/>
+            <w:shd w:val="clear" w:color="auto" w:fill="F2F2F2"/>
+          </w:tcPr>
+          <w:p>
+            <w:r/>
+            <w:r>
+              <w:rPr>
+                <w:rFonts w:ascii="Calibri" w:hAnsi="Calibri"/>
+                <w:b w:val="0"/>
+                <w:i w:val="0"/>
+                <w:sz w:val="18"/>
+              </w:rPr>
+              <w:t>—</w:t>
+            </w:r>
+          </w:p>
+        </w:tc>
+        <w:tc>
+          <w:tcPr>
+            <w:tcW w:type="dxa" w:w="1296"/>
+            <w:shd w:val="clear" w:color="auto" w:fill="F2F2F2"/>
+          </w:tcPr>
+          <w:p>
+            <w:r/>
+            <w:r>
+              <w:rPr>
+                <w:rFonts w:ascii="Calibri" w:hAnsi="Calibri"/>
+                <w:b w:val="0"/>
+                <w:i w:val="0"/>
+                <w:sz w:val="18"/>
+              </w:rPr>
+              <w:t>—</w:t>
+            </w:r>
+          </w:p>
+        </w:tc>
+        <w:tc>
+          <w:tcPr>
+            <w:tcW w:type="dxa" w:w="1008"/>
+            <w:shd w:val="clear" w:color="auto" w:fill="F2F2F2"/>
+          </w:tcPr>
+          <w:p>
+            <w:r/>
+            <w:r>
+              <w:rPr>
+                <w:rFonts w:ascii="Calibri" w:hAnsi="Calibri"/>
+                <w:b w:val="0"/>
+                <w:i w:val="0"/>
+                <w:sz w:val="18"/>
+              </w:rPr>
+              <w:t>—</w:t>
+            </w:r>
+          </w:p>
+        </w:tc>
+        <w:tc>
+          <w:tcPr>
+            <w:tcW w:type="dxa" w:w="1296"/>
+            <w:shd w:val="clear" w:color="auto" w:fill="F2F2F2"/>
+          </w:tcPr>
+          <w:p>
+            <w:r/>
+            <w:r>
+              <w:rPr>
+                <w:rFonts w:ascii="Calibri" w:hAnsi="Calibri"/>
+                <w:b w:val="0"/>
+                <w:i w:val="0"/>
+                <w:sz w:val="18"/>
+              </w:rPr>
+              <w:t>26 May</w:t>
             </w:r>
           </w:p>
         </w:tc>
@@ -1527,7 +2468,7 @@
             <w:r>
               <w:drawing>
                 <wp:inline xmlns:a="http://schemas.openxmlformats.org/drawingml/2006/main" xmlns:pic="http://schemas.openxmlformats.org/drawingml/2006/picture">
-                  <wp:extent cx="3017520" cy="1002548"/>
+                  <wp:extent cx="3017520" cy="2387148"/>
                   <wp:docPr id="1" name="Picture 1"/>
                   <wp:cNvGraphicFramePr>
                     <a:graphicFrameLocks noChangeAspect="1"/>
@@ -1548,7 +2489,7 @@
                         <pic:spPr>
                           <a:xfrm>
                             <a:off x="0" y="0"/>
-                            <a:ext cx="3017520" cy="1002548"/>
+                            <a:ext cx="3017520" cy="2387148"/>
                           </a:xfrm>
                           <a:prstGeom prst="rect"/>
                         </pic:spPr>
@@ -1618,1046 +2559,7 @@
           <w:color w:val="1F2937"/>
           <w:sz w:val="20"/>
         </w:rPr>
-        <w:t>Top pages — EU (portal.corestack.io)</w:t>
-      </w:r>
-    </w:p>
-    <w:tbl>
-      <w:tblPr>
-        <w:tblStyle w:val="TableGrid"/>
-        <w:tblW w:type="auto" w:w="0"/>
-        <w:jc w:val="left"/>
-        <w:tblLook w:firstColumn="1" w:firstRow="1" w:lastColumn="0" w:lastRow="0" w:noHBand="0" w:noVBand="1" w:val="04A0"/>
-      </w:tblPr>
-      <w:tblGrid>
-        <w:gridCol w:w="5100"/>
-        <w:gridCol w:w="5100"/>
-      </w:tblGrid>
-      <w:tr>
-        <w:tc>
-          <w:tcPr>
-            <w:tcW w:type="dxa" w:w="6480"/>
-            <w:shd w:val="clear" w:color="auto" w:fill="1F2937"/>
-            <w:vAlign w:val="center"/>
-          </w:tcPr>
-          <w:p>
-            <w:r/>
-            <w:r>
-              <w:rPr>
-                <w:rFonts w:ascii="Calibri" w:hAnsi="Calibri"/>
-                <w:b/>
-                <w:i w:val="0"/>
-                <w:color w:val="FFFFFF"/>
-                <w:sz w:val="18"/>
-              </w:rPr>
-              <w:t>Page</w:t>
-            </w:r>
-          </w:p>
-        </w:tc>
-        <w:tc>
-          <w:tcPr>
-            <w:tcW w:type="dxa" w:w="1152"/>
-            <w:shd w:val="clear" w:color="auto" w:fill="1F2937"/>
-            <w:vAlign w:val="center"/>
-          </w:tcPr>
-          <w:p>
-            <w:r/>
-            <w:r>
-              <w:rPr>
-                <w:rFonts w:ascii="Calibri" w:hAnsi="Calibri"/>
-                <w:b/>
-                <w:i w:val="0"/>
-                <w:color w:val="FFFFFF"/>
-                <w:sz w:val="18"/>
-              </w:rPr>
-              <w:t>Views</w:t>
-            </w:r>
-          </w:p>
-        </w:tc>
-      </w:tr>
-      <w:tr>
-        <w:tc>
-          <w:tcPr>
-            <w:tcW w:type="dxa" w:w="6480"/>
-            <w:shd w:val="clear" w:color="auto" w:fill="F2F2F2"/>
-          </w:tcPr>
-          <w:p>
-            <w:r/>
-            <w:r>
-              <w:rPr>
-                <w:rFonts w:ascii="Calibri" w:hAnsi="Calibri"/>
-                <w:b w:val="0"/>
-                <w:i w:val="0"/>
-                <w:sz w:val="18"/>
-              </w:rPr>
-              <w:t>—</w:t>
-            </w:r>
-          </w:p>
-        </w:tc>
-        <w:tc>
-          <w:tcPr>
-            <w:tcW w:type="dxa" w:w="1152"/>
-            <w:shd w:val="clear" w:color="auto" w:fill="F2F2F2"/>
-          </w:tcPr>
-          <w:p>
-            <w:r/>
-            <w:r>
-              <w:rPr>
-                <w:rFonts w:ascii="Calibri" w:hAnsi="Calibri"/>
-                <w:b w:val="0"/>
-                <w:i w:val="0"/>
-                <w:sz w:val="18"/>
-              </w:rPr>
-              <w:t>—</w:t>
-            </w:r>
-          </w:p>
-        </w:tc>
-      </w:tr>
-    </w:tbl>
-    <w:p/>
-    <w:p>
-      <w:pPr>
-        <w:spacing w:before="200" w:after="40"/>
-        <w:jc w:val="left"/>
-      </w:pPr>
-      <w:r>
-        <w:rPr>
-          <w:rFonts w:ascii="Calibri" w:hAnsi="Calibri"/>
-          <w:b/>
-          <w:i w:val="0"/>
-          <w:color w:val="1F2937"/>
-          <w:sz w:val="24"/>
-        </w:rPr>
-        <w:t>Pendo engagement — USEast (useast.corestack.io)  ·  last 3 days (16 Jun – 18 Jun)</w:t>
-      </w:r>
-    </w:p>
-    <w:p>
-      <w:pPr>
-        <w:spacing w:before="0" w:after="80"/>
-        <w:jc w:val="left"/>
-      </w:pPr>
-      <w:r>
-        <w:rPr>
-          <w:rFonts w:ascii="Calibri" w:hAnsi="Calibri"/>
-          <w:b w:val="0"/>
-          <w:i/>
-          <w:color w:val="757575"/>
-          <w:sz w:val="16"/>
-        </w:rPr>
-        <w:t>Source: Blackstone Pendo segment only.  cs.support.blackstone@corestack.io excluded.  Grey rows = segment members with no activity in this window.</w:t>
-      </w:r>
-    </w:p>
-    <w:tbl>
-      <w:tblPr>
-        <w:tblStyle w:val="TableGrid"/>
-        <w:tblW w:type="auto" w:w="0"/>
-        <w:jc w:val="left"/>
-        <w:tblLook w:firstColumn="1" w:firstRow="1" w:lastColumn="0" w:lastRow="0" w:noHBand="0" w:noVBand="1" w:val="04A0"/>
-      </w:tblPr>
-      <w:tblGrid>
-        <w:gridCol w:w="1700"/>
-        <w:gridCol w:w="1700"/>
-        <w:gridCol w:w="1700"/>
-        <w:gridCol w:w="1700"/>
-        <w:gridCol w:w="1700"/>
-        <w:gridCol w:w="1700"/>
-      </w:tblGrid>
-      <w:tr>
-        <w:tc>
-          <w:tcPr>
-            <w:tcW w:type="dxa" w:w="2592"/>
-            <w:shd w:val="clear" w:color="auto" w:fill="1F2937"/>
-            <w:vAlign w:val="center"/>
-          </w:tcPr>
-          <w:p>
-            <w:r/>
-            <w:r>
-              <w:rPr>
-                <w:rFonts w:ascii="Calibri" w:hAnsi="Calibri"/>
-                <w:b/>
-                <w:i w:val="0"/>
-                <w:color w:val="FFFFFF"/>
-                <w:sz w:val="18"/>
-              </w:rPr>
-              <w:t>Visitor</w:t>
-            </w:r>
-          </w:p>
-        </w:tc>
-        <w:tc>
-          <w:tcPr>
-            <w:tcW w:type="dxa" w:w="2592"/>
-            <w:shd w:val="clear" w:color="auto" w:fill="1F2937"/>
-            <w:vAlign w:val="center"/>
-          </w:tcPr>
-          <w:p>
-            <w:r/>
-            <w:r>
-              <w:rPr>
-                <w:rFonts w:ascii="Calibri" w:hAnsi="Calibri"/>
-                <w:b/>
-                <w:i w:val="0"/>
-                <w:color w:val="FFFFFF"/>
-                <w:sz w:val="18"/>
-              </w:rPr>
-              <w:t>Domain</w:t>
-            </w:r>
-          </w:p>
-        </w:tc>
-        <w:tc>
-          <w:tcPr>
-            <w:tcW w:type="dxa" w:w="1440"/>
-            <w:shd w:val="clear" w:color="auto" w:fill="1F2937"/>
-            <w:vAlign w:val="center"/>
-          </w:tcPr>
-          <w:p>
-            <w:r/>
-            <w:r>
-              <w:rPr>
-                <w:rFonts w:ascii="Calibri" w:hAnsi="Calibri"/>
-                <w:b/>
-                <w:i w:val="0"/>
-                <w:color w:val="FFFFFF"/>
-                <w:sz w:val="18"/>
-              </w:rPr>
-              <w:t>Events (3d)</w:t>
-            </w:r>
-          </w:p>
-        </w:tc>
-        <w:tc>
-          <w:tcPr>
-            <w:tcW w:type="dxa" w:w="1440"/>
-            <w:shd w:val="clear" w:color="auto" w:fill="1F2937"/>
-            <w:vAlign w:val="center"/>
-          </w:tcPr>
-          <w:p>
-            <w:r/>
-            <w:r>
-              <w:rPr>
-                <w:rFonts w:ascii="Calibri" w:hAnsi="Calibri"/>
-                <w:b/>
-                <w:i w:val="0"/>
-                <w:color w:val="FFFFFF"/>
-                <w:sz w:val="18"/>
-              </w:rPr>
-              <w:t>Days active</w:t>
-            </w:r>
-          </w:p>
-        </w:tc>
-        <w:tc>
-          <w:tcPr>
-            <w:tcW w:type="dxa" w:w="1296"/>
-            <w:shd w:val="clear" w:color="auto" w:fill="1F2937"/>
-            <w:vAlign w:val="center"/>
-          </w:tcPr>
-          <w:p>
-            <w:r/>
-            <w:r>
-              <w:rPr>
-                <w:rFonts w:ascii="Calibri" w:hAnsi="Calibri"/>
-                <w:b/>
-                <w:i w:val="0"/>
-                <w:color w:val="FFFFFF"/>
-                <w:sz w:val="18"/>
-              </w:rPr>
-              <w:t>Minutes</w:t>
-            </w:r>
-          </w:p>
-        </w:tc>
-        <w:tc>
-          <w:tcPr>
-            <w:tcW w:type="dxa" w:w="1296"/>
-            <w:shd w:val="clear" w:color="auto" w:fill="1F2937"/>
-            <w:vAlign w:val="center"/>
-          </w:tcPr>
-          <w:p>
-            <w:r/>
-            <w:r>
-              <w:rPr>
-                <w:rFonts w:ascii="Calibri" w:hAnsi="Calibri"/>
-                <w:b/>
-                <w:i w:val="0"/>
-                <w:color w:val="FFFFFF"/>
-                <w:sz w:val="18"/>
-              </w:rPr>
-              <w:t>Last seen</w:t>
-            </w:r>
-          </w:p>
-        </w:tc>
-      </w:tr>
-      <w:tr>
-        <w:tc>
-          <w:tcPr>
-            <w:tcW w:type="dxa" w:w="2592"/>
-            <w:shd w:val="clear" w:color="auto" w:fill="F2F2F2"/>
-          </w:tcPr>
-          <w:p>
-            <w:r/>
-            <w:r>
-              <w:rPr>
-                <w:rFonts w:ascii="Calibri" w:hAnsi="Calibri"/>
-                <w:b w:val="0"/>
-                <w:i w:val="0"/>
-                <w:sz w:val="18"/>
-              </w:rPr>
-              <w:t>robert young</w:t>
-            </w:r>
-          </w:p>
-        </w:tc>
-        <w:tc>
-          <w:tcPr>
-            <w:tcW w:type="dxa" w:w="2592"/>
-            <w:shd w:val="clear" w:color="auto" w:fill="F2F2F2"/>
-          </w:tcPr>
-          <w:p>
-            <w:r/>
-            <w:r>
-              <w:rPr>
-                <w:rFonts w:ascii="Calibri" w:hAnsi="Calibri"/>
-                <w:b w:val="0"/>
-                <w:i w:val="0"/>
-                <w:sz w:val="18"/>
-              </w:rPr>
-              <w:t>bluemantis.com</w:t>
-            </w:r>
-          </w:p>
-        </w:tc>
-        <w:tc>
-          <w:tcPr>
-            <w:tcW w:type="dxa" w:w="1440"/>
-            <w:shd w:val="clear" w:color="auto" w:fill="F2F2F2"/>
-          </w:tcPr>
-          <w:p>
-            <w:r/>
-            <w:r>
-              <w:rPr>
-                <w:rFonts w:ascii="Calibri" w:hAnsi="Calibri"/>
-                <w:b w:val="0"/>
-                <w:i w:val="0"/>
-                <w:sz w:val="18"/>
-              </w:rPr>
-              <w:t>152</w:t>
-            </w:r>
-          </w:p>
-        </w:tc>
-        <w:tc>
-          <w:tcPr>
-            <w:tcW w:type="dxa" w:w="1440"/>
-            <w:shd w:val="clear" w:color="auto" w:fill="F2F2F2"/>
-          </w:tcPr>
-          <w:p>
-            <w:r/>
-            <w:r>
-              <w:rPr>
-                <w:rFonts w:ascii="Calibri" w:hAnsi="Calibri"/>
-                <w:b w:val="0"/>
-                <w:i w:val="0"/>
-                <w:sz w:val="18"/>
-              </w:rPr>
-              <w:t>1</w:t>
-            </w:r>
-          </w:p>
-        </w:tc>
-        <w:tc>
-          <w:tcPr>
-            <w:tcW w:type="dxa" w:w="1296"/>
-            <w:shd w:val="clear" w:color="auto" w:fill="F2F2F2"/>
-          </w:tcPr>
-          <w:p>
-            <w:r/>
-            <w:r>
-              <w:rPr>
-                <w:rFonts w:ascii="Calibri" w:hAnsi="Calibri"/>
-                <w:b w:val="0"/>
-                <w:i w:val="0"/>
-                <w:sz w:val="18"/>
-              </w:rPr>
-              <w:t>10</w:t>
-            </w:r>
-          </w:p>
-        </w:tc>
-        <w:tc>
-          <w:tcPr>
-            <w:tcW w:type="dxa" w:w="1296"/>
-            <w:shd w:val="clear" w:color="auto" w:fill="F2F2F2"/>
-          </w:tcPr>
-          <w:p>
-            <w:r/>
-            <w:r>
-              <w:rPr>
-                <w:rFonts w:ascii="Calibri" w:hAnsi="Calibri"/>
-                <w:b w:val="0"/>
-                <w:i w:val="0"/>
-                <w:sz w:val="18"/>
-              </w:rPr>
-              <w:t>16 Jun</w:t>
-            </w:r>
-          </w:p>
-        </w:tc>
-      </w:tr>
-      <w:tr>
-        <w:tc>
-          <w:tcPr>
-            <w:tcW w:type="dxa" w:w="2592"/>
-            <w:shd w:val="clear" w:color="auto" w:fill="FFFFFF"/>
-          </w:tcPr>
-          <w:p>
-            <w:r/>
-            <w:r>
-              <w:rPr>
-                <w:rFonts w:ascii="Calibri" w:hAnsi="Calibri"/>
-                <w:b w:val="0"/>
-                <w:i w:val="0"/>
-                <w:sz w:val="18"/>
-              </w:rPr>
-              <w:t>adam schutska</w:t>
-            </w:r>
-          </w:p>
-        </w:tc>
-        <w:tc>
-          <w:tcPr>
-            <w:tcW w:type="dxa" w:w="2592"/>
-            <w:shd w:val="clear" w:color="auto" w:fill="FFFFFF"/>
-          </w:tcPr>
-          <w:p>
-            <w:r/>
-            <w:r>
-              <w:rPr>
-                <w:rFonts w:ascii="Calibri" w:hAnsi="Calibri"/>
-                <w:b w:val="0"/>
-                <w:i w:val="0"/>
-                <w:sz w:val="18"/>
-              </w:rPr>
-              <w:t>bluemantis.com</w:t>
-            </w:r>
-          </w:p>
-        </w:tc>
-        <w:tc>
-          <w:tcPr>
-            <w:tcW w:type="dxa" w:w="1440"/>
-            <w:shd w:val="clear" w:color="auto" w:fill="FFFFFF"/>
-          </w:tcPr>
-          <w:p>
-            <w:r/>
-            <w:r>
-              <w:rPr>
-                <w:rFonts w:ascii="Calibri" w:hAnsi="Calibri"/>
-                <w:b w:val="0"/>
-                <w:i w:val="0"/>
-                <w:sz w:val="18"/>
-              </w:rPr>
-              <w:t>—</w:t>
-            </w:r>
-          </w:p>
-        </w:tc>
-        <w:tc>
-          <w:tcPr>
-            <w:tcW w:type="dxa" w:w="1440"/>
-            <w:shd w:val="clear" w:color="auto" w:fill="FFFFFF"/>
-          </w:tcPr>
-          <w:p>
-            <w:r/>
-            <w:r>
-              <w:rPr>
-                <w:rFonts w:ascii="Calibri" w:hAnsi="Calibri"/>
-                <w:b w:val="0"/>
-                <w:i w:val="0"/>
-                <w:sz w:val="18"/>
-              </w:rPr>
-              <w:t>—</w:t>
-            </w:r>
-          </w:p>
-        </w:tc>
-        <w:tc>
-          <w:tcPr>
-            <w:tcW w:type="dxa" w:w="1296"/>
-            <w:shd w:val="clear" w:color="auto" w:fill="FFFFFF"/>
-          </w:tcPr>
-          <w:p>
-            <w:r/>
-            <w:r>
-              <w:rPr>
-                <w:rFonts w:ascii="Calibri" w:hAnsi="Calibri"/>
-                <w:b w:val="0"/>
-                <w:i w:val="0"/>
-                <w:sz w:val="18"/>
-              </w:rPr>
-              <w:t>—</w:t>
-            </w:r>
-          </w:p>
-        </w:tc>
-        <w:tc>
-          <w:tcPr>
-            <w:tcW w:type="dxa" w:w="1296"/>
-            <w:shd w:val="clear" w:color="auto" w:fill="FFFFFF"/>
-          </w:tcPr>
-          <w:p>
-            <w:r/>
-            <w:r>
-              <w:rPr>
-                <w:rFonts w:ascii="Calibri" w:hAnsi="Calibri"/>
-                <w:b w:val="0"/>
-                <w:i w:val="0"/>
-                <w:sz w:val="18"/>
-              </w:rPr>
-              <w:t>15 Jun</w:t>
-            </w:r>
-          </w:p>
-        </w:tc>
-      </w:tr>
-      <w:tr>
-        <w:tc>
-          <w:tcPr>
-            <w:tcW w:type="dxa" w:w="2592"/>
-            <w:shd w:val="clear" w:color="auto" w:fill="F2F2F2"/>
-          </w:tcPr>
-          <w:p>
-            <w:r/>
-            <w:r>
-              <w:rPr>
-                <w:rFonts w:ascii="Calibri" w:hAnsi="Calibri"/>
-                <w:b w:val="0"/>
-                <w:i w:val="0"/>
-                <w:sz w:val="18"/>
-              </w:rPr>
-              <w:t>bhavana prabhuswamy</w:t>
-            </w:r>
-          </w:p>
-        </w:tc>
-        <w:tc>
-          <w:tcPr>
-            <w:tcW w:type="dxa" w:w="2592"/>
-            <w:shd w:val="clear" w:color="auto" w:fill="F2F2F2"/>
-          </w:tcPr>
-          <w:p>
-            <w:r/>
-            <w:r>
-              <w:rPr>
-                <w:rFonts w:ascii="Calibri" w:hAnsi="Calibri"/>
-                <w:b w:val="0"/>
-                <w:i w:val="0"/>
-                <w:sz w:val="18"/>
-              </w:rPr>
-              <w:t>bluemantis.com</w:t>
-            </w:r>
-          </w:p>
-        </w:tc>
-        <w:tc>
-          <w:tcPr>
-            <w:tcW w:type="dxa" w:w="1440"/>
-            <w:shd w:val="clear" w:color="auto" w:fill="F2F2F2"/>
-          </w:tcPr>
-          <w:p>
-            <w:r/>
-            <w:r>
-              <w:rPr>
-                <w:rFonts w:ascii="Calibri" w:hAnsi="Calibri"/>
-                <w:b w:val="0"/>
-                <w:i w:val="0"/>
-                <w:sz w:val="18"/>
-              </w:rPr>
-              <w:t>—</w:t>
-            </w:r>
-          </w:p>
-        </w:tc>
-        <w:tc>
-          <w:tcPr>
-            <w:tcW w:type="dxa" w:w="1440"/>
-            <w:shd w:val="clear" w:color="auto" w:fill="F2F2F2"/>
-          </w:tcPr>
-          <w:p>
-            <w:r/>
-            <w:r>
-              <w:rPr>
-                <w:rFonts w:ascii="Calibri" w:hAnsi="Calibri"/>
-                <w:b w:val="0"/>
-                <w:i w:val="0"/>
-                <w:sz w:val="18"/>
-              </w:rPr>
-              <w:t>—</w:t>
-            </w:r>
-          </w:p>
-        </w:tc>
-        <w:tc>
-          <w:tcPr>
-            <w:tcW w:type="dxa" w:w="1296"/>
-            <w:shd w:val="clear" w:color="auto" w:fill="F2F2F2"/>
-          </w:tcPr>
-          <w:p>
-            <w:r/>
-            <w:r>
-              <w:rPr>
-                <w:rFonts w:ascii="Calibri" w:hAnsi="Calibri"/>
-                <w:b w:val="0"/>
-                <w:i w:val="0"/>
-                <w:sz w:val="18"/>
-              </w:rPr>
-              <w:t>—</w:t>
-            </w:r>
-          </w:p>
-        </w:tc>
-        <w:tc>
-          <w:tcPr>
-            <w:tcW w:type="dxa" w:w="1296"/>
-            <w:shd w:val="clear" w:color="auto" w:fill="F2F2F2"/>
-          </w:tcPr>
-          <w:p>
-            <w:r/>
-            <w:r>
-              <w:rPr>
-                <w:rFonts w:ascii="Calibri" w:hAnsi="Calibri"/>
-                <w:b w:val="0"/>
-                <w:i w:val="0"/>
-                <w:sz w:val="18"/>
-              </w:rPr>
-              <w:t>15 Jun</w:t>
-            </w:r>
-          </w:p>
-        </w:tc>
-      </w:tr>
-      <w:tr>
-        <w:tc>
-          <w:tcPr>
-            <w:tcW w:type="dxa" w:w="2592"/>
-            <w:shd w:val="clear" w:color="auto" w:fill="FFFFFF"/>
-          </w:tcPr>
-          <w:p>
-            <w:r/>
-            <w:r>
-              <w:rPr>
-                <w:rFonts w:ascii="Calibri" w:hAnsi="Calibri"/>
-                <w:b w:val="0"/>
-                <w:i w:val="0"/>
-                <w:sz w:val="18"/>
-              </w:rPr>
-              <w:t>rj gravel</w:t>
-            </w:r>
-          </w:p>
-        </w:tc>
-        <w:tc>
-          <w:tcPr>
-            <w:tcW w:type="dxa" w:w="2592"/>
-            <w:shd w:val="clear" w:color="auto" w:fill="FFFFFF"/>
-          </w:tcPr>
-          <w:p>
-            <w:r/>
-            <w:r>
-              <w:rPr>
-                <w:rFonts w:ascii="Calibri" w:hAnsi="Calibri"/>
-                <w:b w:val="0"/>
-                <w:i w:val="0"/>
-                <w:sz w:val="18"/>
-              </w:rPr>
-              <w:t>bluemantis.com</w:t>
-            </w:r>
-          </w:p>
-        </w:tc>
-        <w:tc>
-          <w:tcPr>
-            <w:tcW w:type="dxa" w:w="1440"/>
-            <w:shd w:val="clear" w:color="auto" w:fill="FFFFFF"/>
-          </w:tcPr>
-          <w:p>
-            <w:r/>
-            <w:r>
-              <w:rPr>
-                <w:rFonts w:ascii="Calibri" w:hAnsi="Calibri"/>
-                <w:b w:val="0"/>
-                <w:i w:val="0"/>
-                <w:sz w:val="18"/>
-              </w:rPr>
-              <w:t>—</w:t>
-            </w:r>
-          </w:p>
-        </w:tc>
-        <w:tc>
-          <w:tcPr>
-            <w:tcW w:type="dxa" w:w="1440"/>
-            <w:shd w:val="clear" w:color="auto" w:fill="FFFFFF"/>
-          </w:tcPr>
-          <w:p>
-            <w:r/>
-            <w:r>
-              <w:rPr>
-                <w:rFonts w:ascii="Calibri" w:hAnsi="Calibri"/>
-                <w:b w:val="0"/>
-                <w:i w:val="0"/>
-                <w:sz w:val="18"/>
-              </w:rPr>
-              <w:t>—</w:t>
-            </w:r>
-          </w:p>
-        </w:tc>
-        <w:tc>
-          <w:tcPr>
-            <w:tcW w:type="dxa" w:w="1296"/>
-            <w:shd w:val="clear" w:color="auto" w:fill="FFFFFF"/>
-          </w:tcPr>
-          <w:p>
-            <w:r/>
-            <w:r>
-              <w:rPr>
-                <w:rFonts w:ascii="Calibri" w:hAnsi="Calibri"/>
-                <w:b w:val="0"/>
-                <w:i w:val="0"/>
-                <w:sz w:val="18"/>
-              </w:rPr>
-              <w:t>—</w:t>
-            </w:r>
-          </w:p>
-        </w:tc>
-        <w:tc>
-          <w:tcPr>
-            <w:tcW w:type="dxa" w:w="1296"/>
-            <w:shd w:val="clear" w:color="auto" w:fill="FFFFFF"/>
-          </w:tcPr>
-          <w:p>
-            <w:r/>
-            <w:r>
-              <w:rPr>
-                <w:rFonts w:ascii="Calibri" w:hAnsi="Calibri"/>
-                <w:b w:val="0"/>
-                <w:i w:val="0"/>
-                <w:sz w:val="18"/>
-              </w:rPr>
-              <w:t>19 May</w:t>
-            </w:r>
-          </w:p>
-        </w:tc>
-      </w:tr>
-      <w:tr>
-        <w:tc>
-          <w:tcPr>
-            <w:tcW w:type="dxa" w:w="2592"/>
-            <w:shd w:val="clear" w:color="auto" w:fill="F2F2F2"/>
-          </w:tcPr>
-          <w:p>
-            <w:r/>
-            <w:r>
-              <w:rPr>
-                <w:rFonts w:ascii="Calibri" w:hAnsi="Calibri"/>
-                <w:b w:val="0"/>
-                <w:i w:val="0"/>
-                <w:sz w:val="18"/>
-              </w:rPr>
-              <w:t>abagchi</w:t>
-            </w:r>
-          </w:p>
-        </w:tc>
-        <w:tc>
-          <w:tcPr>
-            <w:tcW w:type="dxa" w:w="2592"/>
-            <w:shd w:val="clear" w:color="auto" w:fill="F2F2F2"/>
-          </w:tcPr>
-          <w:p>
-            <w:r/>
-            <w:r>
-              <w:rPr>
-                <w:rFonts w:ascii="Calibri" w:hAnsi="Calibri"/>
-                <w:b w:val="0"/>
-                <w:i w:val="0"/>
-                <w:sz w:val="18"/>
-              </w:rPr>
-              <w:t>corestack.io</w:t>
-            </w:r>
-          </w:p>
-        </w:tc>
-        <w:tc>
-          <w:tcPr>
-            <w:tcW w:type="dxa" w:w="1440"/>
-            <w:shd w:val="clear" w:color="auto" w:fill="F2F2F2"/>
-          </w:tcPr>
-          <w:p>
-            <w:r/>
-            <w:r>
-              <w:rPr>
-                <w:rFonts w:ascii="Calibri" w:hAnsi="Calibri"/>
-                <w:b w:val="0"/>
-                <w:i w:val="0"/>
-                <w:sz w:val="18"/>
-              </w:rPr>
-              <w:t>—</w:t>
-            </w:r>
-          </w:p>
-        </w:tc>
-        <w:tc>
-          <w:tcPr>
-            <w:tcW w:type="dxa" w:w="1440"/>
-            <w:shd w:val="clear" w:color="auto" w:fill="F2F2F2"/>
-          </w:tcPr>
-          <w:p>
-            <w:r/>
-            <w:r>
-              <w:rPr>
-                <w:rFonts w:ascii="Calibri" w:hAnsi="Calibri"/>
-                <w:b w:val="0"/>
-                <w:i w:val="0"/>
-                <w:sz w:val="18"/>
-              </w:rPr>
-              <w:t>—</w:t>
-            </w:r>
-          </w:p>
-        </w:tc>
-        <w:tc>
-          <w:tcPr>
-            <w:tcW w:type="dxa" w:w="1296"/>
-            <w:shd w:val="clear" w:color="auto" w:fill="F2F2F2"/>
-          </w:tcPr>
-          <w:p>
-            <w:r/>
-            <w:r>
-              <w:rPr>
-                <w:rFonts w:ascii="Calibri" w:hAnsi="Calibri"/>
-                <w:b w:val="0"/>
-                <w:i w:val="0"/>
-                <w:sz w:val="18"/>
-              </w:rPr>
-              <w:t>—</w:t>
-            </w:r>
-          </w:p>
-        </w:tc>
-        <w:tc>
-          <w:tcPr>
-            <w:tcW w:type="dxa" w:w="1296"/>
-            <w:shd w:val="clear" w:color="auto" w:fill="F2F2F2"/>
-          </w:tcPr>
-          <w:p>
-            <w:r/>
-            <w:r>
-              <w:rPr>
-                <w:rFonts w:ascii="Calibri" w:hAnsi="Calibri"/>
-                <w:b w:val="0"/>
-                <w:i w:val="0"/>
-                <w:sz w:val="18"/>
-              </w:rPr>
-              <w:t>2 Jun</w:t>
-            </w:r>
-          </w:p>
-        </w:tc>
-      </w:tr>
-      <w:tr>
-        <w:tc>
-          <w:tcPr>
-            <w:tcW w:type="dxa" w:w="2592"/>
-            <w:shd w:val="clear" w:color="auto" w:fill="FFFFFF"/>
-          </w:tcPr>
-          <w:p>
-            <w:r/>
-            <w:r>
-              <w:rPr>
-                <w:rFonts w:ascii="Calibri" w:hAnsi="Calibri"/>
-                <w:b w:val="0"/>
-                <w:i w:val="0"/>
-                <w:sz w:val="18"/>
-              </w:rPr>
-              <w:t>cspbillingapi</w:t>
-            </w:r>
-          </w:p>
-        </w:tc>
-        <w:tc>
-          <w:tcPr>
-            <w:tcW w:type="dxa" w:w="2592"/>
-            <w:shd w:val="clear" w:color="auto" w:fill="FFFFFF"/>
-          </w:tcPr>
-          <w:p>
-            <w:r/>
-            <w:r>
-              <w:rPr>
-                <w:rFonts w:ascii="Calibri" w:hAnsi="Calibri"/>
-                <w:b w:val="0"/>
-                <w:i w:val="0"/>
-                <w:sz w:val="18"/>
-              </w:rPr>
-              <w:t>bluemantis.com</w:t>
-            </w:r>
-          </w:p>
-        </w:tc>
-        <w:tc>
-          <w:tcPr>
-            <w:tcW w:type="dxa" w:w="1440"/>
-            <w:shd w:val="clear" w:color="auto" w:fill="FFFFFF"/>
-          </w:tcPr>
-          <w:p>
-            <w:r/>
-            <w:r>
-              <w:rPr>
-                <w:rFonts w:ascii="Calibri" w:hAnsi="Calibri"/>
-                <w:b w:val="0"/>
-                <w:i w:val="0"/>
-                <w:sz w:val="18"/>
-              </w:rPr>
-              <w:t>—</w:t>
-            </w:r>
-          </w:p>
-        </w:tc>
-        <w:tc>
-          <w:tcPr>
-            <w:tcW w:type="dxa" w:w="1440"/>
-            <w:shd w:val="clear" w:color="auto" w:fill="FFFFFF"/>
-          </w:tcPr>
-          <w:p>
-            <w:r/>
-            <w:r>
-              <w:rPr>
-                <w:rFonts w:ascii="Calibri" w:hAnsi="Calibri"/>
-                <w:b w:val="0"/>
-                <w:i w:val="0"/>
-                <w:sz w:val="18"/>
-              </w:rPr>
-              <w:t>—</w:t>
-            </w:r>
-          </w:p>
-        </w:tc>
-        <w:tc>
-          <w:tcPr>
-            <w:tcW w:type="dxa" w:w="1296"/>
-            <w:shd w:val="clear" w:color="auto" w:fill="FFFFFF"/>
-          </w:tcPr>
-          <w:p>
-            <w:r/>
-            <w:r>
-              <w:rPr>
-                <w:rFonts w:ascii="Calibri" w:hAnsi="Calibri"/>
-                <w:b w:val="0"/>
-                <w:i w:val="0"/>
-                <w:sz w:val="18"/>
-              </w:rPr>
-              <w:t>—</w:t>
-            </w:r>
-          </w:p>
-        </w:tc>
-        <w:tc>
-          <w:tcPr>
-            <w:tcW w:type="dxa" w:w="1296"/>
-            <w:shd w:val="clear" w:color="auto" w:fill="FFFFFF"/>
-          </w:tcPr>
-          <w:p>
-            <w:r/>
-            <w:r>
-              <w:rPr>
-                <w:rFonts w:ascii="Calibri" w:hAnsi="Calibri"/>
-                <w:b w:val="0"/>
-                <w:i w:val="0"/>
-                <w:sz w:val="18"/>
-              </w:rPr>
-              <w:t>26 May</w:t>
-            </w:r>
-          </w:p>
-        </w:tc>
-      </w:tr>
-    </w:tbl>
-    <w:p/>
-    <w:tbl>
-      <w:tblPr>
-        <w:tblStyle w:val="TableGrid"/>
-        <w:tblW w:type="auto" w:w="0"/>
-        <w:jc w:val="left"/>
-        <w:tblLook w:firstColumn="1" w:firstRow="1" w:lastColumn="0" w:lastRow="0" w:noHBand="0" w:noVBand="1" w:val="04A0"/>
-      </w:tblPr>
-      <w:tblGrid>
-        <w:gridCol w:w="5100"/>
-        <w:gridCol w:w="5100"/>
-      </w:tblGrid>
-      <w:tr>
-        <w:tc>
-          <w:tcPr>
-            <w:tcW w:type="dxa" w:w="4896"/>
-            <w:shd w:val="clear" w:color="auto" w:fill="FFFFFF"/>
-          </w:tcPr>
-          <w:p>
-            <w:r>
-              <w:drawing>
-                <wp:inline xmlns:a="http://schemas.openxmlformats.org/drawingml/2006/main" xmlns:pic="http://schemas.openxmlformats.org/drawingml/2006/picture">
-                  <wp:extent cx="3017520" cy="2387148"/>
-                  <wp:docPr id="3" name="Picture 3"/>
-                  <wp:cNvGraphicFramePr>
-                    <a:graphicFrameLocks noChangeAspect="1"/>
-                  </wp:cNvGraphicFramePr>
-                  <a:graphic>
-                    <a:graphicData uri="http://schemas.openxmlformats.org/drawingml/2006/picture">
-                      <pic:pic>
-                        <pic:nvPicPr>
-                          <pic:cNvPr id="0" name="image.png"/>
-                          <pic:cNvPicPr/>
-                        </pic:nvPicPr>
-                        <pic:blipFill>
-                          <a:blip r:embed="rId11"/>
-                          <a:stretch>
-                            <a:fillRect/>
-                          </a:stretch>
-                        </pic:blipFill>
-                        <pic:spPr>
-                          <a:xfrm>
-                            <a:off x="0" y="0"/>
-                            <a:ext cx="3017520" cy="2387148"/>
-                          </a:xfrm>
-                          <a:prstGeom prst="rect"/>
-                        </pic:spPr>
-                      </pic:pic>
-                    </a:graphicData>
-                  </a:graphic>
-                </wp:inline>
-              </w:drawing>
-            </w:r>
-          </w:p>
-        </w:tc>
-        <w:tc>
-          <w:tcPr>
-            <w:tcW w:type="dxa" w:w="4896"/>
-            <w:shd w:val="clear" w:color="auto" w:fill="FFFFFF"/>
-          </w:tcPr>
-          <w:p>
-            <w:r>
-              <w:drawing>
-                <wp:inline xmlns:a="http://schemas.openxmlformats.org/drawingml/2006/main" xmlns:pic="http://schemas.openxmlformats.org/drawingml/2006/picture">
-                  <wp:extent cx="3017520" cy="1225441"/>
-                  <wp:docPr id="4" name="Picture 4"/>
-                  <wp:cNvGraphicFramePr>
-                    <a:graphicFrameLocks noChangeAspect="1"/>
-                  </wp:cNvGraphicFramePr>
-                  <a:graphic>
-                    <a:graphicData uri="http://schemas.openxmlformats.org/drawingml/2006/picture">
-                      <pic:pic>
-                        <pic:nvPicPr>
-                          <pic:cNvPr id="0" name="image.png"/>
-                          <pic:cNvPicPr/>
-                        </pic:nvPicPr>
-                        <pic:blipFill>
-                          <a:blip r:embed="rId10"/>
-                          <a:stretch>
-                            <a:fillRect/>
-                          </a:stretch>
-                        </pic:blipFill>
-                        <pic:spPr>
-                          <a:xfrm>
-                            <a:off x="0" y="0"/>
-                            <a:ext cx="3017520" cy="1225441"/>
-                          </a:xfrm>
-                          <a:prstGeom prst="rect"/>
-                        </pic:spPr>
-                      </pic:pic>
-                    </a:graphicData>
-                  </a:graphic>
-                </wp:inline>
-              </w:drawing>
-            </w:r>
-          </w:p>
-        </w:tc>
-      </w:tr>
-    </w:tbl>
-    <w:p/>
-    <w:p>
-      <w:pPr>
-        <w:spacing w:before="200" w:after="40"/>
-        <w:jc w:val="left"/>
-      </w:pPr>
-      <w:r>
-        <w:rPr>
-          <w:rFonts w:ascii="Calibri" w:hAnsi="Calibri"/>
-          <w:b/>
-          <w:i w:val="0"/>
-          <w:color w:val="1F2937"/>
-          <w:sz w:val="20"/>
-        </w:rPr>
-        <w:t>Top pages — USEast (useast.corestack.io)</w:t>
+        <w:t>Top pages visited</w:t>
       </w:r>
     </w:p>
     <w:tbl>
@@ -2948,7 +2850,7 @@
                 <w:color w:val="FFFFFF"/>
                 <w:sz w:val="18"/>
               </w:rPr>
-              <w:t>Type</w:t>
+              <w:t>Classification</w:t>
             </w:r>
           </w:p>
         </w:tc>
@@ -3361,7 +3263,7 @@
               <w:drawing>
                 <wp:inline xmlns:a="http://schemas.openxmlformats.org/drawingml/2006/main" xmlns:pic="http://schemas.openxmlformats.org/drawingml/2006/picture">
                   <wp:extent cx="3017520" cy="2618226"/>
-                  <wp:docPr id="5" name="Picture 5"/>
+                  <wp:docPr id="3" name="Picture 3"/>
                   <wp:cNvGraphicFramePr>
                     <a:graphicFrameLocks noChangeAspect="1"/>
                   </wp:cNvGraphicFramePr>
@@ -3373,7 +3275,7 @@
                           <pic:cNvPicPr/>
                         </pic:nvPicPr>
                         <pic:blipFill>
-                          <a:blip r:embed="rId12"/>
+                          <a:blip r:embed="rId11"/>
                           <a:stretch>
                             <a:fillRect/>
                           </a:stretch>
@@ -3403,7 +3305,7 @@
               <w:drawing>
                 <wp:inline xmlns:a="http://schemas.openxmlformats.org/drawingml/2006/main" xmlns:pic="http://schemas.openxmlformats.org/drawingml/2006/picture">
                   <wp:extent cx="3017520" cy="2126502"/>
-                  <wp:docPr id="6" name="Picture 6"/>
+                  <wp:docPr id="4" name="Picture 4"/>
                   <wp:cNvGraphicFramePr>
                     <a:graphicFrameLocks noChangeAspect="1"/>
                   </wp:cNvGraphicFramePr>
@@ -3415,7 +3317,7 @@
                           <pic:cNvPicPr/>
                         </pic:nvPicPr>
                         <pic:blipFill>
-                          <a:blip r:embed="rId13"/>
+                          <a:blip r:embed="rId12"/>
                           <a:stretch>
                             <a:fillRect/>
                           </a:stretch>
@@ -3450,7 +3352,7 @@
           <w:color w:val="757575"/>
           <w:sz w:val="16"/>
         </w:rPr>
-        <w:t>CoreStack · Cloud Operations Intelligence · Daily scrum report   N-2 = jobs created 24h–48h ago  ·  Slow = request ≥30s</w:t>
+        <w:t>CoreStack · Cloud Operations Intelligence  ·  Daily scrum report  ·  N-2 = jobs created 24h–48h ago  ·  Slow = request ≥30s</w:t>
       </w:r>
     </w:p>
     <w:sectPr>

</xml_diff>

<commit_message>
Rewrite Pendo fetch: two-query approach to show all segment visitors
Query 1 fetches all visitor metadata; Query 2 fetches event counts for the
window. Join in Python so all Blackstone segment members appear in the table
(with — for those inactive in the window), matching June 17 reference doc.
Pages: remove PQL filter, exclude synthetic pageIds (allevents etc) in Python.
</commit_message>
<xml_diff>
--- a/Blackstone_Scrum_20260618.docx
+++ b/Blackstone_Scrum_20260618.docx
@@ -31,7 +31,7 @@
           <w:color w:val="757575"/>
           <w:sz w:val="18"/>
         </w:rPr>
-        <w:t>Thursday, June 18, 2026   ·   Report generated 6:49 PM IST</w:t>
+        <w:t>Thursday, June 18, 2026   ·   Report generated 6:53 PM IST</w:t>
       </w:r>
     </w:p>
     <w:p>
@@ -840,7 +840,7 @@
           <w:color w:val="0070C0"/>
           <w:sz w:val="18"/>
         </w:rPr>
-        <w:t>5 active visitors</w:t>
+        <w:t>0 active visitors</w:t>
       </w:r>
       <w:r>
         <w:rPr>
@@ -860,7 +860,7 @@
           <w:color w:val="0070C0"/>
           <w:sz w:val="18"/>
         </w:rPr>
-        <w:t>6 active visitors</w:t>
+        <w:t>0 active visitors</w:t>
       </w:r>
     </w:p>
     <w:p>
@@ -1052,7 +1052,7 @@
                 <w:i w:val="0"/>
                 <w:sz w:val="18"/>
               </w:rPr>
-              <w:t>timo pantsari</w:t>
+              <w:t>—</w:t>
             </w:r>
           </w:p>
         </w:tc>
@@ -1070,7 +1070,7 @@
                 <w:i w:val="0"/>
                 <w:sz w:val="18"/>
               </w:rPr>
-              <w:t>blackstone.com</w:t>
+              <w:t>No activity in this window.</w:t>
             </w:r>
           </w:p>
         </w:tc>
@@ -1088,7 +1088,6 @@
                 <w:i w:val="0"/>
                 <w:sz w:val="18"/>
               </w:rPr>
-              <w:t>EU</w:t>
             </w:r>
           </w:p>
         </w:tc>
@@ -1106,7 +1105,6 @@
                 <w:i w:val="0"/>
                 <w:sz w:val="18"/>
               </w:rPr>
-              <w:t>—</w:t>
             </w:r>
           </w:p>
         </w:tc>
@@ -1124,7 +1122,6 @@
                 <w:i w:val="0"/>
                 <w:sz w:val="18"/>
               </w:rPr>
-              <w:t>—</w:t>
             </w:r>
           </w:p>
         </w:tc>
@@ -1142,7 +1139,6 @@
                 <w:i w:val="0"/>
                 <w:sz w:val="18"/>
               </w:rPr>
-              <w:t>—</w:t>
             </w:r>
           </w:p>
         </w:tc>
@@ -1160,1287 +1156,6 @@
                 <w:i w:val="0"/>
                 <w:sz w:val="18"/>
               </w:rPr>
-              <w:t>15 Jun</w:t>
-            </w:r>
-          </w:p>
-        </w:tc>
-      </w:tr>
-      <w:tr>
-        <w:tc>
-          <w:tcPr>
-            <w:tcW w:type="dxa" w:w="2304"/>
-            <w:shd w:val="clear" w:color="auto" w:fill="FFFFFF"/>
-          </w:tcPr>
-          <w:p>
-            <w:r/>
-            <w:r>
-              <w:rPr>
-                <w:rFonts w:ascii="Calibri" w:hAnsi="Calibri"/>
-                <w:b w:val="0"/>
-                <w:i w:val="0"/>
-                <w:sz w:val="18"/>
-              </w:rPr>
-              <w:t>alex</w:t>
-            </w:r>
-          </w:p>
-        </w:tc>
-        <w:tc>
-          <w:tcPr>
-            <w:tcW w:type="dxa" w:w="2160"/>
-            <w:shd w:val="clear" w:color="auto" w:fill="FFFFFF"/>
-          </w:tcPr>
-          <w:p>
-            <w:r/>
-            <w:r>
-              <w:rPr>
-                <w:rFonts w:ascii="Calibri" w:hAnsi="Calibri"/>
-                <w:b w:val="0"/>
-                <w:i w:val="0"/>
-                <w:sz w:val="18"/>
-              </w:rPr>
-              <w:t>aliando.com</w:t>
-            </w:r>
-          </w:p>
-        </w:tc>
-        <w:tc>
-          <w:tcPr>
-            <w:tcW w:type="dxa" w:w="1008"/>
-            <w:shd w:val="clear" w:color="auto" w:fill="FFFFFF"/>
-          </w:tcPr>
-          <w:p>
-            <w:r/>
-            <w:r>
-              <w:rPr>
-                <w:rFonts w:ascii="Calibri" w:hAnsi="Calibri"/>
-                <w:b w:val="0"/>
-                <w:i w:val="0"/>
-                <w:sz w:val="18"/>
-              </w:rPr>
-              <w:t>EU</w:t>
-            </w:r>
-          </w:p>
-        </w:tc>
-        <w:tc>
-          <w:tcPr>
-            <w:tcW w:type="dxa" w:w="1296"/>
-            <w:shd w:val="clear" w:color="auto" w:fill="FFFFFF"/>
-          </w:tcPr>
-          <w:p>
-            <w:r/>
-            <w:r>
-              <w:rPr>
-                <w:rFonts w:ascii="Calibri" w:hAnsi="Calibri"/>
-                <w:b w:val="0"/>
-                <w:i w:val="0"/>
-                <w:sz w:val="18"/>
-              </w:rPr>
-              <w:t>—</w:t>
-            </w:r>
-          </w:p>
-        </w:tc>
-        <w:tc>
-          <w:tcPr>
-            <w:tcW w:type="dxa" w:w="1296"/>
-            <w:shd w:val="clear" w:color="auto" w:fill="FFFFFF"/>
-          </w:tcPr>
-          <w:p>
-            <w:r/>
-            <w:r>
-              <w:rPr>
-                <w:rFonts w:ascii="Calibri" w:hAnsi="Calibri"/>
-                <w:b w:val="0"/>
-                <w:i w:val="0"/>
-                <w:sz w:val="18"/>
-              </w:rPr>
-              <w:t>—</w:t>
-            </w:r>
-          </w:p>
-        </w:tc>
-        <w:tc>
-          <w:tcPr>
-            <w:tcW w:type="dxa" w:w="1008"/>
-            <w:shd w:val="clear" w:color="auto" w:fill="FFFFFF"/>
-          </w:tcPr>
-          <w:p>
-            <w:r/>
-            <w:r>
-              <w:rPr>
-                <w:rFonts w:ascii="Calibri" w:hAnsi="Calibri"/>
-                <w:b w:val="0"/>
-                <w:i w:val="0"/>
-                <w:sz w:val="18"/>
-              </w:rPr>
-              <w:t>—</w:t>
-            </w:r>
-          </w:p>
-        </w:tc>
-        <w:tc>
-          <w:tcPr>
-            <w:tcW w:type="dxa" w:w="1296"/>
-            <w:shd w:val="clear" w:color="auto" w:fill="FFFFFF"/>
-          </w:tcPr>
-          <w:p>
-            <w:r/>
-            <w:r>
-              <w:rPr>
-                <w:rFonts w:ascii="Calibri" w:hAnsi="Calibri"/>
-                <w:b w:val="0"/>
-                <w:i w:val="0"/>
-                <w:sz w:val="18"/>
-              </w:rPr>
-              <w:t>1 Jun</w:t>
-            </w:r>
-          </w:p>
-        </w:tc>
-      </w:tr>
-      <w:tr>
-        <w:tc>
-          <w:tcPr>
-            <w:tcW w:type="dxa" w:w="2304"/>
-            <w:shd w:val="clear" w:color="auto" w:fill="F2F2F2"/>
-          </w:tcPr>
-          <w:p>
-            <w:r/>
-            <w:r>
-              <w:rPr>
-                <w:rFonts w:ascii="Calibri" w:hAnsi="Calibri"/>
-                <w:b w:val="0"/>
-                <w:i w:val="0"/>
-                <w:sz w:val="18"/>
-              </w:rPr>
-              <w:t>dipali koche</w:t>
-            </w:r>
-          </w:p>
-        </w:tc>
-        <w:tc>
-          <w:tcPr>
-            <w:tcW w:type="dxa" w:w="2160"/>
-            <w:shd w:val="clear" w:color="auto" w:fill="F2F2F2"/>
-          </w:tcPr>
-          <w:p>
-            <w:r/>
-            <w:r>
-              <w:rPr>
-                <w:rFonts w:ascii="Calibri" w:hAnsi="Calibri"/>
-                <w:b w:val="0"/>
-                <w:i w:val="0"/>
-                <w:sz w:val="18"/>
-              </w:rPr>
-              <w:t>bluemantis.com</w:t>
-            </w:r>
-          </w:p>
-        </w:tc>
-        <w:tc>
-          <w:tcPr>
-            <w:tcW w:type="dxa" w:w="1008"/>
-            <w:shd w:val="clear" w:color="auto" w:fill="F2F2F2"/>
-          </w:tcPr>
-          <w:p>
-            <w:r/>
-            <w:r>
-              <w:rPr>
-                <w:rFonts w:ascii="Calibri" w:hAnsi="Calibri"/>
-                <w:b w:val="0"/>
-                <w:i w:val="0"/>
-                <w:sz w:val="18"/>
-              </w:rPr>
-              <w:t>EU</w:t>
-            </w:r>
-          </w:p>
-        </w:tc>
-        <w:tc>
-          <w:tcPr>
-            <w:tcW w:type="dxa" w:w="1296"/>
-            <w:shd w:val="clear" w:color="auto" w:fill="F2F2F2"/>
-          </w:tcPr>
-          <w:p>
-            <w:r/>
-            <w:r>
-              <w:rPr>
-                <w:rFonts w:ascii="Calibri" w:hAnsi="Calibri"/>
-                <w:b w:val="0"/>
-                <w:i w:val="0"/>
-                <w:sz w:val="18"/>
-              </w:rPr>
-              <w:t>—</w:t>
-            </w:r>
-          </w:p>
-        </w:tc>
-        <w:tc>
-          <w:tcPr>
-            <w:tcW w:type="dxa" w:w="1296"/>
-            <w:shd w:val="clear" w:color="auto" w:fill="F2F2F2"/>
-          </w:tcPr>
-          <w:p>
-            <w:r/>
-            <w:r>
-              <w:rPr>
-                <w:rFonts w:ascii="Calibri" w:hAnsi="Calibri"/>
-                <w:b w:val="0"/>
-                <w:i w:val="0"/>
-                <w:sz w:val="18"/>
-              </w:rPr>
-              <w:t>—</w:t>
-            </w:r>
-          </w:p>
-        </w:tc>
-        <w:tc>
-          <w:tcPr>
-            <w:tcW w:type="dxa" w:w="1008"/>
-            <w:shd w:val="clear" w:color="auto" w:fill="F2F2F2"/>
-          </w:tcPr>
-          <w:p>
-            <w:r/>
-            <w:r>
-              <w:rPr>
-                <w:rFonts w:ascii="Calibri" w:hAnsi="Calibri"/>
-                <w:b w:val="0"/>
-                <w:i w:val="0"/>
-                <w:sz w:val="18"/>
-              </w:rPr>
-              <w:t>—</w:t>
-            </w:r>
-          </w:p>
-        </w:tc>
-        <w:tc>
-          <w:tcPr>
-            <w:tcW w:type="dxa" w:w="1296"/>
-            <w:shd w:val="clear" w:color="auto" w:fill="F2F2F2"/>
-          </w:tcPr>
-          <w:p>
-            <w:r/>
-            <w:r>
-              <w:rPr>
-                <w:rFonts w:ascii="Calibri" w:hAnsi="Calibri"/>
-                <w:b w:val="0"/>
-                <w:i w:val="0"/>
-                <w:sz w:val="18"/>
-              </w:rPr>
-              <w:t>1 Jun</w:t>
-            </w:r>
-          </w:p>
-        </w:tc>
-      </w:tr>
-      <w:tr>
-        <w:tc>
-          <w:tcPr>
-            <w:tcW w:type="dxa" w:w="2304"/>
-            <w:shd w:val="clear" w:color="auto" w:fill="FFFFFF"/>
-          </w:tcPr>
-          <w:p>
-            <w:r/>
-            <w:r>
-              <w:rPr>
-                <w:rFonts w:ascii="Calibri" w:hAnsi="Calibri"/>
-                <w:b w:val="0"/>
-                <w:i w:val="0"/>
-                <w:sz w:val="18"/>
-              </w:rPr>
-              <w:t>chris</w:t>
-            </w:r>
-          </w:p>
-        </w:tc>
-        <w:tc>
-          <w:tcPr>
-            <w:tcW w:type="dxa" w:w="2160"/>
-            <w:shd w:val="clear" w:color="auto" w:fill="FFFFFF"/>
-          </w:tcPr>
-          <w:p>
-            <w:r/>
-            <w:r>
-              <w:rPr>
-                <w:rFonts w:ascii="Calibri" w:hAnsi="Calibri"/>
-                <w:b w:val="0"/>
-                <w:i w:val="0"/>
-                <w:sz w:val="18"/>
-              </w:rPr>
-              <w:t>aliando.com</w:t>
-            </w:r>
-          </w:p>
-        </w:tc>
-        <w:tc>
-          <w:tcPr>
-            <w:tcW w:type="dxa" w:w="1008"/>
-            <w:shd w:val="clear" w:color="auto" w:fill="FFFFFF"/>
-          </w:tcPr>
-          <w:p>
-            <w:r/>
-            <w:r>
-              <w:rPr>
-                <w:rFonts w:ascii="Calibri" w:hAnsi="Calibri"/>
-                <w:b w:val="0"/>
-                <w:i w:val="0"/>
-                <w:sz w:val="18"/>
-              </w:rPr>
-              <w:t>EU</w:t>
-            </w:r>
-          </w:p>
-        </w:tc>
-        <w:tc>
-          <w:tcPr>
-            <w:tcW w:type="dxa" w:w="1296"/>
-            <w:shd w:val="clear" w:color="auto" w:fill="FFFFFF"/>
-          </w:tcPr>
-          <w:p>
-            <w:r/>
-            <w:r>
-              <w:rPr>
-                <w:rFonts w:ascii="Calibri" w:hAnsi="Calibri"/>
-                <w:b w:val="0"/>
-                <w:i w:val="0"/>
-                <w:sz w:val="18"/>
-              </w:rPr>
-              <w:t>—</w:t>
-            </w:r>
-          </w:p>
-        </w:tc>
-        <w:tc>
-          <w:tcPr>
-            <w:tcW w:type="dxa" w:w="1296"/>
-            <w:shd w:val="clear" w:color="auto" w:fill="FFFFFF"/>
-          </w:tcPr>
-          <w:p>
-            <w:r/>
-            <w:r>
-              <w:rPr>
-                <w:rFonts w:ascii="Calibri" w:hAnsi="Calibri"/>
-                <w:b w:val="0"/>
-                <w:i w:val="0"/>
-                <w:sz w:val="18"/>
-              </w:rPr>
-              <w:t>—</w:t>
-            </w:r>
-          </w:p>
-        </w:tc>
-        <w:tc>
-          <w:tcPr>
-            <w:tcW w:type="dxa" w:w="1008"/>
-            <w:shd w:val="clear" w:color="auto" w:fill="FFFFFF"/>
-          </w:tcPr>
-          <w:p>
-            <w:r/>
-            <w:r>
-              <w:rPr>
-                <w:rFonts w:ascii="Calibri" w:hAnsi="Calibri"/>
-                <w:b w:val="0"/>
-                <w:i w:val="0"/>
-                <w:sz w:val="18"/>
-              </w:rPr>
-              <w:t>—</w:t>
-            </w:r>
-          </w:p>
-        </w:tc>
-        <w:tc>
-          <w:tcPr>
-            <w:tcW w:type="dxa" w:w="1296"/>
-            <w:shd w:val="clear" w:color="auto" w:fill="FFFFFF"/>
-          </w:tcPr>
-          <w:p>
-            <w:r/>
-            <w:r>
-              <w:rPr>
-                <w:rFonts w:ascii="Calibri" w:hAnsi="Calibri"/>
-                <w:b w:val="0"/>
-                <w:i w:val="0"/>
-                <w:sz w:val="18"/>
-              </w:rPr>
-              <w:t>4 Jun</w:t>
-            </w:r>
-          </w:p>
-        </w:tc>
-      </w:tr>
-      <w:tr>
-        <w:tc>
-          <w:tcPr>
-            <w:tcW w:type="dxa" w:w="2304"/>
-            <w:shd w:val="clear" w:color="auto" w:fill="F2F2F2"/>
-          </w:tcPr>
-          <w:p>
-            <w:r/>
-            <w:r>
-              <w:rPr>
-                <w:rFonts w:ascii="Calibri" w:hAnsi="Calibri"/>
-                <w:b w:val="0"/>
-                <w:i w:val="0"/>
-                <w:sz w:val="18"/>
-              </w:rPr>
-              <w:t>dene donovan</w:t>
-            </w:r>
-          </w:p>
-        </w:tc>
-        <w:tc>
-          <w:tcPr>
-            <w:tcW w:type="dxa" w:w="2160"/>
-            <w:shd w:val="clear" w:color="auto" w:fill="F2F2F2"/>
-          </w:tcPr>
-          <w:p>
-            <w:r/>
-            <w:r>
-              <w:rPr>
-                <w:rFonts w:ascii="Calibri" w:hAnsi="Calibri"/>
-                <w:b w:val="0"/>
-                <w:i w:val="0"/>
-                <w:sz w:val="18"/>
-              </w:rPr>
-              <w:t>ingrammicro.com</w:t>
-            </w:r>
-          </w:p>
-        </w:tc>
-        <w:tc>
-          <w:tcPr>
-            <w:tcW w:type="dxa" w:w="1008"/>
-            <w:shd w:val="clear" w:color="auto" w:fill="F2F2F2"/>
-          </w:tcPr>
-          <w:p>
-            <w:r/>
-            <w:r>
-              <w:rPr>
-                <w:rFonts w:ascii="Calibri" w:hAnsi="Calibri"/>
-                <w:b w:val="0"/>
-                <w:i w:val="0"/>
-                <w:sz w:val="18"/>
-              </w:rPr>
-              <w:t>EU</w:t>
-            </w:r>
-          </w:p>
-        </w:tc>
-        <w:tc>
-          <w:tcPr>
-            <w:tcW w:type="dxa" w:w="1296"/>
-            <w:shd w:val="clear" w:color="auto" w:fill="F2F2F2"/>
-          </w:tcPr>
-          <w:p>
-            <w:r/>
-            <w:r>
-              <w:rPr>
-                <w:rFonts w:ascii="Calibri" w:hAnsi="Calibri"/>
-                <w:b w:val="0"/>
-                <w:i w:val="0"/>
-                <w:sz w:val="18"/>
-              </w:rPr>
-              <w:t>—</w:t>
-            </w:r>
-          </w:p>
-        </w:tc>
-        <w:tc>
-          <w:tcPr>
-            <w:tcW w:type="dxa" w:w="1296"/>
-            <w:shd w:val="clear" w:color="auto" w:fill="F2F2F2"/>
-          </w:tcPr>
-          <w:p>
-            <w:r/>
-            <w:r>
-              <w:rPr>
-                <w:rFonts w:ascii="Calibri" w:hAnsi="Calibri"/>
-                <w:b w:val="0"/>
-                <w:i w:val="0"/>
-                <w:sz w:val="18"/>
-              </w:rPr>
-              <w:t>—</w:t>
-            </w:r>
-          </w:p>
-        </w:tc>
-        <w:tc>
-          <w:tcPr>
-            <w:tcW w:type="dxa" w:w="1008"/>
-            <w:shd w:val="clear" w:color="auto" w:fill="F2F2F2"/>
-          </w:tcPr>
-          <w:p>
-            <w:r/>
-            <w:r>
-              <w:rPr>
-                <w:rFonts w:ascii="Calibri" w:hAnsi="Calibri"/>
-                <w:b w:val="0"/>
-                <w:i w:val="0"/>
-                <w:sz w:val="18"/>
-              </w:rPr>
-              <w:t>—</w:t>
-            </w:r>
-          </w:p>
-        </w:tc>
-        <w:tc>
-          <w:tcPr>
-            <w:tcW w:type="dxa" w:w="1296"/>
-            <w:shd w:val="clear" w:color="auto" w:fill="F2F2F2"/>
-          </w:tcPr>
-          <w:p>
-            <w:r/>
-            <w:r>
-              <w:rPr>
-                <w:rFonts w:ascii="Calibri" w:hAnsi="Calibri"/>
-                <w:b w:val="0"/>
-                <w:i w:val="0"/>
-                <w:sz w:val="18"/>
-              </w:rPr>
-              <w:t>9 Jun</w:t>
-            </w:r>
-          </w:p>
-        </w:tc>
-      </w:tr>
-      <w:tr>
-        <w:tc>
-          <w:tcPr>
-            <w:tcW w:type="dxa" w:w="2304"/>
-            <w:shd w:val="clear" w:color="auto" w:fill="FFFFFF"/>
-          </w:tcPr>
-          <w:p>
-            <w:r/>
-            <w:r>
-              <w:rPr>
-                <w:rFonts w:ascii="Calibri" w:hAnsi="Calibri"/>
-                <w:b w:val="0"/>
-                <w:i w:val="0"/>
-                <w:sz w:val="18"/>
-              </w:rPr>
-              <w:t>robert young</w:t>
-            </w:r>
-          </w:p>
-        </w:tc>
-        <w:tc>
-          <w:tcPr>
-            <w:tcW w:type="dxa" w:w="2160"/>
-            <w:shd w:val="clear" w:color="auto" w:fill="FFFFFF"/>
-          </w:tcPr>
-          <w:p>
-            <w:r/>
-            <w:r>
-              <w:rPr>
-                <w:rFonts w:ascii="Calibri" w:hAnsi="Calibri"/>
-                <w:b w:val="0"/>
-                <w:i w:val="0"/>
-                <w:sz w:val="18"/>
-              </w:rPr>
-              <w:t>bluemantis.com</w:t>
-            </w:r>
-          </w:p>
-        </w:tc>
-        <w:tc>
-          <w:tcPr>
-            <w:tcW w:type="dxa" w:w="1008"/>
-            <w:shd w:val="clear" w:color="auto" w:fill="FFFFFF"/>
-          </w:tcPr>
-          <w:p>
-            <w:r/>
-            <w:r>
-              <w:rPr>
-                <w:rFonts w:ascii="Calibri" w:hAnsi="Calibri"/>
-                <w:b w:val="0"/>
-                <w:i w:val="0"/>
-                <w:sz w:val="18"/>
-              </w:rPr>
-              <w:t>USEast</w:t>
-            </w:r>
-          </w:p>
-        </w:tc>
-        <w:tc>
-          <w:tcPr>
-            <w:tcW w:type="dxa" w:w="1296"/>
-            <w:shd w:val="clear" w:color="auto" w:fill="FFFFFF"/>
-          </w:tcPr>
-          <w:p>
-            <w:r/>
-            <w:r>
-              <w:rPr>
-                <w:rFonts w:ascii="Calibri" w:hAnsi="Calibri"/>
-                <w:b w:val="0"/>
-                <w:i w:val="0"/>
-                <w:sz w:val="18"/>
-              </w:rPr>
-              <w:t>152</w:t>
-            </w:r>
-          </w:p>
-        </w:tc>
-        <w:tc>
-          <w:tcPr>
-            <w:tcW w:type="dxa" w:w="1296"/>
-            <w:shd w:val="clear" w:color="auto" w:fill="FFFFFF"/>
-          </w:tcPr>
-          <w:p>
-            <w:r/>
-            <w:r>
-              <w:rPr>
-                <w:rFonts w:ascii="Calibri" w:hAnsi="Calibri"/>
-                <w:b w:val="0"/>
-                <w:i w:val="0"/>
-                <w:sz w:val="18"/>
-              </w:rPr>
-              <w:t>1</w:t>
-            </w:r>
-          </w:p>
-        </w:tc>
-        <w:tc>
-          <w:tcPr>
-            <w:tcW w:type="dxa" w:w="1008"/>
-            <w:shd w:val="clear" w:color="auto" w:fill="FFFFFF"/>
-          </w:tcPr>
-          <w:p>
-            <w:r/>
-            <w:r>
-              <w:rPr>
-                <w:rFonts w:ascii="Calibri" w:hAnsi="Calibri"/>
-                <w:b w:val="0"/>
-                <w:i w:val="0"/>
-                <w:sz w:val="18"/>
-              </w:rPr>
-              <w:t>10</w:t>
-            </w:r>
-          </w:p>
-        </w:tc>
-        <w:tc>
-          <w:tcPr>
-            <w:tcW w:type="dxa" w:w="1296"/>
-            <w:shd w:val="clear" w:color="auto" w:fill="FFFFFF"/>
-          </w:tcPr>
-          <w:p>
-            <w:r/>
-            <w:r>
-              <w:rPr>
-                <w:rFonts w:ascii="Calibri" w:hAnsi="Calibri"/>
-                <w:b w:val="0"/>
-                <w:i w:val="0"/>
-                <w:sz w:val="18"/>
-              </w:rPr>
-              <w:t>16 Jun</w:t>
-            </w:r>
-          </w:p>
-        </w:tc>
-      </w:tr>
-      <w:tr>
-        <w:tc>
-          <w:tcPr>
-            <w:tcW w:type="dxa" w:w="2304"/>
-            <w:shd w:val="clear" w:color="auto" w:fill="F2F2F2"/>
-          </w:tcPr>
-          <w:p>
-            <w:r/>
-            <w:r>
-              <w:rPr>
-                <w:rFonts w:ascii="Calibri" w:hAnsi="Calibri"/>
-                <w:b w:val="0"/>
-                <w:i w:val="0"/>
-                <w:sz w:val="18"/>
-              </w:rPr>
-              <w:t>adam schutska</w:t>
-            </w:r>
-          </w:p>
-        </w:tc>
-        <w:tc>
-          <w:tcPr>
-            <w:tcW w:type="dxa" w:w="2160"/>
-            <w:shd w:val="clear" w:color="auto" w:fill="F2F2F2"/>
-          </w:tcPr>
-          <w:p>
-            <w:r/>
-            <w:r>
-              <w:rPr>
-                <w:rFonts w:ascii="Calibri" w:hAnsi="Calibri"/>
-                <w:b w:val="0"/>
-                <w:i w:val="0"/>
-                <w:sz w:val="18"/>
-              </w:rPr>
-              <w:t>bluemantis.com</w:t>
-            </w:r>
-          </w:p>
-        </w:tc>
-        <w:tc>
-          <w:tcPr>
-            <w:tcW w:type="dxa" w:w="1008"/>
-            <w:shd w:val="clear" w:color="auto" w:fill="F2F2F2"/>
-          </w:tcPr>
-          <w:p>
-            <w:r/>
-            <w:r>
-              <w:rPr>
-                <w:rFonts w:ascii="Calibri" w:hAnsi="Calibri"/>
-                <w:b w:val="0"/>
-                <w:i w:val="0"/>
-                <w:sz w:val="18"/>
-              </w:rPr>
-              <w:t>USEast</w:t>
-            </w:r>
-          </w:p>
-        </w:tc>
-        <w:tc>
-          <w:tcPr>
-            <w:tcW w:type="dxa" w:w="1296"/>
-            <w:shd w:val="clear" w:color="auto" w:fill="F2F2F2"/>
-          </w:tcPr>
-          <w:p>
-            <w:r/>
-            <w:r>
-              <w:rPr>
-                <w:rFonts w:ascii="Calibri" w:hAnsi="Calibri"/>
-                <w:b w:val="0"/>
-                <w:i w:val="0"/>
-                <w:sz w:val="18"/>
-              </w:rPr>
-              <w:t>—</w:t>
-            </w:r>
-          </w:p>
-        </w:tc>
-        <w:tc>
-          <w:tcPr>
-            <w:tcW w:type="dxa" w:w="1296"/>
-            <w:shd w:val="clear" w:color="auto" w:fill="F2F2F2"/>
-          </w:tcPr>
-          <w:p>
-            <w:r/>
-            <w:r>
-              <w:rPr>
-                <w:rFonts w:ascii="Calibri" w:hAnsi="Calibri"/>
-                <w:b w:val="0"/>
-                <w:i w:val="0"/>
-                <w:sz w:val="18"/>
-              </w:rPr>
-              <w:t>—</w:t>
-            </w:r>
-          </w:p>
-        </w:tc>
-        <w:tc>
-          <w:tcPr>
-            <w:tcW w:type="dxa" w:w="1008"/>
-            <w:shd w:val="clear" w:color="auto" w:fill="F2F2F2"/>
-          </w:tcPr>
-          <w:p>
-            <w:r/>
-            <w:r>
-              <w:rPr>
-                <w:rFonts w:ascii="Calibri" w:hAnsi="Calibri"/>
-                <w:b w:val="0"/>
-                <w:i w:val="0"/>
-                <w:sz w:val="18"/>
-              </w:rPr>
-              <w:t>—</w:t>
-            </w:r>
-          </w:p>
-        </w:tc>
-        <w:tc>
-          <w:tcPr>
-            <w:tcW w:type="dxa" w:w="1296"/>
-            <w:shd w:val="clear" w:color="auto" w:fill="F2F2F2"/>
-          </w:tcPr>
-          <w:p>
-            <w:r/>
-            <w:r>
-              <w:rPr>
-                <w:rFonts w:ascii="Calibri" w:hAnsi="Calibri"/>
-                <w:b w:val="0"/>
-                <w:i w:val="0"/>
-                <w:sz w:val="18"/>
-              </w:rPr>
-              <w:t>15 Jun</w:t>
-            </w:r>
-          </w:p>
-        </w:tc>
-      </w:tr>
-      <w:tr>
-        <w:tc>
-          <w:tcPr>
-            <w:tcW w:type="dxa" w:w="2304"/>
-            <w:shd w:val="clear" w:color="auto" w:fill="FFFFFF"/>
-          </w:tcPr>
-          <w:p>
-            <w:r/>
-            <w:r>
-              <w:rPr>
-                <w:rFonts w:ascii="Calibri" w:hAnsi="Calibri"/>
-                <w:b w:val="0"/>
-                <w:i w:val="0"/>
-                <w:sz w:val="18"/>
-              </w:rPr>
-              <w:t>bhavana prabhuswamy</w:t>
-            </w:r>
-          </w:p>
-        </w:tc>
-        <w:tc>
-          <w:tcPr>
-            <w:tcW w:type="dxa" w:w="2160"/>
-            <w:shd w:val="clear" w:color="auto" w:fill="FFFFFF"/>
-          </w:tcPr>
-          <w:p>
-            <w:r/>
-            <w:r>
-              <w:rPr>
-                <w:rFonts w:ascii="Calibri" w:hAnsi="Calibri"/>
-                <w:b w:val="0"/>
-                <w:i w:val="0"/>
-                <w:sz w:val="18"/>
-              </w:rPr>
-              <w:t>bluemantis.com</w:t>
-            </w:r>
-          </w:p>
-        </w:tc>
-        <w:tc>
-          <w:tcPr>
-            <w:tcW w:type="dxa" w:w="1008"/>
-            <w:shd w:val="clear" w:color="auto" w:fill="FFFFFF"/>
-          </w:tcPr>
-          <w:p>
-            <w:r/>
-            <w:r>
-              <w:rPr>
-                <w:rFonts w:ascii="Calibri" w:hAnsi="Calibri"/>
-                <w:b w:val="0"/>
-                <w:i w:val="0"/>
-                <w:sz w:val="18"/>
-              </w:rPr>
-              <w:t>USEast</w:t>
-            </w:r>
-          </w:p>
-        </w:tc>
-        <w:tc>
-          <w:tcPr>
-            <w:tcW w:type="dxa" w:w="1296"/>
-            <w:shd w:val="clear" w:color="auto" w:fill="FFFFFF"/>
-          </w:tcPr>
-          <w:p>
-            <w:r/>
-            <w:r>
-              <w:rPr>
-                <w:rFonts w:ascii="Calibri" w:hAnsi="Calibri"/>
-                <w:b w:val="0"/>
-                <w:i w:val="0"/>
-                <w:sz w:val="18"/>
-              </w:rPr>
-              <w:t>—</w:t>
-            </w:r>
-          </w:p>
-        </w:tc>
-        <w:tc>
-          <w:tcPr>
-            <w:tcW w:type="dxa" w:w="1296"/>
-            <w:shd w:val="clear" w:color="auto" w:fill="FFFFFF"/>
-          </w:tcPr>
-          <w:p>
-            <w:r/>
-            <w:r>
-              <w:rPr>
-                <w:rFonts w:ascii="Calibri" w:hAnsi="Calibri"/>
-                <w:b w:val="0"/>
-                <w:i w:val="0"/>
-                <w:sz w:val="18"/>
-              </w:rPr>
-              <w:t>—</w:t>
-            </w:r>
-          </w:p>
-        </w:tc>
-        <w:tc>
-          <w:tcPr>
-            <w:tcW w:type="dxa" w:w="1008"/>
-            <w:shd w:val="clear" w:color="auto" w:fill="FFFFFF"/>
-          </w:tcPr>
-          <w:p>
-            <w:r/>
-            <w:r>
-              <w:rPr>
-                <w:rFonts w:ascii="Calibri" w:hAnsi="Calibri"/>
-                <w:b w:val="0"/>
-                <w:i w:val="0"/>
-                <w:sz w:val="18"/>
-              </w:rPr>
-              <w:t>—</w:t>
-            </w:r>
-          </w:p>
-        </w:tc>
-        <w:tc>
-          <w:tcPr>
-            <w:tcW w:type="dxa" w:w="1296"/>
-            <w:shd w:val="clear" w:color="auto" w:fill="FFFFFF"/>
-          </w:tcPr>
-          <w:p>
-            <w:r/>
-            <w:r>
-              <w:rPr>
-                <w:rFonts w:ascii="Calibri" w:hAnsi="Calibri"/>
-                <w:b w:val="0"/>
-                <w:i w:val="0"/>
-                <w:sz w:val="18"/>
-              </w:rPr>
-              <w:t>15 Jun</w:t>
-            </w:r>
-          </w:p>
-        </w:tc>
-      </w:tr>
-      <w:tr>
-        <w:tc>
-          <w:tcPr>
-            <w:tcW w:type="dxa" w:w="2304"/>
-            <w:shd w:val="clear" w:color="auto" w:fill="F2F2F2"/>
-          </w:tcPr>
-          <w:p>
-            <w:r/>
-            <w:r>
-              <w:rPr>
-                <w:rFonts w:ascii="Calibri" w:hAnsi="Calibri"/>
-                <w:b w:val="0"/>
-                <w:i w:val="0"/>
-                <w:sz w:val="18"/>
-              </w:rPr>
-              <w:t>rj gravel</w:t>
-            </w:r>
-          </w:p>
-        </w:tc>
-        <w:tc>
-          <w:tcPr>
-            <w:tcW w:type="dxa" w:w="2160"/>
-            <w:shd w:val="clear" w:color="auto" w:fill="F2F2F2"/>
-          </w:tcPr>
-          <w:p>
-            <w:r/>
-            <w:r>
-              <w:rPr>
-                <w:rFonts w:ascii="Calibri" w:hAnsi="Calibri"/>
-                <w:b w:val="0"/>
-                <w:i w:val="0"/>
-                <w:sz w:val="18"/>
-              </w:rPr>
-              <w:t>bluemantis.com</w:t>
-            </w:r>
-          </w:p>
-        </w:tc>
-        <w:tc>
-          <w:tcPr>
-            <w:tcW w:type="dxa" w:w="1008"/>
-            <w:shd w:val="clear" w:color="auto" w:fill="F2F2F2"/>
-          </w:tcPr>
-          <w:p>
-            <w:r/>
-            <w:r>
-              <w:rPr>
-                <w:rFonts w:ascii="Calibri" w:hAnsi="Calibri"/>
-                <w:b w:val="0"/>
-                <w:i w:val="0"/>
-                <w:sz w:val="18"/>
-              </w:rPr>
-              <w:t>USEast</w:t>
-            </w:r>
-          </w:p>
-        </w:tc>
-        <w:tc>
-          <w:tcPr>
-            <w:tcW w:type="dxa" w:w="1296"/>
-            <w:shd w:val="clear" w:color="auto" w:fill="F2F2F2"/>
-          </w:tcPr>
-          <w:p>
-            <w:r/>
-            <w:r>
-              <w:rPr>
-                <w:rFonts w:ascii="Calibri" w:hAnsi="Calibri"/>
-                <w:b w:val="0"/>
-                <w:i w:val="0"/>
-                <w:sz w:val="18"/>
-              </w:rPr>
-              <w:t>—</w:t>
-            </w:r>
-          </w:p>
-        </w:tc>
-        <w:tc>
-          <w:tcPr>
-            <w:tcW w:type="dxa" w:w="1296"/>
-            <w:shd w:val="clear" w:color="auto" w:fill="F2F2F2"/>
-          </w:tcPr>
-          <w:p>
-            <w:r/>
-            <w:r>
-              <w:rPr>
-                <w:rFonts w:ascii="Calibri" w:hAnsi="Calibri"/>
-                <w:b w:val="0"/>
-                <w:i w:val="0"/>
-                <w:sz w:val="18"/>
-              </w:rPr>
-              <w:t>—</w:t>
-            </w:r>
-          </w:p>
-        </w:tc>
-        <w:tc>
-          <w:tcPr>
-            <w:tcW w:type="dxa" w:w="1008"/>
-            <w:shd w:val="clear" w:color="auto" w:fill="F2F2F2"/>
-          </w:tcPr>
-          <w:p>
-            <w:r/>
-            <w:r>
-              <w:rPr>
-                <w:rFonts w:ascii="Calibri" w:hAnsi="Calibri"/>
-                <w:b w:val="0"/>
-                <w:i w:val="0"/>
-                <w:sz w:val="18"/>
-              </w:rPr>
-              <w:t>—</w:t>
-            </w:r>
-          </w:p>
-        </w:tc>
-        <w:tc>
-          <w:tcPr>
-            <w:tcW w:type="dxa" w:w="1296"/>
-            <w:shd w:val="clear" w:color="auto" w:fill="F2F2F2"/>
-          </w:tcPr>
-          <w:p>
-            <w:r/>
-            <w:r>
-              <w:rPr>
-                <w:rFonts w:ascii="Calibri" w:hAnsi="Calibri"/>
-                <w:b w:val="0"/>
-                <w:i w:val="0"/>
-                <w:sz w:val="18"/>
-              </w:rPr>
-              <w:t>19 May</w:t>
-            </w:r>
-          </w:p>
-        </w:tc>
-      </w:tr>
-      <w:tr>
-        <w:tc>
-          <w:tcPr>
-            <w:tcW w:type="dxa" w:w="2304"/>
-            <w:shd w:val="clear" w:color="auto" w:fill="FFFFFF"/>
-          </w:tcPr>
-          <w:p>
-            <w:r/>
-            <w:r>
-              <w:rPr>
-                <w:rFonts w:ascii="Calibri" w:hAnsi="Calibri"/>
-                <w:b w:val="0"/>
-                <w:i w:val="0"/>
-                <w:sz w:val="18"/>
-              </w:rPr>
-              <w:t>abagchi</w:t>
-            </w:r>
-          </w:p>
-        </w:tc>
-        <w:tc>
-          <w:tcPr>
-            <w:tcW w:type="dxa" w:w="2160"/>
-            <w:shd w:val="clear" w:color="auto" w:fill="FFFFFF"/>
-          </w:tcPr>
-          <w:p>
-            <w:r/>
-            <w:r>
-              <w:rPr>
-                <w:rFonts w:ascii="Calibri" w:hAnsi="Calibri"/>
-                <w:b w:val="0"/>
-                <w:i w:val="0"/>
-                <w:sz w:val="18"/>
-              </w:rPr>
-              <w:t>corestack.io</w:t>
-            </w:r>
-          </w:p>
-        </w:tc>
-        <w:tc>
-          <w:tcPr>
-            <w:tcW w:type="dxa" w:w="1008"/>
-            <w:shd w:val="clear" w:color="auto" w:fill="FFFFFF"/>
-          </w:tcPr>
-          <w:p>
-            <w:r/>
-            <w:r>
-              <w:rPr>
-                <w:rFonts w:ascii="Calibri" w:hAnsi="Calibri"/>
-                <w:b w:val="0"/>
-                <w:i w:val="0"/>
-                <w:sz w:val="18"/>
-              </w:rPr>
-              <w:t>USEast</w:t>
-            </w:r>
-          </w:p>
-        </w:tc>
-        <w:tc>
-          <w:tcPr>
-            <w:tcW w:type="dxa" w:w="1296"/>
-            <w:shd w:val="clear" w:color="auto" w:fill="FFFFFF"/>
-          </w:tcPr>
-          <w:p>
-            <w:r/>
-            <w:r>
-              <w:rPr>
-                <w:rFonts w:ascii="Calibri" w:hAnsi="Calibri"/>
-                <w:b w:val="0"/>
-                <w:i w:val="0"/>
-                <w:sz w:val="18"/>
-              </w:rPr>
-              <w:t>—</w:t>
-            </w:r>
-          </w:p>
-        </w:tc>
-        <w:tc>
-          <w:tcPr>
-            <w:tcW w:type="dxa" w:w="1296"/>
-            <w:shd w:val="clear" w:color="auto" w:fill="FFFFFF"/>
-          </w:tcPr>
-          <w:p>
-            <w:r/>
-            <w:r>
-              <w:rPr>
-                <w:rFonts w:ascii="Calibri" w:hAnsi="Calibri"/>
-                <w:b w:val="0"/>
-                <w:i w:val="0"/>
-                <w:sz w:val="18"/>
-              </w:rPr>
-              <w:t>—</w:t>
-            </w:r>
-          </w:p>
-        </w:tc>
-        <w:tc>
-          <w:tcPr>
-            <w:tcW w:type="dxa" w:w="1008"/>
-            <w:shd w:val="clear" w:color="auto" w:fill="FFFFFF"/>
-          </w:tcPr>
-          <w:p>
-            <w:r/>
-            <w:r>
-              <w:rPr>
-                <w:rFonts w:ascii="Calibri" w:hAnsi="Calibri"/>
-                <w:b w:val="0"/>
-                <w:i w:val="0"/>
-                <w:sz w:val="18"/>
-              </w:rPr>
-              <w:t>—</w:t>
-            </w:r>
-          </w:p>
-        </w:tc>
-        <w:tc>
-          <w:tcPr>
-            <w:tcW w:type="dxa" w:w="1296"/>
-            <w:shd w:val="clear" w:color="auto" w:fill="FFFFFF"/>
-          </w:tcPr>
-          <w:p>
-            <w:r/>
-            <w:r>
-              <w:rPr>
-                <w:rFonts w:ascii="Calibri" w:hAnsi="Calibri"/>
-                <w:b w:val="0"/>
-                <w:i w:val="0"/>
-                <w:sz w:val="18"/>
-              </w:rPr>
-              <w:t>2 Jun</w:t>
-            </w:r>
-          </w:p>
-        </w:tc>
-      </w:tr>
-      <w:tr>
-        <w:tc>
-          <w:tcPr>
-            <w:tcW w:type="dxa" w:w="2304"/>
-            <w:shd w:val="clear" w:color="auto" w:fill="F2F2F2"/>
-          </w:tcPr>
-          <w:p>
-            <w:r/>
-            <w:r>
-              <w:rPr>
-                <w:rFonts w:ascii="Calibri" w:hAnsi="Calibri"/>
-                <w:b w:val="0"/>
-                <w:i w:val="0"/>
-                <w:sz w:val="18"/>
-              </w:rPr>
-              <w:t>cspbillingapi</w:t>
-            </w:r>
-          </w:p>
-        </w:tc>
-        <w:tc>
-          <w:tcPr>
-            <w:tcW w:type="dxa" w:w="2160"/>
-            <w:shd w:val="clear" w:color="auto" w:fill="F2F2F2"/>
-          </w:tcPr>
-          <w:p>
-            <w:r/>
-            <w:r>
-              <w:rPr>
-                <w:rFonts w:ascii="Calibri" w:hAnsi="Calibri"/>
-                <w:b w:val="0"/>
-                <w:i w:val="0"/>
-                <w:sz w:val="18"/>
-              </w:rPr>
-              <w:t>bluemantis.com</w:t>
-            </w:r>
-          </w:p>
-        </w:tc>
-        <w:tc>
-          <w:tcPr>
-            <w:tcW w:type="dxa" w:w="1008"/>
-            <w:shd w:val="clear" w:color="auto" w:fill="F2F2F2"/>
-          </w:tcPr>
-          <w:p>
-            <w:r/>
-            <w:r>
-              <w:rPr>
-                <w:rFonts w:ascii="Calibri" w:hAnsi="Calibri"/>
-                <w:b w:val="0"/>
-                <w:i w:val="0"/>
-                <w:sz w:val="18"/>
-              </w:rPr>
-              <w:t>USEast</w:t>
-            </w:r>
-          </w:p>
-        </w:tc>
-        <w:tc>
-          <w:tcPr>
-            <w:tcW w:type="dxa" w:w="1296"/>
-            <w:shd w:val="clear" w:color="auto" w:fill="F2F2F2"/>
-          </w:tcPr>
-          <w:p>
-            <w:r/>
-            <w:r>
-              <w:rPr>
-                <w:rFonts w:ascii="Calibri" w:hAnsi="Calibri"/>
-                <w:b w:val="0"/>
-                <w:i w:val="0"/>
-                <w:sz w:val="18"/>
-              </w:rPr>
-              <w:t>—</w:t>
-            </w:r>
-          </w:p>
-        </w:tc>
-        <w:tc>
-          <w:tcPr>
-            <w:tcW w:type="dxa" w:w="1296"/>
-            <w:shd w:val="clear" w:color="auto" w:fill="F2F2F2"/>
-          </w:tcPr>
-          <w:p>
-            <w:r/>
-            <w:r>
-              <w:rPr>
-                <w:rFonts w:ascii="Calibri" w:hAnsi="Calibri"/>
-                <w:b w:val="0"/>
-                <w:i w:val="0"/>
-                <w:sz w:val="18"/>
-              </w:rPr>
-              <w:t>—</w:t>
-            </w:r>
-          </w:p>
-        </w:tc>
-        <w:tc>
-          <w:tcPr>
-            <w:tcW w:type="dxa" w:w="1008"/>
-            <w:shd w:val="clear" w:color="auto" w:fill="F2F2F2"/>
-          </w:tcPr>
-          <w:p>
-            <w:r/>
-            <w:r>
-              <w:rPr>
-                <w:rFonts w:ascii="Calibri" w:hAnsi="Calibri"/>
-                <w:b w:val="0"/>
-                <w:i w:val="0"/>
-                <w:sz w:val="18"/>
-              </w:rPr>
-              <w:t>—</w:t>
-            </w:r>
-          </w:p>
-        </w:tc>
-        <w:tc>
-          <w:tcPr>
-            <w:tcW w:type="dxa" w:w="1296"/>
-            <w:shd w:val="clear" w:color="auto" w:fill="F2F2F2"/>
-          </w:tcPr>
-          <w:p>
-            <w:r/>
-            <w:r>
-              <w:rPr>
-                <w:rFonts w:ascii="Calibri" w:hAnsi="Calibri"/>
-                <w:b w:val="0"/>
-                <w:i w:val="0"/>
-                <w:sz w:val="18"/>
-              </w:rPr>
-              <w:t>26 May</w:t>
             </w:r>
           </w:p>
         </w:tc>
@@ -2468,7 +1183,7 @@
             <w:r>
               <w:drawing>
                 <wp:inline xmlns:a="http://schemas.openxmlformats.org/drawingml/2006/main" xmlns:pic="http://schemas.openxmlformats.org/drawingml/2006/picture">
-                  <wp:extent cx="3017520" cy="2387148"/>
+                  <wp:extent cx="3017520" cy="1002548"/>
                   <wp:docPr id="1" name="Picture 1"/>
                   <wp:cNvGraphicFramePr>
                     <a:graphicFrameLocks noChangeAspect="1"/>
@@ -2489,7 +1204,7 @@
                         <pic:spPr>
                           <a:xfrm>
                             <a:off x="0" y="0"/>
-                            <a:ext cx="3017520" cy="2387148"/>
+                            <a:ext cx="3017520" cy="1002548"/>
                           </a:xfrm>
                           <a:prstGeom prst="rect"/>
                         </pic:spPr>

</xml_diff>

<commit_message>
Fix Pendo pagination and auto-discover environment field via REST API
- _pendo_agg now paginates with rowsPerPage+startRow to fetch all results
  (Pendo defaults to 1 row per page)
- _fetch_blackstone_accounts uses GET /api/v1/account/{id} to inspect
  metadata field names and auto-detect which field holds EU/USEast value
</commit_message>
<xml_diff>
--- a/Blackstone_Scrum_20260618.docx
+++ b/Blackstone_Scrum_20260618.docx
@@ -31,7 +31,7 @@
           <w:color w:val="757575"/>
           <w:sz w:val="18"/>
         </w:rPr>
-        <w:t>Thursday, June 18, 2026   ·   Report generated 6:59 PM IST</w:t>
+        <w:t>Thursday, June 18, 2026   ·   Report generated 7:02 PM IST</w:t>
       </w:r>
     </w:p>
     <w:p>
@@ -1877,7 +1877,7 @@
                 <w:i w:val="0"/>
                 <w:sz w:val="18"/>
               </w:rPr>
-              <w:t>Zubair Hussain T</w:t>
+              <w:t>Rahul Kumar Singh</w:t>
             </w:r>
           </w:p>
         </w:tc>

</xml_diff>

<commit_message>
Use events source for visitor+accountId; fetch visitor REST metadata to find region field
</commit_message>
<xml_diff>
--- a/Blackstone_Scrum_20260618.docx
+++ b/Blackstone_Scrum_20260618.docx
@@ -31,7 +31,7 @@
           <w:color w:val="757575"/>
           <w:sz w:val="18"/>
         </w:rPr>
-        <w:t>Thursday, June 18, 2026   ·   Report generated 7:02 PM IST</w:t>
+        <w:t>Thursday, June 18, 2026   ·   Report generated 7:09 PM IST</w:t>
       </w:r>
     </w:p>
     <w:p>
@@ -1877,7 +1877,7 @@
                 <w:i w:val="0"/>
                 <w:sz w:val="18"/>
               </w:rPr>
-              <w:t>Rahul Kumar Singh</w:t>
+              <w:t>Zubair Hussain T</w:t>
             </w:r>
           </w:p>
         </w:tc>

</xml_diff>